<commit_message>
update doc for AP-33 jira
</commit_message>
<xml_diff>
--- a/docs/Template1-RequirementAnalysis.docx
+++ b/docs/Template1-RequirementAnalysis.docx
@@ -6083,10 +6083,772 @@
     </w:p>
     <w:p>
       <w:pPr>
-        <w:ind w:firstLine="709"/>
-        <w:rPr>
-          <w:rFonts w:ascii="Times New Roman" w:eastAsia="Times New Roman" w:hAnsi="Times New Roman" w:cs="Times New Roman"/>
-          <w:color w:val="000000"/>
+        <w:rPr>
+          <w:rFonts w:ascii="Times New Roman" w:eastAsia="Times New Roman" w:hAnsi="Times New Roman" w:cs="Times New Roman"/>
+          <w:b/>
+          <w:bCs/>
+          <w:i/>
+          <w:iCs/>
+          <w:sz w:val="26"/>
+          <w:szCs w:val="26"/>
+          <w:lang w:val="en-US"/>
+        </w:rPr>
+      </w:pPr>
+      <w:r>
+        <w:rPr>
+          <w:rFonts w:ascii="Times New Roman" w:eastAsia="Times New Roman" w:hAnsi="Times New Roman" w:cs="Times New Roman"/>
+          <w:b/>
+          <w:bCs/>
+          <w:i/>
+          <w:iCs/>
+          <w:sz w:val="26"/>
+          <w:szCs w:val="26"/>
+        </w:rPr>
+        <w:t>b</w:t>
+      </w:r>
+      <w:r>
+        <w:rPr>
+          <w:rFonts w:ascii="Times New Roman" w:eastAsia="Times New Roman" w:hAnsi="Times New Roman" w:cs="Times New Roman"/>
+          <w:b/>
+          <w:bCs/>
+          <w:i/>
+          <w:iCs/>
+          <w:sz w:val="26"/>
+          <w:szCs w:val="26"/>
+        </w:rPr>
+        <w:t>/</w:t>
+      </w:r>
+      <w:r>
+        <w:rPr>
+          <w:rFonts w:ascii="Segoe UI" w:eastAsia="Times New Roman" w:hAnsi="Segoe UI" w:cs="Segoe UI"/>
+          <w:color w:val="292A2E"/>
+          <w:kern w:val="36"/>
+          <w:sz w:val="36"/>
+          <w:szCs w:val="36"/>
+          <w:lang w:val="en-US"/>
+        </w:rPr>
+        <w:t xml:space="preserve"> </w:t>
+      </w:r>
+      <w:r>
+        <w:rPr>
+          <w:rFonts w:ascii="Times New Roman" w:eastAsia="Times New Roman" w:hAnsi="Times New Roman" w:cs="Times New Roman"/>
+          <w:b/>
+          <w:bCs/>
+          <w:i/>
+          <w:iCs/>
+          <w:sz w:val="26"/>
+          <w:szCs w:val="26"/>
+          <w:lang w:val="en-US"/>
+        </w:rPr>
+        <w:t>Cross-Channel Profile Enrichment Engine</w:t>
+      </w:r>
+    </w:p>
+    <w:p>
+      <w:pPr>
+        <w:rPr>
+          <w:rFonts w:ascii="Times New Roman" w:eastAsia="Times New Roman" w:hAnsi="Times New Roman" w:cs="Times New Roman"/>
+          <w:lang w:val="en-US"/>
+        </w:rPr>
+      </w:pPr>
+      <w:r>
+        <w:rPr>
+          <w:rFonts w:ascii="Times New Roman" w:eastAsia="Times New Roman" w:hAnsi="Times New Roman" w:cs="Times New Roman"/>
+          <w:lang w:val="en-US"/>
+        </w:rPr>
+        <w:t xml:space="preserve">  </w:t>
+      </w:r>
+      <w:r>
+        <w:rPr>
+          <w:rFonts w:ascii="Times New Roman" w:eastAsia="Times New Roman" w:hAnsi="Times New Roman" w:cs="Times New Roman"/>
+          <w:b/>
+          <w:bCs/>
+          <w:lang w:val="en-US"/>
+        </w:rPr>
+        <w:t>External Profile Identifier Extraction:</w:t>
+      </w:r>
+      <w:r>
+        <w:rPr>
+          <w:rFonts w:ascii="Times New Roman" w:eastAsia="Times New Roman" w:hAnsi="Times New Roman" w:cs="Times New Roman"/>
+          <w:lang w:val="en-US"/>
+        </w:rPr>
+        <w:t xml:space="preserve"> </w:t>
+      </w:r>
+    </w:p>
+    <w:p>
+      <w:pPr>
+        <w:numPr>
+          <w:ilvl w:val="0"/>
+          <w:numId w:val="17"/>
+        </w:numPr>
+        <w:rPr>
+          <w:rFonts w:ascii="Times New Roman" w:eastAsia="Times New Roman" w:hAnsi="Times New Roman" w:cs="Times New Roman"/>
+          <w:lang w:val="en-US"/>
+        </w:rPr>
+      </w:pPr>
+      <w:r>
+        <w:rPr>
+          <w:rFonts w:ascii="Times New Roman" w:eastAsia="Times New Roman" w:hAnsi="Times New Roman" w:cs="Times New Roman"/>
+          <w:lang w:val="en-US"/>
+        </w:rPr>
+        <w:t>Description: Upon completion of the CV ingestion phase, the system must automatically locate and extract all recognizable external profile identifiers embedded within the candidate's parsed document record.</w:t>
+      </w:r>
+    </w:p>
+    <w:p>
+      <w:pPr>
+        <w:numPr>
+          <w:ilvl w:val="0"/>
+          <w:numId w:val="17"/>
+        </w:numPr>
+        <w:rPr>
+          <w:rFonts w:ascii="Times New Roman" w:eastAsia="Times New Roman" w:hAnsi="Times New Roman" w:cs="Times New Roman"/>
+          <w:lang w:val="en-US"/>
+        </w:rPr>
+      </w:pPr>
+      <w:r>
+        <w:rPr>
+          <w:rFonts w:ascii="Times New Roman" w:eastAsia="Times New Roman" w:hAnsi="Times New Roman" w:cs="Times New Roman"/>
+          <w:lang w:val="en-US"/>
+        </w:rPr>
+        <w:t>System Action: Scan the structured candidate JSON payload produced by the upstream parsing worker to detect and capture any GitHub profile URL and LinkedIn profile URL fields. Store the extracted identifiers as indexed attributes on the candidate record within the PostgreSQL database before dispatching enrichment tasks.</w:t>
+      </w:r>
+    </w:p>
+    <w:p>
+      <w:pPr>
+        <w:rPr>
+          <w:rFonts w:ascii="Times New Roman" w:eastAsia="Times New Roman" w:hAnsi="Times New Roman" w:cs="Times New Roman"/>
+          <w:lang w:val="en-US"/>
+        </w:rPr>
+      </w:pPr>
+      <w:r>
+        <w:rPr>
+          <w:rFonts w:ascii="Times New Roman" w:eastAsia="Times New Roman" w:hAnsi="Times New Roman" w:cs="Times New Roman"/>
+          <w:lang w:val="en-US"/>
+        </w:rPr>
+        <w:t xml:space="preserve">  </w:t>
+      </w:r>
+      <w:r>
+        <w:rPr>
+          <w:rFonts w:ascii="Times New Roman" w:eastAsia="Times New Roman" w:hAnsi="Times New Roman" w:cs="Times New Roman"/>
+          <w:b/>
+          <w:bCs/>
+          <w:lang w:val="en-US"/>
+        </w:rPr>
+        <w:t>Asynchronous Enrichment Pipeline Dispatch:</w:t>
+      </w:r>
+      <w:r>
+        <w:rPr>
+          <w:rFonts w:ascii="Times New Roman" w:eastAsia="Times New Roman" w:hAnsi="Times New Roman" w:cs="Times New Roman"/>
+          <w:lang w:val="en-US"/>
+        </w:rPr>
+        <w:t xml:space="preserve"> </w:t>
+      </w:r>
+    </w:p>
+    <w:p>
+      <w:pPr>
+        <w:numPr>
+          <w:ilvl w:val="0"/>
+          <w:numId w:val="18"/>
+        </w:numPr>
+        <w:rPr>
+          <w:rFonts w:ascii="Times New Roman" w:eastAsia="Times New Roman" w:hAnsi="Times New Roman" w:cs="Times New Roman"/>
+          <w:lang w:val="en-US"/>
+        </w:rPr>
+      </w:pPr>
+      <w:r>
+        <w:rPr>
+          <w:rFonts w:ascii="Times New Roman" w:eastAsia="Times New Roman" w:hAnsi="Times New Roman" w:cs="Times New Roman"/>
+          <w:lang w:val="en-US"/>
+        </w:rPr>
+        <w:t>Description: The enrichment pipeline must be initiated as a fully non-blocking background operation that does not interrupt the active split-screen workspace session or the primary CV parsing flow.</w:t>
+      </w:r>
+    </w:p>
+    <w:p>
+      <w:pPr>
+        <w:numPr>
+          <w:ilvl w:val="0"/>
+          <w:numId w:val="18"/>
+        </w:numPr>
+        <w:rPr>
+          <w:rFonts w:ascii="Times New Roman" w:eastAsia="Times New Roman" w:hAnsi="Times New Roman" w:cs="Times New Roman"/>
+          <w:lang w:val="en-US"/>
+        </w:rPr>
+      </w:pPr>
+      <w:r>
+        <w:rPr>
+          <w:rFonts w:ascii="Times New Roman" w:eastAsia="Times New Roman" w:hAnsi="Times New Roman" w:cs="Times New Roman"/>
+          <w:lang w:val="en-US"/>
+        </w:rPr>
+        <w:t>System Action: Publish a dedicated profile.enrich event payload — containing the candidate UUID and the extracted external profile identifiers — to the Azure Service Bus message queue backbone. The enrichment worker pool independently consumes this event without blocking the API Gateway thread.</w:t>
+      </w:r>
+    </w:p>
+    <w:p>
+      <w:pPr>
+        <w:rPr>
+          <w:rFonts w:ascii="Times New Roman" w:eastAsia="Times New Roman" w:hAnsi="Times New Roman" w:cs="Times New Roman"/>
+          <w:lang w:val="en-US"/>
+        </w:rPr>
+      </w:pPr>
+      <w:r>
+        <w:rPr>
+          <w:rFonts w:ascii="Times New Roman" w:eastAsia="Times New Roman" w:hAnsi="Times New Roman" w:cs="Times New Roman"/>
+          <w:lang w:val="en-US"/>
+        </w:rPr>
+        <w:t xml:space="preserve">  </w:t>
+      </w:r>
+      <w:r>
+        <w:rPr>
+          <w:rFonts w:ascii="Times New Roman" w:eastAsia="Times New Roman" w:hAnsi="Times New Roman" w:cs="Times New Roman"/>
+          <w:b/>
+          <w:bCs/>
+          <w:lang w:val="en-US"/>
+        </w:rPr>
+        <w:t>GitHub Repository Intelligence Extraction:</w:t>
+      </w:r>
+      <w:r>
+        <w:rPr>
+          <w:rFonts w:ascii="Times New Roman" w:eastAsia="Times New Roman" w:hAnsi="Times New Roman" w:cs="Times New Roman"/>
+          <w:lang w:val="en-US"/>
+        </w:rPr>
+        <w:t xml:space="preserve"> </w:t>
+      </w:r>
+    </w:p>
+    <w:p>
+      <w:pPr>
+        <w:numPr>
+          <w:ilvl w:val="0"/>
+          <w:numId w:val="19"/>
+        </w:numPr>
+        <w:rPr>
+          <w:rFonts w:ascii="Times New Roman" w:eastAsia="Times New Roman" w:hAnsi="Times New Roman" w:cs="Times New Roman"/>
+          <w:lang w:val="en-US"/>
+        </w:rPr>
+      </w:pPr>
+      <w:r>
+        <w:rPr>
+          <w:rFonts w:ascii="Times New Roman" w:eastAsia="Times New Roman" w:hAnsi="Times New Roman" w:cs="Times New Roman"/>
+          <w:lang w:val="en-US"/>
+        </w:rPr>
+        <w:t>Description: The system must crawl the candidate's public GitHub presence to derive objective, evidence-based signals of real-world technical capability beyond what is self-reported in the CV.</w:t>
+      </w:r>
+    </w:p>
+    <w:p>
+      <w:pPr>
+        <w:numPr>
+          <w:ilvl w:val="0"/>
+          <w:numId w:val="19"/>
+        </w:numPr>
+        <w:rPr>
+          <w:rFonts w:ascii="Times New Roman" w:eastAsia="Times New Roman" w:hAnsi="Times New Roman" w:cs="Times New Roman"/>
+          <w:lang w:val="en-US"/>
+        </w:rPr>
+      </w:pPr>
+      <w:r>
+        <w:rPr>
+          <w:rFonts w:ascii="Times New Roman" w:eastAsia="Times New Roman" w:hAnsi="Times New Roman" w:cs="Times New Roman"/>
+          <w:lang w:val="en-US"/>
+        </w:rPr>
+        <w:t xml:space="preserve">System Action: Invoke the authenticated GitHub REST API to retrieve the candidate's public repository index. For each repository, extract the full README.md content for NLP-based project </w:t>
+      </w:r>
+      <w:r>
+        <w:rPr>
+          <w:rFonts w:ascii="Times New Roman" w:eastAsia="Times New Roman" w:hAnsi="Times New Roman" w:cs="Times New Roman"/>
+          <w:lang w:val="en-US"/>
+        </w:rPr>
+        <w:lastRenderedPageBreak/>
+        <w:t>summarization, compute the programming language distribution ratio from repository metadata, and derive a contribution activity timeline from the commit history records.</w:t>
+      </w:r>
+    </w:p>
+    <w:p>
+      <w:pPr>
+        <w:rPr>
+          <w:rFonts w:ascii="Times New Roman" w:eastAsia="Times New Roman" w:hAnsi="Times New Roman" w:cs="Times New Roman"/>
+          <w:lang w:val="en-US"/>
+        </w:rPr>
+      </w:pPr>
+      <w:r>
+        <w:rPr>
+          <w:rFonts w:ascii="Times New Roman" w:eastAsia="Times New Roman" w:hAnsi="Times New Roman" w:cs="Times New Roman"/>
+          <w:lang w:val="en-US"/>
+        </w:rPr>
+        <w:t xml:space="preserve">  </w:t>
+      </w:r>
+      <w:r>
+        <w:rPr>
+          <w:rFonts w:ascii="Times New Roman" w:eastAsia="Times New Roman" w:hAnsi="Times New Roman" w:cs="Times New Roman"/>
+          <w:b/>
+          <w:bCs/>
+          <w:lang w:val="en-US"/>
+        </w:rPr>
+        <w:t>LinkedIn Professional History Harvesting:</w:t>
+      </w:r>
+      <w:r>
+        <w:rPr>
+          <w:rFonts w:ascii="Times New Roman" w:eastAsia="Times New Roman" w:hAnsi="Times New Roman" w:cs="Times New Roman"/>
+          <w:lang w:val="en-US"/>
+        </w:rPr>
+        <w:t xml:space="preserve"> </w:t>
+      </w:r>
+    </w:p>
+    <w:p>
+      <w:pPr>
+        <w:numPr>
+          <w:ilvl w:val="0"/>
+          <w:numId w:val="20"/>
+        </w:numPr>
+        <w:rPr>
+          <w:rFonts w:ascii="Times New Roman" w:eastAsia="Times New Roman" w:hAnsi="Times New Roman" w:cs="Times New Roman"/>
+          <w:lang w:val="en-US"/>
+        </w:rPr>
+      </w:pPr>
+      <w:r>
+        <w:rPr>
+          <w:rFonts w:ascii="Times New Roman" w:eastAsia="Times New Roman" w:hAnsi="Times New Roman" w:cs="Times New Roman"/>
+          <w:lang w:val="en-US"/>
+        </w:rPr>
+        <w:t>Description: The system must retrieve structured professional history data from the candidate's LinkedIn profile to supplement and cross-validate the experience and education claims declared in the raw CV.</w:t>
+      </w:r>
+    </w:p>
+    <w:p>
+      <w:pPr>
+        <w:numPr>
+          <w:ilvl w:val="0"/>
+          <w:numId w:val="20"/>
+        </w:numPr>
+        <w:rPr>
+          <w:rFonts w:ascii="Times New Roman" w:eastAsia="Times New Roman" w:hAnsi="Times New Roman" w:cs="Times New Roman"/>
+          <w:lang w:val="en-US"/>
+        </w:rPr>
+      </w:pPr>
+      <w:r>
+        <w:rPr>
+          <w:rFonts w:ascii="Times New Roman" w:eastAsia="Times New Roman" w:hAnsi="Times New Roman" w:cs="Times New Roman"/>
+          <w:lang w:val="en-US"/>
+        </w:rPr>
+        <w:t>System Action: Dispatch a secure outbound request to the integrated third-party LinkedIn data provider (Proxycurl API or equivalent rotating-proxy service) to harvest the candidate's structured employment experience timeline, educational background, active skill endorsements, and professional certification records.</w:t>
+      </w:r>
+    </w:p>
+    <w:p>
+      <w:pPr>
+        <w:rPr>
+          <w:rFonts w:ascii="Times New Roman" w:eastAsia="Times New Roman" w:hAnsi="Times New Roman" w:cs="Times New Roman"/>
+          <w:lang w:val="en-US"/>
+        </w:rPr>
+      </w:pPr>
+      <w:r>
+        <w:rPr>
+          <w:rFonts w:ascii="Times New Roman" w:eastAsia="Times New Roman" w:hAnsi="Times New Roman" w:cs="Times New Roman"/>
+          <w:lang w:val="en-US"/>
+        </w:rPr>
+        <w:t xml:space="preserve">  </w:t>
+      </w:r>
+      <w:r>
+        <w:rPr>
+          <w:rFonts w:ascii="Times New Roman" w:eastAsia="Times New Roman" w:hAnsi="Times New Roman" w:cs="Times New Roman"/>
+          <w:b/>
+          <w:bCs/>
+          <w:lang w:val="en-US"/>
+        </w:rPr>
+        <w:t>Unified Candidate Profile Consolidation:</w:t>
+      </w:r>
+      <w:r>
+        <w:rPr>
+          <w:rFonts w:ascii="Times New Roman" w:eastAsia="Times New Roman" w:hAnsi="Times New Roman" w:cs="Times New Roman"/>
+          <w:lang w:val="en-US"/>
+        </w:rPr>
+        <w:t xml:space="preserve"> </w:t>
+      </w:r>
+    </w:p>
+    <w:p>
+      <w:pPr>
+        <w:numPr>
+          <w:ilvl w:val="0"/>
+          <w:numId w:val="21"/>
+        </w:numPr>
+        <w:rPr>
+          <w:rFonts w:ascii="Times New Roman" w:eastAsia="Times New Roman" w:hAnsi="Times New Roman" w:cs="Times New Roman"/>
+          <w:lang w:val="en-US"/>
+        </w:rPr>
+      </w:pPr>
+      <w:r>
+        <w:rPr>
+          <w:rFonts w:ascii="Times New Roman" w:eastAsia="Times New Roman" w:hAnsi="Times New Roman" w:cs="Times New Roman"/>
+          <w:lang w:val="en-US"/>
+        </w:rPr>
+        <w:t>Description: All enriched external metadata harvested from GitHub and LinkedIn must be normalized and merged into the candidate's existing database record under a consistent, canonical data schema.</w:t>
+      </w:r>
+    </w:p>
+    <w:p>
+      <w:pPr>
+        <w:numPr>
+          <w:ilvl w:val="0"/>
+          <w:numId w:val="21"/>
+        </w:numPr>
+        <w:rPr>
+          <w:rFonts w:ascii="Times New Roman" w:eastAsia="Times New Roman" w:hAnsi="Times New Roman" w:cs="Times New Roman"/>
+          <w:lang w:val="en-US"/>
+        </w:rPr>
+      </w:pPr>
+      <w:r>
+        <w:rPr>
+          <w:rFonts w:ascii="Times New Roman" w:eastAsia="Times New Roman" w:hAnsi="Times New Roman" w:cs="Times New Roman"/>
+          <w:lang w:val="en-US"/>
+        </w:rPr>
+        <w:t>System Action: Apply an idempotent merge operation on the candidate's CandidateProfile JSON structure within the PostgreSQL database, integrating the enriched skill attributes, project summaries, and professional history fields without duplicating pre-existing entries from the original CV parsing output.</w:t>
+      </w:r>
+    </w:p>
+    <w:p>
+      <w:pPr>
+        <w:rPr>
+          <w:rFonts w:ascii="Times New Roman" w:eastAsia="Times New Roman" w:hAnsi="Times New Roman" w:cs="Times New Roman"/>
+          <w:lang w:val="en-US"/>
+        </w:rPr>
+      </w:pPr>
+      <w:r>
+        <w:rPr>
+          <w:rFonts w:ascii="Times New Roman" w:eastAsia="Times New Roman" w:hAnsi="Times New Roman" w:cs="Times New Roman"/>
+          <w:lang w:val="en-US"/>
+        </w:rPr>
+        <w:t xml:space="preserve">  </w:t>
+      </w:r>
+      <w:r>
+        <w:rPr>
+          <w:rFonts w:ascii="Times New Roman" w:eastAsia="Times New Roman" w:hAnsi="Times New Roman" w:cs="Times New Roman"/>
+          <w:b/>
+          <w:bCs/>
+          <w:lang w:val="en-US"/>
+        </w:rPr>
+        <w:t>Semantic Re-Indexing &amp; Smatch Score Recalculation:</w:t>
+      </w:r>
+      <w:r>
+        <w:rPr>
+          <w:rFonts w:ascii="Times New Roman" w:eastAsia="Times New Roman" w:hAnsi="Times New Roman" w:cs="Times New Roman"/>
+          <w:lang w:val="en-US"/>
+        </w:rPr>
+        <w:t xml:space="preserve"> </w:t>
+      </w:r>
+    </w:p>
+    <w:p>
+      <w:pPr>
+        <w:numPr>
+          <w:ilvl w:val="0"/>
+          <w:numId w:val="22"/>
+        </w:numPr>
+        <w:rPr>
+          <w:rFonts w:ascii="Times New Roman" w:eastAsia="Times New Roman" w:hAnsi="Times New Roman" w:cs="Times New Roman"/>
+          <w:lang w:val="en-US"/>
+        </w:rPr>
+      </w:pPr>
+      <w:r>
+        <w:rPr>
+          <w:rFonts w:ascii="Times New Roman" w:eastAsia="Times New Roman" w:hAnsi="Times New Roman" w:cs="Times New Roman"/>
+          <w:lang w:val="en-US"/>
+        </w:rPr>
+        <w:t>Description: The AI Analytics Engine must incorporate the newly enriched profile data to produce a recalibrated semantic match score that accurately reflects the candidate's full cross-platform capability set.</w:t>
+      </w:r>
+    </w:p>
+    <w:p>
+      <w:pPr>
+        <w:numPr>
+          <w:ilvl w:val="0"/>
+          <w:numId w:val="22"/>
+        </w:numPr>
+        <w:rPr>
+          <w:rFonts w:ascii="Times New Roman" w:eastAsia="Times New Roman" w:hAnsi="Times New Roman" w:cs="Times New Roman"/>
+          <w:lang w:val="en-US"/>
+        </w:rPr>
+      </w:pPr>
+      <w:r>
+        <w:rPr>
+          <w:rFonts w:ascii="Times New Roman" w:eastAsia="Times New Roman" w:hAnsi="Times New Roman" w:cs="Times New Roman"/>
+          <w:lang w:val="en-US"/>
+        </w:rPr>
+        <w:t>System Action: Signal the AI Analytics Engine to re-execute vector transformation procedures on the updated candidate profile via the pgvector extension, then recalculate the Smatch score against the active Job Description embedding. Persist the revised score and updated justification log to the database.</w:t>
+      </w:r>
+    </w:p>
+    <w:p>
+      <w:pPr>
+        <w:rPr>
+          <w:rFonts w:ascii="Times New Roman" w:eastAsia="Times New Roman" w:hAnsi="Times New Roman" w:cs="Times New Roman"/>
+          <w:lang w:val="en-US"/>
+        </w:rPr>
+      </w:pPr>
+      <w:r>
+        <w:rPr>
+          <w:rFonts w:ascii="Times New Roman" w:eastAsia="Times New Roman" w:hAnsi="Times New Roman" w:cs="Times New Roman"/>
+          <w:lang w:val="en-US"/>
+        </w:rPr>
+        <w:t xml:space="preserve">  </w:t>
+      </w:r>
+      <w:r>
+        <w:rPr>
+          <w:rFonts w:ascii="Times New Roman" w:eastAsia="Times New Roman" w:hAnsi="Times New Roman" w:cs="Times New Roman"/>
+          <w:b/>
+          <w:bCs/>
+          <w:lang w:val="en-US"/>
+        </w:rPr>
+        <w:t>Real-Time Enrichment Result Projection:</w:t>
+      </w:r>
+      <w:r>
+        <w:rPr>
+          <w:rFonts w:ascii="Times New Roman" w:eastAsia="Times New Roman" w:hAnsi="Times New Roman" w:cs="Times New Roman"/>
+          <w:lang w:val="en-US"/>
+        </w:rPr>
+        <w:t xml:space="preserve"> </w:t>
+      </w:r>
+    </w:p>
+    <w:p>
+      <w:pPr>
+        <w:numPr>
+          <w:ilvl w:val="0"/>
+          <w:numId w:val="23"/>
+        </w:numPr>
+        <w:rPr>
+          <w:rFonts w:ascii="Times New Roman" w:eastAsia="Times New Roman" w:hAnsi="Times New Roman" w:cs="Times New Roman"/>
+          <w:lang w:val="en-US"/>
+        </w:rPr>
+      </w:pPr>
+      <w:r>
+        <w:rPr>
+          <w:rFonts w:ascii="Times New Roman" w:eastAsia="Times New Roman" w:hAnsi="Times New Roman" w:cs="Times New Roman"/>
+          <w:lang w:val="en-US"/>
+        </w:rPr>
+        <w:t>Description: The HR Manager's workspace must reflect enriched analytics automatically upon pipeline completion without requiring a manual page refresh.</w:t>
+      </w:r>
+    </w:p>
+    <w:p>
+      <w:pPr>
+        <w:numPr>
+          <w:ilvl w:val="0"/>
+          <w:numId w:val="23"/>
+        </w:numPr>
+        <w:rPr>
+          <w:rFonts w:ascii="Times New Roman" w:eastAsia="Times New Roman" w:hAnsi="Times New Roman" w:cs="Times New Roman"/>
+          <w:lang w:val="en-US"/>
+        </w:rPr>
+      </w:pPr>
+      <w:r>
+        <w:rPr>
+          <w:rFonts w:ascii="Times New Roman" w:eastAsia="Times New Roman" w:hAnsi="Times New Roman" w:cs="Times New Roman"/>
+          <w:lang w:val="en-US"/>
+        </w:rPr>
+        <w:t>System Action: Transmit the finalized enriched analytics payload through the active WebSocket channel mapped to the candidate UUID. The frontend must refresh the right-side panel to render the updated Canvas Radar Chart, revised SVG career timeline, and recalculated programming language distribution chart in-place.</w:t>
+      </w:r>
+    </w:p>
+    <w:p>
+      <w:pPr>
+        <w:rPr>
+          <w:rFonts w:ascii="Times New Roman" w:eastAsia="Times New Roman" w:hAnsi="Times New Roman" w:cs="Times New Roman"/>
+          <w:lang w:val="en-US"/>
+        </w:rPr>
+      </w:pPr>
+      <w:r>
+        <w:rPr>
+          <w:rFonts w:ascii="Times New Roman" w:eastAsia="Times New Roman" w:hAnsi="Times New Roman" w:cs="Times New Roman"/>
+          <w:lang w:val="en-US"/>
+        </w:rPr>
+        <w:t xml:space="preserve">  </w:t>
+      </w:r>
+      <w:r>
+        <w:rPr>
+          <w:rFonts w:ascii="Times New Roman" w:eastAsia="Times New Roman" w:hAnsi="Times New Roman" w:cs="Times New Roman"/>
+          <w:b/>
+          <w:bCs/>
+          <w:lang w:val="en-US"/>
+        </w:rPr>
+        <w:t>Manual Sync Trigger Control:</w:t>
+      </w:r>
+      <w:r>
+        <w:rPr>
+          <w:rFonts w:ascii="Times New Roman" w:eastAsia="Times New Roman" w:hAnsi="Times New Roman" w:cs="Times New Roman"/>
+          <w:lang w:val="en-US"/>
+        </w:rPr>
+        <w:t xml:space="preserve"> </w:t>
+      </w:r>
+    </w:p>
+    <w:p>
+      <w:pPr>
+        <w:numPr>
+          <w:ilvl w:val="0"/>
+          <w:numId w:val="24"/>
+        </w:numPr>
+        <w:rPr>
+          <w:rFonts w:ascii="Times New Roman" w:eastAsia="Times New Roman" w:hAnsi="Times New Roman" w:cs="Times New Roman"/>
+          <w:lang w:val="en-US"/>
+        </w:rPr>
+      </w:pPr>
+      <w:r>
+        <w:rPr>
+          <w:rFonts w:ascii="Times New Roman" w:eastAsia="Times New Roman" w:hAnsi="Times New Roman" w:cs="Times New Roman"/>
+          <w:lang w:val="en-US"/>
+        </w:rPr>
+        <w:lastRenderedPageBreak/>
+        <w:t>Description: HR Managers must retain explicit on-demand control to re-initiate the enrichment pipeline at any stage of the candidate review lifecycle.</w:t>
+      </w:r>
+    </w:p>
+    <w:p>
+      <w:pPr>
+        <w:numPr>
+          <w:ilvl w:val="0"/>
+          <w:numId w:val="24"/>
+        </w:numPr>
+        <w:rPr>
+          <w:rFonts w:ascii="Times New Roman" w:eastAsia="Times New Roman" w:hAnsi="Times New Roman" w:cs="Times New Roman"/>
+          <w:lang w:val="en-US"/>
+        </w:rPr>
+      </w:pPr>
+      <w:r>
+        <w:rPr>
+          <w:rFonts w:ascii="Times New Roman" w:eastAsia="Times New Roman" w:hAnsi="Times New Roman" w:cs="Times New Roman"/>
+          <w:lang w:val="en-US"/>
+        </w:rPr>
+        <w:t>System Action: Expose a "Run Sync" action button on the candidate profile view. Upon activation, the system re-publishes a profile.enrich event to the message queue, resetting the enrichment status to QUEUED and restarting the full external data harvesting sequence for the targeted candidate record.</w:t>
+      </w:r>
+    </w:p>
+    <w:p>
+      <w:pPr>
+        <w:rPr>
+          <w:rFonts w:ascii="Times New Roman" w:eastAsia="Times New Roman" w:hAnsi="Times New Roman" w:cs="Times New Roman"/>
+          <w:lang w:val="en-US"/>
+        </w:rPr>
+      </w:pPr>
+      <w:r>
+        <w:rPr>
+          <w:rFonts w:ascii="Times New Roman" w:eastAsia="Times New Roman" w:hAnsi="Times New Roman" w:cs="Times New Roman"/>
+          <w:lang w:val="en-US"/>
+        </w:rPr>
+        <w:t xml:space="preserve">  </w:t>
+      </w:r>
+      <w:r>
+        <w:rPr>
+          <w:rFonts w:ascii="Times New Roman" w:eastAsia="Times New Roman" w:hAnsi="Times New Roman" w:cs="Times New Roman"/>
+          <w:b/>
+          <w:bCs/>
+          <w:lang w:val="en-US"/>
+        </w:rPr>
+        <w:t>Enrichment Status Transparency:</w:t>
+      </w:r>
+      <w:r>
+        <w:rPr>
+          <w:rFonts w:ascii="Times New Roman" w:eastAsia="Times New Roman" w:hAnsi="Times New Roman" w:cs="Times New Roman"/>
+          <w:lang w:val="en-US"/>
+        </w:rPr>
+        <w:t xml:space="preserve"> </w:t>
+      </w:r>
+    </w:p>
+    <w:p>
+      <w:pPr>
+        <w:numPr>
+          <w:ilvl w:val="0"/>
+          <w:numId w:val="25"/>
+        </w:numPr>
+        <w:rPr>
+          <w:rFonts w:ascii="Times New Roman" w:eastAsia="Times New Roman" w:hAnsi="Times New Roman" w:cs="Times New Roman"/>
+          <w:lang w:val="en-US"/>
+        </w:rPr>
+      </w:pPr>
+      <w:r>
+        <w:rPr>
+          <w:rFonts w:ascii="Times New Roman" w:eastAsia="Times New Roman" w:hAnsi="Times New Roman" w:cs="Times New Roman"/>
+          <w:lang w:val="en-US"/>
+        </w:rPr>
+        <w:t>Description: The HR Manager must have continuous visibility into the real-time processing state of the enrichment pipeline for each candidate.</w:t>
+      </w:r>
+    </w:p>
+    <w:p>
+      <w:pPr>
+        <w:numPr>
+          <w:ilvl w:val="0"/>
+          <w:numId w:val="25"/>
+        </w:numPr>
+        <w:rPr>
+          <w:rFonts w:ascii="Times New Roman" w:eastAsia="Times New Roman" w:hAnsi="Times New Roman" w:cs="Times New Roman"/>
+          <w:lang w:val="en-US"/>
+        </w:rPr>
+      </w:pPr>
+      <w:r>
+        <w:rPr>
+          <w:rFonts w:ascii="Times New Roman" w:eastAsia="Times New Roman" w:hAnsi="Times New Roman" w:cs="Times New Roman"/>
+          <w:lang w:val="en-US"/>
+        </w:rPr>
+        <w:t>System Action: Maintain a persisted enrichment_status field on each candidate database record, cycling through discrete states: QUEUED → IN_PROGRESS → ENRICHED / ENRICHMENT_FAILED / NO_PROFILES_FOUND. Push status transition events to the frontend via the active WebSocket channel to update the visible status indicator on the candidate dashboard in real time.</w:t>
+      </w:r>
+    </w:p>
+    <w:p>
+      <w:pPr>
+        <w:rPr>
+          <w:rFonts w:ascii="Times New Roman" w:eastAsia="Times New Roman" w:hAnsi="Times New Roman" w:cs="Times New Roman"/>
+          <w:lang w:val="en-US"/>
+        </w:rPr>
+      </w:pPr>
+      <w:r>
+        <w:rPr>
+          <w:rFonts w:ascii="Times New Roman" w:eastAsia="Times New Roman" w:hAnsi="Times New Roman" w:cs="Times New Roman"/>
+          <w:lang w:val="en-US"/>
+        </w:rPr>
+        <w:t xml:space="preserve">  </w:t>
+      </w:r>
+      <w:r>
+        <w:rPr>
+          <w:rFonts w:ascii="Times New Roman" w:eastAsia="Times New Roman" w:hAnsi="Times New Roman" w:cs="Times New Roman"/>
+          <w:b/>
+          <w:bCs/>
+          <w:lang w:val="en-US"/>
+        </w:rPr>
+        <w:t>Missing Identifier Graceful Degradation:</w:t>
+      </w:r>
+      <w:r>
+        <w:rPr>
+          <w:rFonts w:ascii="Times New Roman" w:eastAsia="Times New Roman" w:hAnsi="Times New Roman" w:cs="Times New Roman"/>
+          <w:lang w:val="en-US"/>
+        </w:rPr>
+        <w:t xml:space="preserve"> </w:t>
+      </w:r>
+    </w:p>
+    <w:p>
+      <w:pPr>
+        <w:numPr>
+          <w:ilvl w:val="0"/>
+          <w:numId w:val="26"/>
+        </w:numPr>
+        <w:rPr>
+          <w:rFonts w:ascii="Times New Roman" w:eastAsia="Times New Roman" w:hAnsi="Times New Roman" w:cs="Times New Roman"/>
+          <w:lang w:val="en-US"/>
+        </w:rPr>
+      </w:pPr>
+      <w:r>
+        <w:rPr>
+          <w:rFonts w:ascii="Times New Roman" w:eastAsia="Times New Roman" w:hAnsi="Times New Roman" w:cs="Times New Roman"/>
+          <w:lang w:val="en-US"/>
+        </w:rPr>
+        <w:t>Description: The system must handle candidates whose CVs contain no detectable external profile links without crashing the pipeline or corrupting the existing baseline analytics record.</w:t>
+      </w:r>
+    </w:p>
+    <w:p>
+      <w:pPr>
+        <w:numPr>
+          <w:ilvl w:val="0"/>
+          <w:numId w:val="26"/>
+        </w:numPr>
+        <w:rPr>
+          <w:rFonts w:ascii="Times New Roman" w:eastAsia="Times New Roman" w:hAnsi="Times New Roman" w:cs="Times New Roman"/>
+          <w:lang w:val="en-US"/>
+        </w:rPr>
+      </w:pPr>
+      <w:r>
+        <w:rPr>
+          <w:rFonts w:ascii="Times New Roman" w:eastAsia="Times New Roman" w:hAnsi="Times New Roman" w:cs="Times New Roman"/>
+          <w:lang w:val="en-US"/>
+        </w:rPr>
+        <w:t>System Action: If no GitHub URL or LinkedIn URL is extractable from the candidate's parsed JSON record, update the candidate enrichment status to NO_PROFILES_FOUND, emit a warning notification frame through the WebSocket channel, and surface a descriptive banner alert on the workspace UI. All existing baseline CV analytics must remain intact and unchanged.</w:t>
+      </w:r>
+    </w:p>
+    <w:p>
+      <w:pPr>
+        <w:rPr>
+          <w:rFonts w:ascii="Times New Roman" w:eastAsia="Times New Roman" w:hAnsi="Times New Roman" w:cs="Times New Roman"/>
+          <w:sz w:val="26"/>
+          <w:szCs w:val="26"/>
+          <w:lang w:val="en-US"/>
         </w:rPr>
       </w:pPr>
     </w:p>
@@ -6294,6 +7056,7 @@
           <w:b/>
           <w:bCs/>
         </w:rPr>
+        <w:lastRenderedPageBreak/>
         <w:t>+Constraint:</w:t>
       </w:r>
       <w:r>
@@ -6406,7 +7169,6 @@
           <w:b/>
           <w:bCs/>
         </w:rPr>
-        <w:lastRenderedPageBreak/>
         <w:t>+Constraint</w:t>
       </w:r>
       <w:r>
@@ -6624,17 +7386,569 @@
     </w:p>
     <w:p>
       <w:pPr>
+        <w:rPr>
+          <w:rFonts w:ascii="Times New Roman" w:eastAsia="Times New Roman" w:hAnsi="Times New Roman" w:cs="Times New Roman"/>
+          <w:b/>
+          <w:bCs/>
+          <w:i/>
+          <w:iCs/>
+          <w:sz w:val="26"/>
+          <w:szCs w:val="26"/>
+          <w:lang w:val="en-US"/>
+        </w:rPr>
+      </w:pPr>
+      <w:r>
+        <w:rPr>
+          <w:rFonts w:ascii="Times New Roman" w:eastAsia="Times New Roman" w:hAnsi="Times New Roman" w:cs="Times New Roman"/>
+          <w:b/>
+          <w:bCs/>
+          <w:i/>
+          <w:iCs/>
+          <w:sz w:val="26"/>
+          <w:szCs w:val="26"/>
+        </w:rPr>
+        <w:t>b</w:t>
+      </w:r>
+      <w:r>
+        <w:rPr>
+          <w:rFonts w:ascii="Times New Roman" w:eastAsia="Times New Roman" w:hAnsi="Times New Roman" w:cs="Times New Roman"/>
+          <w:b/>
+          <w:bCs/>
+          <w:i/>
+          <w:iCs/>
+          <w:sz w:val="26"/>
+          <w:szCs w:val="26"/>
+        </w:rPr>
+        <w:t>/</w:t>
+      </w:r>
+      <w:r>
+        <w:rPr>
+          <w:rFonts w:ascii="Segoe UI" w:eastAsia="Times New Roman" w:hAnsi="Segoe UI" w:cs="Segoe UI"/>
+          <w:color w:val="292A2E"/>
+          <w:kern w:val="36"/>
+          <w:sz w:val="36"/>
+          <w:szCs w:val="36"/>
+          <w:lang w:val="en-US"/>
+        </w:rPr>
+        <w:t xml:space="preserve"> </w:t>
+      </w:r>
+      <w:r>
+        <w:rPr>
+          <w:rFonts w:ascii="Times New Roman" w:eastAsia="Times New Roman" w:hAnsi="Times New Roman" w:cs="Times New Roman"/>
+          <w:b/>
+          <w:bCs/>
+          <w:i/>
+          <w:iCs/>
+          <w:sz w:val="26"/>
+          <w:szCs w:val="26"/>
+          <w:lang w:val="en-US"/>
+        </w:rPr>
+        <w:t>Cross-Channel Profile Enrichment Engine</w:t>
+      </w:r>
+    </w:p>
+    <w:p>
+      <w:pPr>
+        <w:pStyle w:val="ListParagraph"/>
+        <w:numPr>
+          <w:ilvl w:val="0"/>
+          <w:numId w:val="26"/>
+        </w:numPr>
+        <w:rPr>
+          <w:rFonts w:ascii="Times New Roman" w:eastAsia="Times New Roman" w:hAnsi="Times New Roman" w:cs="Times New Roman"/>
+          <w:lang w:val="en-US"/>
+        </w:rPr>
+      </w:pPr>
+      <w:r>
+        <w:rPr>
+          <w:rFonts w:ascii="Times New Roman" w:eastAsia="Times New Roman" w:hAnsi="Times New Roman" w:cs="Times New Roman"/>
+          <w:b/>
+          <w:bCs/>
+          <w:lang w:val="en-US"/>
+        </w:rPr>
+        <w:t>Non-Blocking Async Compliance (Performance)</w:t>
+      </w:r>
+      <w:r>
+        <w:rPr>
+          <w:rFonts w:ascii="Times New Roman" w:eastAsia="Times New Roman" w:hAnsi="Times New Roman" w:cs="Times New Roman"/>
+          <w:lang w:val="en-US"/>
+        </w:rPr>
+        <w:t xml:space="preserve"> </w:t>
+      </w:r>
+    </w:p>
+    <w:p>
+      <w:pPr>
+        <w:numPr>
+          <w:ilvl w:val="0"/>
+          <w:numId w:val="27"/>
+        </w:numPr>
+        <w:tabs>
+          <w:tab w:val="num" w:pos="720"/>
+        </w:tabs>
+        <w:rPr>
+          <w:rFonts w:ascii="Times New Roman" w:eastAsia="Times New Roman" w:hAnsi="Times New Roman" w:cs="Times New Roman"/>
+          <w:lang w:val="en-US"/>
+        </w:rPr>
+      </w:pPr>
+      <w:r>
+        <w:rPr>
+          <w:rFonts w:ascii="Times New Roman" w:eastAsia="Times New Roman" w:hAnsi="Times New Roman" w:cs="Times New Roman"/>
+          <w:lang w:val="en-US"/>
+        </w:rPr>
+        <w:lastRenderedPageBreak/>
+        <w:t>Constraint: The enrichment pipeline dispatch must publish the profile.enrich event to the Azure Service Bus queue within 500 milliseconds of the upstream CV parsing completion signal. Throughout the entire background enrichment execution, the primary HR workspace UI must maintain a client-side interaction response time below 200 milliseconds to preserve workspace usability.</w:t>
+      </w:r>
+    </w:p>
+    <w:p>
+      <w:pPr>
+        <w:pStyle w:val="ListParagraph"/>
+        <w:numPr>
+          <w:ilvl w:val="0"/>
+          <w:numId w:val="26"/>
+        </w:numPr>
+        <w:rPr>
+          <w:rFonts w:ascii="Times New Roman" w:eastAsia="Times New Roman" w:hAnsi="Times New Roman" w:cs="Times New Roman"/>
+          <w:b/>
+          <w:bCs/>
+          <w:lang w:val="en-US"/>
+        </w:rPr>
+      </w:pPr>
+      <w:r>
+        <w:rPr>
+          <w:rFonts w:ascii="Times New Roman" w:eastAsia="Times New Roman" w:hAnsi="Times New Roman" w:cs="Times New Roman"/>
+          <w:b/>
+          <w:bCs/>
+          <w:lang w:val="en-US"/>
+        </w:rPr>
+        <w:t xml:space="preserve">  End-to-End Enrichment Throughput (Performance) </w:t>
+      </w:r>
+    </w:p>
+    <w:p>
+      <w:pPr>
+        <w:numPr>
+          <w:ilvl w:val="0"/>
+          <w:numId w:val="27"/>
+        </w:numPr>
+        <w:tabs>
+          <w:tab w:val="num" w:pos="720"/>
+        </w:tabs>
+        <w:rPr>
+          <w:rFonts w:ascii="Times New Roman" w:eastAsia="Times New Roman" w:hAnsi="Times New Roman" w:cs="Times New Roman"/>
+          <w:lang w:val="en-US"/>
+        </w:rPr>
+      </w:pPr>
+      <w:r>
+        <w:rPr>
+          <w:rFonts w:ascii="Times New Roman" w:eastAsia="Times New Roman" w:hAnsi="Times New Roman" w:cs="Times New Roman"/>
+          <w:lang w:val="en-US"/>
+        </w:rPr>
+        <w:t>Constraint: The complete enrichment cycle — spanning external API crawling, LinkedIn harvesting, profile consolidation, vector re-indexing, and Smatch recalculation — must deliver the finalized updated analytics payload to the client WebSocket channel within 45 seconds under standard network conditions and nominal third-party API response latencies.</w:t>
+      </w:r>
+    </w:p>
+    <w:p>
+      <w:pPr>
+        <w:pStyle w:val="ListParagraph"/>
+        <w:numPr>
+          <w:ilvl w:val="0"/>
+          <w:numId w:val="26"/>
+        </w:numPr>
+        <w:rPr>
+          <w:rFonts w:ascii="Times New Roman" w:eastAsia="Times New Roman" w:hAnsi="Times New Roman" w:cs="Times New Roman"/>
+          <w:lang w:val="en-US"/>
+        </w:rPr>
+      </w:pPr>
+      <w:r>
+        <w:rPr>
+          <w:rFonts w:ascii="Times New Roman" w:eastAsia="Times New Roman" w:hAnsi="Times New Roman" w:cs="Times New Roman"/>
+          <w:b/>
+          <w:bCs/>
+          <w:lang w:val="en-US"/>
+        </w:rPr>
+        <w:t xml:space="preserve">  Fault Tolerance &amp; Retry Resilience (Reliability) </w:t>
+      </w:r>
+    </w:p>
+    <w:p>
+      <w:pPr>
+        <w:numPr>
+          <w:ilvl w:val="0"/>
+          <w:numId w:val="27"/>
+        </w:numPr>
+        <w:tabs>
+          <w:tab w:val="num" w:pos="720"/>
+        </w:tabs>
+        <w:rPr>
+          <w:rFonts w:ascii="Times New Roman" w:eastAsia="Times New Roman" w:hAnsi="Times New Roman" w:cs="Times New Roman"/>
+          <w:lang w:val="en-US"/>
+        </w:rPr>
+      </w:pPr>
+      <w:r>
+        <w:rPr>
+          <w:rFonts w:ascii="Times New Roman" w:eastAsia="Times New Roman" w:hAnsi="Times New Roman" w:cs="Times New Roman"/>
+          <w:lang w:val="en-US"/>
+        </w:rPr>
+        <w:t>Constraint: The enrichment integration layer must enforce an Exponential Backoff retry policy across all outbound external API calls, executing a minimum of 3 retry attempts with progressively increasing backoff intervals before declaring a hard failure. Upon exhausting all retry attempts, the system must transition the candidate enrichment status to ENRICHMENT_FAILED, emit a fallback alert via the active WebSocket channel, and guarantee zero corruption of the existing baseline candidate analytics record.</w:t>
+      </w:r>
+    </w:p>
+    <w:p>
+      <w:pPr>
+        <w:pStyle w:val="ListParagraph"/>
+        <w:numPr>
+          <w:ilvl w:val="0"/>
+          <w:numId w:val="26"/>
+        </w:numPr>
+        <w:rPr>
+          <w:rFonts w:ascii="Times New Roman" w:eastAsia="Times New Roman" w:hAnsi="Times New Roman" w:cs="Times New Roman"/>
+          <w:lang w:val="en-US"/>
+        </w:rPr>
+      </w:pPr>
+      <w:r>
+        <w:rPr>
+          <w:rFonts w:ascii="Times New Roman" w:eastAsia="Times New Roman" w:hAnsi="Times New Roman" w:cs="Times New Roman"/>
+          <w:lang w:val="en-US"/>
+        </w:rPr>
+        <w:t xml:space="preserve">  </w:t>
+      </w:r>
+      <w:r>
+        <w:rPr>
+          <w:rFonts w:ascii="Times New Roman" w:eastAsia="Times New Roman" w:hAnsi="Times New Roman" w:cs="Times New Roman"/>
+          <w:b/>
+          <w:bCs/>
+          <w:lang w:val="en-US"/>
+        </w:rPr>
+        <w:t>Third-Party Rate Limit Compliance (Reliability)</w:t>
+      </w:r>
+      <w:r>
+        <w:rPr>
+          <w:rFonts w:ascii="Times New Roman" w:eastAsia="Times New Roman" w:hAnsi="Times New Roman" w:cs="Times New Roman"/>
+          <w:lang w:val="en-US"/>
+        </w:rPr>
+        <w:t xml:space="preserve"> </w:t>
+      </w:r>
+    </w:p>
+    <w:p>
+      <w:pPr>
+        <w:numPr>
+          <w:ilvl w:val="0"/>
+          <w:numId w:val="27"/>
+        </w:numPr>
+        <w:tabs>
+          <w:tab w:val="num" w:pos="720"/>
+        </w:tabs>
+        <w:rPr>
+          <w:rFonts w:ascii="Times New Roman" w:eastAsia="Times New Roman" w:hAnsi="Times New Roman" w:cs="Times New Roman"/>
+          <w:lang w:val="en-US"/>
+        </w:rPr>
+      </w:pPr>
+      <w:r>
+        <w:rPr>
+          <w:rFonts w:ascii="Times New Roman" w:eastAsia="Times New Roman" w:hAnsi="Times New Roman" w:cs="Times New Roman"/>
+          <w:lang w:val="en-US"/>
+        </w:rPr>
+        <w:t>Constraint: The enrichment engine must enforce internal request throttling logic to strictly comply with external provider rate-limit policies, including the GitHub REST API authenticated ceiling of 5,000 requests per hour. The throttling layer must prevent API token revocations, temporary IP bans, or service suspensions from any integrated third-party data provider.</w:t>
+      </w:r>
+    </w:p>
+    <w:p>
+      <w:pPr>
+        <w:pStyle w:val="ListParagraph"/>
+        <w:numPr>
+          <w:ilvl w:val="0"/>
+          <w:numId w:val="26"/>
+        </w:numPr>
+        <w:rPr>
+          <w:rFonts w:ascii="Times New Roman" w:eastAsia="Times New Roman" w:hAnsi="Times New Roman" w:cs="Times New Roman"/>
+          <w:lang w:val="en-US"/>
+        </w:rPr>
+      </w:pPr>
+      <w:r>
+        <w:rPr>
+          <w:rFonts w:ascii="Times New Roman" w:eastAsia="Times New Roman" w:hAnsi="Times New Roman" w:cs="Times New Roman"/>
+          <w:lang w:val="en-US"/>
+        </w:rPr>
+        <w:t xml:space="preserve">  </w:t>
+      </w:r>
+      <w:r>
+        <w:rPr>
+          <w:rFonts w:ascii="Times New Roman" w:eastAsia="Times New Roman" w:hAnsi="Times New Roman" w:cs="Times New Roman"/>
+          <w:b/>
+          <w:bCs/>
+          <w:lang w:val="en-US"/>
+        </w:rPr>
+        <w:t>Enrichment Worker Scalability (Scalability)</w:t>
+      </w:r>
+      <w:r>
+        <w:rPr>
+          <w:rFonts w:ascii="Times New Roman" w:eastAsia="Times New Roman" w:hAnsi="Times New Roman" w:cs="Times New Roman"/>
+          <w:lang w:val="en-US"/>
+        </w:rPr>
+        <w:t xml:space="preserve"> </w:t>
+      </w:r>
+    </w:p>
+    <w:p>
+      <w:pPr>
+        <w:numPr>
+          <w:ilvl w:val="0"/>
+          <w:numId w:val="27"/>
+        </w:numPr>
+        <w:tabs>
+          <w:tab w:val="num" w:pos="720"/>
+        </w:tabs>
+        <w:rPr>
+          <w:rFonts w:ascii="Times New Roman" w:eastAsia="Times New Roman" w:hAnsi="Times New Roman" w:cs="Times New Roman"/>
+          <w:lang w:val="en-US"/>
+        </w:rPr>
+      </w:pPr>
+      <w:r>
+        <w:rPr>
+          <w:rFonts w:ascii="Times New Roman" w:eastAsia="Times New Roman" w:hAnsi="Times New Roman" w:cs="Times New Roman"/>
+          <w:lang w:val="en-US"/>
+        </w:rPr>
+        <w:t>Constraint: The enrichment worker pool must support horizontal scaling via the Azure Service Bus message queue backbone. Under peak load conditions — defined as 50 or more simultaneous enrichment events queued concurrently — all tasks must be processed to completion without degrading API Gateway response times for active HR Manager sessions.</w:t>
+      </w:r>
+    </w:p>
+    <w:p>
+      <w:pPr>
+        <w:pStyle w:val="ListParagraph"/>
+        <w:numPr>
+          <w:ilvl w:val="0"/>
+          <w:numId w:val="26"/>
+        </w:numPr>
+        <w:rPr>
+          <w:rFonts w:ascii="Times New Roman" w:eastAsia="Times New Roman" w:hAnsi="Times New Roman" w:cs="Times New Roman"/>
+          <w:lang w:val="en-US"/>
+        </w:rPr>
+      </w:pPr>
+      <w:r>
+        <w:rPr>
+          <w:rFonts w:ascii="Times New Roman" w:eastAsia="Times New Roman" w:hAnsi="Times New Roman" w:cs="Times New Roman"/>
+          <w:lang w:val="en-US"/>
+        </w:rPr>
+        <w:t xml:space="preserve">  </w:t>
+      </w:r>
+      <w:r>
+        <w:rPr>
+          <w:rFonts w:ascii="Times New Roman" w:eastAsia="Times New Roman" w:hAnsi="Times New Roman" w:cs="Times New Roman"/>
+          <w:b/>
+          <w:bCs/>
+          <w:lang w:val="en-US"/>
+        </w:rPr>
+        <w:t>Credential Isolation &amp; Secret Hygiene (Security)</w:t>
+      </w:r>
+      <w:r>
+        <w:rPr>
+          <w:rFonts w:ascii="Times New Roman" w:eastAsia="Times New Roman" w:hAnsi="Times New Roman" w:cs="Times New Roman"/>
+          <w:lang w:val="en-US"/>
+        </w:rPr>
+        <w:t xml:space="preserve"> </w:t>
+      </w:r>
+    </w:p>
+    <w:p>
+      <w:pPr>
+        <w:numPr>
+          <w:ilvl w:val="0"/>
+          <w:numId w:val="27"/>
+        </w:numPr>
+        <w:tabs>
+          <w:tab w:val="num" w:pos="720"/>
+        </w:tabs>
+        <w:rPr>
+          <w:rFonts w:ascii="Times New Roman" w:eastAsia="Times New Roman" w:hAnsi="Times New Roman" w:cs="Times New Roman"/>
+          <w:lang w:val="en-US"/>
+        </w:rPr>
+      </w:pPr>
+      <w:r>
+        <w:rPr>
+          <w:rFonts w:ascii="Times New Roman" w:eastAsia="Times New Roman" w:hAnsi="Times New Roman" w:cs="Times New Roman"/>
+          <w:lang w:val="en-US"/>
+        </w:rPr>
+        <w:t>Constraint: All outbound authentication credentials used for third-party API integrations — including GitHub API tokens and LinkedIn provider API keys — must be stored exclusively within server-side environment-scoped secret vaults. No authentication tokens may be exposed to the client application layer, embedded in frontend bundles, or recorded in plaintext within the system's centralized audit log.</w:t>
+      </w:r>
+    </w:p>
+    <w:p>
+      <w:pPr>
+        <w:pStyle w:val="ListParagraph"/>
+        <w:numPr>
+          <w:ilvl w:val="0"/>
+          <w:numId w:val="26"/>
+        </w:numPr>
+        <w:rPr>
+          <w:rFonts w:ascii="Times New Roman" w:eastAsia="Times New Roman" w:hAnsi="Times New Roman" w:cs="Times New Roman"/>
+          <w:lang w:val="en-US"/>
+        </w:rPr>
+      </w:pPr>
+      <w:r>
+        <w:rPr>
+          <w:rFonts w:ascii="Times New Roman" w:eastAsia="Times New Roman" w:hAnsi="Times New Roman" w:cs="Times New Roman"/>
+          <w:lang w:val="en-US"/>
+        </w:rPr>
+        <w:t xml:space="preserve">  </w:t>
+      </w:r>
+      <w:r>
+        <w:rPr>
+          <w:rFonts w:ascii="Times New Roman" w:eastAsia="Times New Roman" w:hAnsi="Times New Roman" w:cs="Times New Roman"/>
+          <w:b/>
+          <w:bCs/>
+          <w:lang w:val="en-US"/>
+        </w:rPr>
+        <w:t>Idempotent Data Merge Integrity (Data Integrity)</w:t>
+      </w:r>
+      <w:r>
+        <w:rPr>
+          <w:rFonts w:ascii="Times New Roman" w:eastAsia="Times New Roman" w:hAnsi="Times New Roman" w:cs="Times New Roman"/>
+          <w:lang w:val="en-US"/>
+        </w:rPr>
+        <w:t xml:space="preserve"> </w:t>
+      </w:r>
+    </w:p>
+    <w:p>
+      <w:pPr>
+        <w:numPr>
+          <w:ilvl w:val="0"/>
+          <w:numId w:val="27"/>
+        </w:numPr>
+        <w:tabs>
+          <w:tab w:val="num" w:pos="720"/>
+        </w:tabs>
+        <w:rPr>
+          <w:rFonts w:ascii="Times New Roman" w:eastAsia="Times New Roman" w:hAnsi="Times New Roman" w:cs="Times New Roman"/>
+          <w:lang w:val="en-US"/>
+        </w:rPr>
+      </w:pPr>
+      <w:r>
+        <w:rPr>
+          <w:rFonts w:ascii="Times New Roman" w:eastAsia="Times New Roman" w:hAnsi="Times New Roman" w:cs="Times New Roman"/>
+          <w:lang w:val="en-US"/>
+        </w:rPr>
+        <w:lastRenderedPageBreak/>
+        <w:t>Constraint: The profile consolidation operation must be fully idempotent. Re-executing the enrichment pipeline against the same candidate UUID any number of times must consistently produce an identical final database state, with no duplication of skill entries, employment records, or repository data within the PostgreSQL candidate profile schema.</w:t>
+      </w:r>
+    </w:p>
+    <w:p>
+      <w:pPr>
+        <w:pStyle w:val="ListParagraph"/>
+        <w:numPr>
+          <w:ilvl w:val="0"/>
+          <w:numId w:val="26"/>
+        </w:numPr>
+        <w:rPr>
+          <w:rFonts w:ascii="Times New Roman" w:eastAsia="Times New Roman" w:hAnsi="Times New Roman" w:cs="Times New Roman"/>
+          <w:lang w:val="en-US"/>
+        </w:rPr>
+      </w:pPr>
+      <w:r>
+        <w:rPr>
+          <w:rFonts w:ascii="Times New Roman" w:eastAsia="Times New Roman" w:hAnsi="Times New Roman" w:cs="Times New Roman"/>
+          <w:lang w:val="en-US"/>
+        </w:rPr>
+        <w:t xml:space="preserve">  </w:t>
+      </w:r>
+      <w:r>
+        <w:rPr>
+          <w:rFonts w:ascii="Times New Roman" w:eastAsia="Times New Roman" w:hAnsi="Times New Roman" w:cs="Times New Roman"/>
+          <w:b/>
+          <w:bCs/>
+          <w:lang w:val="en-US"/>
+        </w:rPr>
+        <w:t>Enrichment Auditability (Maintainability)</w:t>
+      </w:r>
+      <w:r>
+        <w:rPr>
+          <w:rFonts w:ascii="Times New Roman" w:eastAsia="Times New Roman" w:hAnsi="Times New Roman" w:cs="Times New Roman"/>
+          <w:lang w:val="en-US"/>
+        </w:rPr>
+        <w:t xml:space="preserve"> </w:t>
+      </w:r>
+    </w:p>
+    <w:p>
+      <w:pPr>
+        <w:numPr>
+          <w:ilvl w:val="0"/>
+          <w:numId w:val="27"/>
+        </w:numPr>
+        <w:tabs>
+          <w:tab w:val="num" w:pos="720"/>
+        </w:tabs>
+        <w:rPr>
+          <w:rFonts w:ascii="Times New Roman" w:eastAsia="Times New Roman" w:hAnsi="Times New Roman" w:cs="Times New Roman"/>
+          <w:lang w:val="en-US"/>
+        </w:rPr>
+      </w:pPr>
+      <w:r>
+        <w:rPr>
+          <w:rFonts w:ascii="Times New Roman" w:eastAsia="Times New Roman" w:hAnsi="Times New Roman" w:cs="Times New Roman"/>
+          <w:lang w:val="en-US"/>
+        </w:rPr>
+        <w:t>Constraint: Every enrichment pipeline execution must emit a structured audit log entry — persisted to the system's centralized audit trail — recording the trigger timestamp, external API response status codes, retry attempt counts, and final pipeline outcome, all traceable by candidate_uuid for retrospective debugging and compliance verification.</w:t>
+      </w:r>
+    </w:p>
+    <w:p>
+      <w:pPr>
+        <w:pStyle w:val="ListParagraph"/>
+        <w:numPr>
+          <w:ilvl w:val="0"/>
+          <w:numId w:val="26"/>
+        </w:numPr>
+        <w:rPr>
+          <w:rFonts w:ascii="Times New Roman" w:eastAsia="Times New Roman" w:hAnsi="Times New Roman" w:cs="Times New Roman"/>
+          <w:lang w:val="en-US"/>
+        </w:rPr>
+      </w:pPr>
+      <w:r>
+        <w:rPr>
+          <w:rFonts w:ascii="Times New Roman" w:eastAsia="Times New Roman" w:hAnsi="Times New Roman" w:cs="Times New Roman"/>
+          <w:lang w:val="en-US"/>
+        </w:rPr>
+        <w:t xml:space="preserve">  </w:t>
+      </w:r>
+      <w:r>
+        <w:rPr>
+          <w:rFonts w:ascii="Times New Roman" w:eastAsia="Times New Roman" w:hAnsi="Times New Roman" w:cs="Times New Roman"/>
+          <w:b/>
+          <w:bCs/>
+          <w:lang w:val="en-US"/>
+        </w:rPr>
+        <w:t>Module-Level Deployment Independence (Maintainability)</w:t>
+      </w:r>
+      <w:r>
+        <w:rPr>
+          <w:rFonts w:ascii="Times New Roman" w:eastAsia="Times New Roman" w:hAnsi="Times New Roman" w:cs="Times New Roman"/>
+          <w:lang w:val="en-US"/>
+        </w:rPr>
+        <w:t xml:space="preserve"> </w:t>
+      </w:r>
+    </w:p>
+    <w:p>
+      <w:pPr>
+        <w:numPr>
+          <w:ilvl w:val="0"/>
+          <w:numId w:val="27"/>
+        </w:numPr>
+        <w:tabs>
+          <w:tab w:val="num" w:pos="720"/>
+        </w:tabs>
+        <w:rPr>
+          <w:rFonts w:ascii="Times New Roman" w:eastAsia="Times New Roman" w:hAnsi="Times New Roman" w:cs="Times New Roman"/>
+          <w:lang w:val="en-US"/>
+        </w:rPr>
+      </w:pPr>
+      <w:r>
+        <w:rPr>
+          <w:rFonts w:ascii="Times New Roman" w:eastAsia="Times New Roman" w:hAnsi="Times New Roman" w:cs="Times New Roman"/>
+          <w:lang w:val="en-US"/>
+        </w:rPr>
+        <w:t>Constraint: The Portfolio-Enrich Engine must be implemented and deployable as an independently isolated module within the Modular Monolith architecture, decoupled from both the CV Parser and AI Analytics Engine exclusively through the message queue boundary. Upgrades or full replacements of any external data provider integration must require zero modifications to the API Gateway layer or the AI Analytics Engine codebase.</w:t>
+      </w:r>
+    </w:p>
+    <w:p>
+      <w:pPr>
+        <w:rPr>
+          <w:rFonts w:ascii="Times New Roman" w:eastAsia="Times New Roman" w:hAnsi="Times New Roman" w:cs="Times New Roman"/>
+        </w:rPr>
+      </w:pPr>
+    </w:p>
+    <w:p>
+      <w:pPr>
         <w:ind w:firstLine="709"/>
         <w:rPr>
           <w:rFonts w:ascii="Times New Roman" w:eastAsia="Times New Roman" w:hAnsi="Times New Roman" w:cs="Times New Roman"/>
-        </w:rPr>
-      </w:pPr>
-    </w:p>
-    <w:p>
-      <w:pPr>
-        <w:ind w:firstLine="709"/>
-        <w:rPr>
-          <w:rFonts w:ascii="Times New Roman" w:eastAsia="Times New Roman" w:hAnsi="Times New Roman" w:cs="Times New Roman"/>
           <w:color w:val="000000"/>
         </w:rPr>
       </w:pPr>
@@ -6644,29 +7958,6 @@
           <w:color w:val="000000"/>
         </w:rPr>
         <w:t>[Describe the non-functional requirements of the system using natural language]</w:t>
-      </w:r>
-    </w:p>
-    <w:p>
-      <w:pPr>
-        <w:rPr>
-          <w:rFonts w:ascii="Times New Roman" w:eastAsia="Times New Roman" w:hAnsi="Times New Roman" w:cs="Times New Roman"/>
-        </w:rPr>
-      </w:pPr>
-    </w:p>
-    <w:p>
-      <w:pPr>
-        <w:pStyle w:val="Heading1"/>
-        <w:rPr>
-          <w:rFonts w:ascii="Times New Roman" w:eastAsia="Times New Roman" w:hAnsi="Times New Roman" w:cs="Times New Roman"/>
-          <w:sz w:val="144"/>
-          <w:szCs w:val="144"/>
-        </w:rPr>
-      </w:pPr>
-      <w:r>
-        <w:rPr>
-          <w:rFonts w:ascii="Times New Roman" w:hAnsi="Times New Roman" w:cs="Times New Roman"/>
-        </w:rPr>
-        <w:br w:type="page"/>
       </w:r>
     </w:p>
     <w:p>
@@ -6687,7 +7978,6 @@
         <w:rPr>
           <w:rFonts w:ascii="Times New Roman" w:eastAsia="Times New Roman" w:hAnsi="Times New Roman" w:cs="Times New Roman"/>
         </w:rPr>
-        <w:lastRenderedPageBreak/>
         <w:t>Requirements Analysis</w:t>
       </w:r>
     </w:p>
@@ -6825,6 +8115,7 @@
           <w:rFonts w:ascii="Times New Roman" w:eastAsia="Times New Roman" w:hAnsi="Times New Roman" w:cs="Times New Roman"/>
           <w:noProof/>
         </w:rPr>
+        <w:lastRenderedPageBreak/>
         <w:drawing>
           <wp:inline distT="114300" distB="114300" distL="114300" distR="114300" wp14:anchorId="5B7BA96A" wp14:editId="321F3D99">
             <wp:extent cx="6400800" cy="4254500"/>
@@ -6902,7 +8193,6 @@
           <w:b/>
           <w:bCs/>
         </w:rPr>
-        <w:lastRenderedPageBreak/>
         <w:t>Primary Human Actors:</w:t>
       </w:r>
       <w:r>
@@ -7029,7 +8319,14 @@
         <w:rPr>
           <w:rFonts w:ascii="Times New Roman" w:eastAsia="Times New Roman" w:hAnsi="Times New Roman" w:cs="Times New Roman"/>
         </w:rPr>
-        <w:t>, the system extracts contextual metadata and calculates semantic proximity scores, which are immediately projected onto an interactive Canvas Radar Chart (</w:t>
+        <w:t xml:space="preserve">, the system extracts contextual metadata and calculates semantic proximity scores, which are immediately </w:t>
+      </w:r>
+      <w:r>
+        <w:rPr>
+          <w:rFonts w:ascii="Times New Roman" w:eastAsia="Times New Roman" w:hAnsi="Times New Roman" w:cs="Times New Roman"/>
+        </w:rPr>
+        <w:lastRenderedPageBreak/>
+        <w:t>projected onto an interactive Canvas Radar Chart (</w:t>
       </w:r>
       <w:r>
         <w:rPr>
@@ -7431,7 +8728,6 @@
               <w:rPr>
                 <w:rFonts w:ascii="Times New Roman" w:eastAsia="Times New Roman" w:hAnsi="Times New Roman" w:cs="Times New Roman"/>
               </w:rPr>
-              <w:lastRenderedPageBreak/>
               <w:t xml:space="preserve">Use Case </w:t>
             </w:r>
           </w:p>
@@ -7727,6 +9023,7 @@
               <w:rPr>
                 <w:rFonts w:ascii="Times New Roman" w:eastAsia="Times New Roman" w:hAnsi="Times New Roman" w:cs="Times New Roman"/>
               </w:rPr>
+              <w:lastRenderedPageBreak/>
               <w:t>An ingestion tracking message token is published to the queue cluster.</w:t>
             </w:r>
           </w:p>
@@ -7775,6 +9072,7 @@
               <w:rPr>
                 <w:rFonts w:ascii="Times New Roman" w:eastAsia="Times New Roman" w:hAnsi="Times New Roman" w:cs="Times New Roman"/>
               </w:rPr>
+              <w:lastRenderedPageBreak/>
               <w:t>Main Scenario</w:t>
             </w:r>
           </w:p>
@@ -7985,7 +9283,6 @@
               <w:rPr>
                 <w:rFonts w:ascii="Times New Roman" w:eastAsia="Times New Roman" w:hAnsi="Times New Roman" w:cs="Times New Roman"/>
               </w:rPr>
-              <w:lastRenderedPageBreak/>
               <w:t>The system catches the payload frame and instantly visualizes the candidate profile metadata, interactive Radar Charts, and SVG career timelines on the right-hand layout panel.</w:t>
             </w:r>
           </w:p>
@@ -8031,7 +9328,6 @@
               <w:rPr>
                 <w:rFonts w:ascii="Times New Roman" w:eastAsia="Times New Roman" w:hAnsi="Times New Roman" w:cs="Times New Roman"/>
               </w:rPr>
-              <w:lastRenderedPageBreak/>
               <w:t>Alternatice Scenarios</w:t>
             </w:r>
           </w:p>
@@ -8105,6 +9401,7 @@
               <w:rPr>
                 <w:rFonts w:ascii="Times New Roman" w:eastAsia="Times New Roman" w:hAnsi="Times New Roman" w:cs="Times New Roman"/>
               </w:rPr>
+              <w:lastRenderedPageBreak/>
               <w:t>The system generates an HTTP 400 Bad Request client boundary code error.</w:t>
             </w:r>
           </w:p>
@@ -8283,6 +9580,7 @@
               <w:rPr>
                 <w:rFonts w:ascii="Times New Roman" w:eastAsia="Times New Roman" w:hAnsi="Times New Roman" w:cs="Times New Roman"/>
               </w:rPr>
+              <w:lastRenderedPageBreak/>
               <w:t>Non-Functional Constraints</w:t>
             </w:r>
           </w:p>
@@ -8331,7 +9629,6 @@
               <w:rPr>
                 <w:rFonts w:ascii="Times New Roman" w:eastAsia="Times New Roman" w:hAnsi="Times New Roman" w:cs="Times New Roman"/>
               </w:rPr>
-              <w:lastRenderedPageBreak/>
               <w:t>Layout Integrity: The dual view pane must respond gracefully to panel resizing without triggering horizontal text layout overflow clipping.</w:t>
             </w:r>
           </w:p>
@@ -8462,7 +9759,6 @@
           <w:sz w:val="26"/>
           <w:szCs w:val="26"/>
         </w:rPr>
-        <w:lastRenderedPageBreak/>
         <w:t>Cross-Channel Profile Enrichment &amp; Manual Sync Trigger</w:t>
       </w:r>
     </w:p>
@@ -8581,6 +9877,7 @@
               <w:rPr>
                 <w:rFonts w:ascii="Times New Roman" w:eastAsia="Times New Roman" w:hAnsi="Times New Roman" w:cs="Times New Roman"/>
               </w:rPr>
+              <w:lastRenderedPageBreak/>
               <w:t xml:space="preserve">Use Case </w:t>
             </w:r>
           </w:p>
@@ -9058,7 +10355,6 @@
                 <w:rFonts w:ascii="Times New Roman" w:eastAsia="Times New Roman" w:hAnsi="Times New Roman" w:cs="Times New Roman"/>
                 <w:lang w:val="en-US"/>
               </w:rPr>
-              <w:lastRenderedPageBreak/>
               <w:t>5. The Portfolio-Enrich module crawls and analyzes public code repositories (parsing README.md files) from GitHub and structured employment history timelines from LinkedIn.</w:t>
             </w:r>
           </w:p>
@@ -9084,6 +10380,7 @@
                 <w:rFonts w:ascii="Times New Roman" w:eastAsia="Times New Roman" w:hAnsi="Times New Roman" w:cs="Times New Roman"/>
                 <w:lang w:val="en-US"/>
               </w:rPr>
+              <w:lastRenderedPageBreak/>
               <w:t>6. The background pipeline normalizes the fetched unstructured metadata into a unified technical capability schema.</w:t>
             </w:r>
             <w:r>
@@ -9345,7 +10642,6 @@
                 <w:rFonts w:ascii="Times New Roman" w:eastAsia="Times New Roman" w:hAnsi="Times New Roman" w:cs="Times New Roman"/>
                 <w:lang w:val="en-US"/>
               </w:rPr>
-              <w:lastRenderedPageBreak/>
               <w:t>- The background task engine initiates an automated background retry routine utilizing an Exponential Backoff strategy.</w:t>
             </w:r>
           </w:p>
@@ -9361,6 +10657,7 @@
                 <w:rFonts w:ascii="Times New Roman" w:eastAsia="Times New Roman" w:hAnsi="Times New Roman" w:cs="Times New Roman"/>
                 <w:lang w:val="en-US"/>
               </w:rPr>
+              <w:lastRenderedPageBreak/>
               <w:t>- If errors persist beyond the hardcoded maximum threshold, the sync state flags "Enrichment Failed" via WebSocket, maintaining the original raw CV baseline while providing a manual retry control option.</w:t>
             </w:r>
           </w:p>
@@ -9669,13 +10966,7 @@
         <w:rPr>
           <w:rFonts w:ascii="Times New Roman" w:hAnsi="Times New Roman" w:cs="Times New Roman"/>
         </w:rPr>
-        <w:t xml:space="preserve"> for a clearer view of the Figma prototype.</w:t>
-      </w:r>
-      <w:r>
-        <w:rPr>
-          <w:rFonts w:ascii="Times New Roman" w:hAnsi="Times New Roman" w:cs="Times New Roman"/>
-        </w:rPr>
-        <w:t xml:space="preserve"> </w:t>
+        <w:t xml:space="preserve"> for a clearer view of the Figma prototype. </w:t>
       </w:r>
       <w:r>
         <w:rPr>
@@ -10304,6 +11595,746 @@
 <file path=word/numbering.xml><?xml version="1.0" encoding="utf-8"?>
 <w:numbering xmlns:wpc="http://schemas.microsoft.com/office/word/2010/wordprocessingCanvas" xmlns:cx="http://schemas.microsoft.com/office/drawing/2014/chartex" xmlns:cx1="http://schemas.microsoft.com/office/drawing/2015/9/8/chartex" xmlns:cx2="http://schemas.microsoft.com/office/drawing/2015/10/21/chartex" xmlns:cx3="http://schemas.microsoft.com/office/drawing/2016/5/9/chartex" xmlns:cx4="http://schemas.microsoft.com/office/drawing/2016/5/10/chartex" xmlns:cx5="http://schemas.microsoft.com/office/drawing/2016/5/11/chartex" xmlns:cx6="http://schemas.microsoft.com/office/drawing/2016/5/12/chartex" xmlns:cx7="http://schemas.microsoft.com/office/drawing/2016/5/13/chartex" xmlns:cx8="http://schemas.microsoft.com/office/drawing/2016/5/14/chartex" xmlns:mc="http://schemas.openxmlformats.org/markup-compatibility/2006" xmlns:aink="http://schemas.microsoft.com/office/drawing/2016/ink" xmlns:am3d="http://schemas.microsoft.com/office/drawing/2017/model3d" xmlns:o="urn:schemas-microsoft-com:office:office" xmlns:oel="http://schemas.microsoft.com/office/2019/extlst" xmlns:r="http://schemas.openxmlformats.org/officeDocument/2006/relationships" xmlns:m="http://schemas.openxmlformats.org/officeDocument/2006/math" xmlns:v="urn:schemas-microsoft-com:vml" xmlns:wp14="http://schemas.microsoft.com/office/word/2010/wordprocessingDrawing" xmlns:wp="http://schemas.openxmlformats.org/drawingml/2006/wordprocessingDrawing" xmlns:w10="urn:schemas-microsoft-com:office:word" xmlns:w="http://schemas.openxmlformats.org/wordprocessingml/2006/main" xmlns:w14="http://schemas.microsoft.com/office/word/2010/wordml" xmlns:w15="http://schemas.microsoft.com/office/word/2012/wordml" xmlns:w16cex="http://schemas.microsoft.com/office/word/2018/wordml/cex" xmlns:w16cid="http://schemas.microsoft.com/office/word/2016/wordml/cid" xmlns:w16="http://schemas.microsoft.com/office/word/2018/wordml" xmlns:w16du="http://schemas.microsoft.com/office/word/2023/wordml/word16du" xmlns:w16sdtdh="http://schemas.microsoft.com/office/word/2020/wordml/sdtdatahash" xmlns:w16sdtfl="http://schemas.microsoft.com/office/word/2024/wordml/sdtformatlock" xmlns:w16se="http://schemas.microsoft.com/office/word/2015/wordml/symex" xmlns:wpg="http://schemas.microsoft.com/office/word/2010/wordprocessingGroup" xmlns:wpi="http://schemas.microsoft.com/office/word/2010/wordprocessingInk" xmlns:wne="http://schemas.microsoft.com/office/word/2006/wordml" xmlns:wps="http://schemas.microsoft.com/office/word/2010/wordprocessingShape" mc:Ignorable="w14 w15 w16se w16cid w16 w16cex w16sdtdh w16sdtfl w16du wp14">
   <w:abstractNum w:abstractNumId="0" w15:restartNumberingAfterBreak="0">
+    <w:nsid w:val="0450141D"/>
+    <w:multiLevelType w:val="multilevel"/>
+    <w:tmpl w:val="9AEA7F54"/>
+    <w:lvl w:ilvl="0">
+      <w:start w:val="1"/>
+      <w:numFmt w:val="bullet"/>
+      <w:lvlText w:val=""/>
+      <w:lvlJc w:val="left"/>
+      <w:pPr>
+        <w:tabs>
+          <w:tab w:val="num" w:pos="720"/>
+        </w:tabs>
+        <w:ind w:left="720" w:hanging="360"/>
+      </w:pPr>
+      <w:rPr>
+        <w:rFonts w:ascii="Symbol" w:hAnsi="Symbol" w:hint="default"/>
+        <w:sz w:val="20"/>
+      </w:rPr>
+    </w:lvl>
+    <w:lvl w:ilvl="1" w:tentative="1">
+      <w:start w:val="1"/>
+      <w:numFmt w:val="bullet"/>
+      <w:lvlText w:val="o"/>
+      <w:lvlJc w:val="left"/>
+      <w:pPr>
+        <w:tabs>
+          <w:tab w:val="num" w:pos="1440"/>
+        </w:tabs>
+        <w:ind w:left="1440" w:hanging="360"/>
+      </w:pPr>
+      <w:rPr>
+        <w:rFonts w:ascii="Courier New" w:hAnsi="Courier New" w:hint="default"/>
+        <w:sz w:val="20"/>
+      </w:rPr>
+    </w:lvl>
+    <w:lvl w:ilvl="2" w:tentative="1">
+      <w:start w:val="1"/>
+      <w:numFmt w:val="bullet"/>
+      <w:lvlText w:val=""/>
+      <w:lvlJc w:val="left"/>
+      <w:pPr>
+        <w:tabs>
+          <w:tab w:val="num" w:pos="2160"/>
+        </w:tabs>
+        <w:ind w:left="2160" w:hanging="360"/>
+      </w:pPr>
+      <w:rPr>
+        <w:rFonts w:ascii="Wingdings" w:hAnsi="Wingdings" w:hint="default"/>
+        <w:sz w:val="20"/>
+      </w:rPr>
+    </w:lvl>
+    <w:lvl w:ilvl="3" w:tentative="1">
+      <w:start w:val="1"/>
+      <w:numFmt w:val="bullet"/>
+      <w:lvlText w:val=""/>
+      <w:lvlJc w:val="left"/>
+      <w:pPr>
+        <w:tabs>
+          <w:tab w:val="num" w:pos="2880"/>
+        </w:tabs>
+        <w:ind w:left="2880" w:hanging="360"/>
+      </w:pPr>
+      <w:rPr>
+        <w:rFonts w:ascii="Wingdings" w:hAnsi="Wingdings" w:hint="default"/>
+        <w:sz w:val="20"/>
+      </w:rPr>
+    </w:lvl>
+    <w:lvl w:ilvl="4" w:tentative="1">
+      <w:start w:val="1"/>
+      <w:numFmt w:val="bullet"/>
+      <w:lvlText w:val=""/>
+      <w:lvlJc w:val="left"/>
+      <w:pPr>
+        <w:tabs>
+          <w:tab w:val="num" w:pos="3600"/>
+        </w:tabs>
+        <w:ind w:left="3600" w:hanging="360"/>
+      </w:pPr>
+      <w:rPr>
+        <w:rFonts w:ascii="Wingdings" w:hAnsi="Wingdings" w:hint="default"/>
+        <w:sz w:val="20"/>
+      </w:rPr>
+    </w:lvl>
+    <w:lvl w:ilvl="5" w:tentative="1">
+      <w:start w:val="1"/>
+      <w:numFmt w:val="bullet"/>
+      <w:lvlText w:val=""/>
+      <w:lvlJc w:val="left"/>
+      <w:pPr>
+        <w:tabs>
+          <w:tab w:val="num" w:pos="4320"/>
+        </w:tabs>
+        <w:ind w:left="4320" w:hanging="360"/>
+      </w:pPr>
+      <w:rPr>
+        <w:rFonts w:ascii="Wingdings" w:hAnsi="Wingdings" w:hint="default"/>
+        <w:sz w:val="20"/>
+      </w:rPr>
+    </w:lvl>
+    <w:lvl w:ilvl="6" w:tentative="1">
+      <w:start w:val="1"/>
+      <w:numFmt w:val="bullet"/>
+      <w:lvlText w:val=""/>
+      <w:lvlJc w:val="left"/>
+      <w:pPr>
+        <w:tabs>
+          <w:tab w:val="num" w:pos="5040"/>
+        </w:tabs>
+        <w:ind w:left="5040" w:hanging="360"/>
+      </w:pPr>
+      <w:rPr>
+        <w:rFonts w:ascii="Wingdings" w:hAnsi="Wingdings" w:hint="default"/>
+        <w:sz w:val="20"/>
+      </w:rPr>
+    </w:lvl>
+    <w:lvl w:ilvl="7" w:tentative="1">
+      <w:start w:val="1"/>
+      <w:numFmt w:val="bullet"/>
+      <w:lvlText w:val=""/>
+      <w:lvlJc w:val="left"/>
+      <w:pPr>
+        <w:tabs>
+          <w:tab w:val="num" w:pos="5760"/>
+        </w:tabs>
+        <w:ind w:left="5760" w:hanging="360"/>
+      </w:pPr>
+      <w:rPr>
+        <w:rFonts w:ascii="Wingdings" w:hAnsi="Wingdings" w:hint="default"/>
+        <w:sz w:val="20"/>
+      </w:rPr>
+    </w:lvl>
+    <w:lvl w:ilvl="8" w:tentative="1">
+      <w:start w:val="1"/>
+      <w:numFmt w:val="bullet"/>
+      <w:lvlText w:val=""/>
+      <w:lvlJc w:val="left"/>
+      <w:pPr>
+        <w:tabs>
+          <w:tab w:val="num" w:pos="6480"/>
+        </w:tabs>
+        <w:ind w:left="6480" w:hanging="360"/>
+      </w:pPr>
+      <w:rPr>
+        <w:rFonts w:ascii="Wingdings" w:hAnsi="Wingdings" w:hint="default"/>
+        <w:sz w:val="20"/>
+      </w:rPr>
+    </w:lvl>
+  </w:abstractNum>
+  <w:abstractNum w:abstractNumId="1" w15:restartNumberingAfterBreak="0">
+    <w:nsid w:val="09552638"/>
+    <w:multiLevelType w:val="multilevel"/>
+    <w:tmpl w:val="DCD80D58"/>
+    <w:lvl w:ilvl="0">
+      <w:start w:val="1"/>
+      <w:numFmt w:val="bullet"/>
+      <w:lvlText w:val=""/>
+      <w:lvlJc w:val="left"/>
+      <w:pPr>
+        <w:tabs>
+          <w:tab w:val="num" w:pos="720"/>
+        </w:tabs>
+        <w:ind w:left="720" w:hanging="360"/>
+      </w:pPr>
+      <w:rPr>
+        <w:rFonts w:ascii="Symbol" w:hAnsi="Symbol" w:hint="default"/>
+        <w:sz w:val="20"/>
+      </w:rPr>
+    </w:lvl>
+    <w:lvl w:ilvl="1" w:tentative="1">
+      <w:start w:val="1"/>
+      <w:numFmt w:val="bullet"/>
+      <w:lvlText w:val="o"/>
+      <w:lvlJc w:val="left"/>
+      <w:pPr>
+        <w:tabs>
+          <w:tab w:val="num" w:pos="1440"/>
+        </w:tabs>
+        <w:ind w:left="1440" w:hanging="360"/>
+      </w:pPr>
+      <w:rPr>
+        <w:rFonts w:ascii="Courier New" w:hAnsi="Courier New" w:hint="default"/>
+        <w:sz w:val="20"/>
+      </w:rPr>
+    </w:lvl>
+    <w:lvl w:ilvl="2" w:tentative="1">
+      <w:start w:val="1"/>
+      <w:numFmt w:val="bullet"/>
+      <w:lvlText w:val=""/>
+      <w:lvlJc w:val="left"/>
+      <w:pPr>
+        <w:tabs>
+          <w:tab w:val="num" w:pos="2160"/>
+        </w:tabs>
+        <w:ind w:left="2160" w:hanging="360"/>
+      </w:pPr>
+      <w:rPr>
+        <w:rFonts w:ascii="Wingdings" w:hAnsi="Wingdings" w:hint="default"/>
+        <w:sz w:val="20"/>
+      </w:rPr>
+    </w:lvl>
+    <w:lvl w:ilvl="3" w:tentative="1">
+      <w:start w:val="1"/>
+      <w:numFmt w:val="bullet"/>
+      <w:lvlText w:val=""/>
+      <w:lvlJc w:val="left"/>
+      <w:pPr>
+        <w:tabs>
+          <w:tab w:val="num" w:pos="2880"/>
+        </w:tabs>
+        <w:ind w:left="2880" w:hanging="360"/>
+      </w:pPr>
+      <w:rPr>
+        <w:rFonts w:ascii="Wingdings" w:hAnsi="Wingdings" w:hint="default"/>
+        <w:sz w:val="20"/>
+      </w:rPr>
+    </w:lvl>
+    <w:lvl w:ilvl="4" w:tentative="1">
+      <w:start w:val="1"/>
+      <w:numFmt w:val="bullet"/>
+      <w:lvlText w:val=""/>
+      <w:lvlJc w:val="left"/>
+      <w:pPr>
+        <w:tabs>
+          <w:tab w:val="num" w:pos="3600"/>
+        </w:tabs>
+        <w:ind w:left="3600" w:hanging="360"/>
+      </w:pPr>
+      <w:rPr>
+        <w:rFonts w:ascii="Wingdings" w:hAnsi="Wingdings" w:hint="default"/>
+        <w:sz w:val="20"/>
+      </w:rPr>
+    </w:lvl>
+    <w:lvl w:ilvl="5" w:tentative="1">
+      <w:start w:val="1"/>
+      <w:numFmt w:val="bullet"/>
+      <w:lvlText w:val=""/>
+      <w:lvlJc w:val="left"/>
+      <w:pPr>
+        <w:tabs>
+          <w:tab w:val="num" w:pos="4320"/>
+        </w:tabs>
+        <w:ind w:left="4320" w:hanging="360"/>
+      </w:pPr>
+      <w:rPr>
+        <w:rFonts w:ascii="Wingdings" w:hAnsi="Wingdings" w:hint="default"/>
+        <w:sz w:val="20"/>
+      </w:rPr>
+    </w:lvl>
+    <w:lvl w:ilvl="6" w:tentative="1">
+      <w:start w:val="1"/>
+      <w:numFmt w:val="bullet"/>
+      <w:lvlText w:val=""/>
+      <w:lvlJc w:val="left"/>
+      <w:pPr>
+        <w:tabs>
+          <w:tab w:val="num" w:pos="5040"/>
+        </w:tabs>
+        <w:ind w:left="5040" w:hanging="360"/>
+      </w:pPr>
+      <w:rPr>
+        <w:rFonts w:ascii="Wingdings" w:hAnsi="Wingdings" w:hint="default"/>
+        <w:sz w:val="20"/>
+      </w:rPr>
+    </w:lvl>
+    <w:lvl w:ilvl="7" w:tentative="1">
+      <w:start w:val="1"/>
+      <w:numFmt w:val="bullet"/>
+      <w:lvlText w:val=""/>
+      <w:lvlJc w:val="left"/>
+      <w:pPr>
+        <w:tabs>
+          <w:tab w:val="num" w:pos="5760"/>
+        </w:tabs>
+        <w:ind w:left="5760" w:hanging="360"/>
+      </w:pPr>
+      <w:rPr>
+        <w:rFonts w:ascii="Wingdings" w:hAnsi="Wingdings" w:hint="default"/>
+        <w:sz w:val="20"/>
+      </w:rPr>
+    </w:lvl>
+    <w:lvl w:ilvl="8" w:tentative="1">
+      <w:start w:val="1"/>
+      <w:numFmt w:val="bullet"/>
+      <w:lvlText w:val=""/>
+      <w:lvlJc w:val="left"/>
+      <w:pPr>
+        <w:tabs>
+          <w:tab w:val="num" w:pos="6480"/>
+        </w:tabs>
+        <w:ind w:left="6480" w:hanging="360"/>
+      </w:pPr>
+      <w:rPr>
+        <w:rFonts w:ascii="Wingdings" w:hAnsi="Wingdings" w:hint="default"/>
+        <w:sz w:val="20"/>
+      </w:rPr>
+    </w:lvl>
+  </w:abstractNum>
+  <w:abstractNum w:abstractNumId="2" w15:restartNumberingAfterBreak="0">
+    <w:nsid w:val="0A3E14AE"/>
+    <w:multiLevelType w:val="multilevel"/>
+    <w:tmpl w:val="08AABB30"/>
+    <w:lvl w:ilvl="0">
+      <w:start w:val="1"/>
+      <w:numFmt w:val="bullet"/>
+      <w:lvlText w:val=""/>
+      <w:lvlJc w:val="left"/>
+      <w:pPr>
+        <w:tabs>
+          <w:tab w:val="num" w:pos="720"/>
+        </w:tabs>
+        <w:ind w:left="720" w:hanging="360"/>
+      </w:pPr>
+      <w:rPr>
+        <w:rFonts w:ascii="Symbol" w:hAnsi="Symbol" w:hint="default"/>
+        <w:sz w:val="20"/>
+      </w:rPr>
+    </w:lvl>
+    <w:lvl w:ilvl="1" w:tentative="1">
+      <w:start w:val="1"/>
+      <w:numFmt w:val="bullet"/>
+      <w:lvlText w:val="o"/>
+      <w:lvlJc w:val="left"/>
+      <w:pPr>
+        <w:tabs>
+          <w:tab w:val="num" w:pos="1440"/>
+        </w:tabs>
+        <w:ind w:left="1440" w:hanging="360"/>
+      </w:pPr>
+      <w:rPr>
+        <w:rFonts w:ascii="Courier New" w:hAnsi="Courier New" w:hint="default"/>
+        <w:sz w:val="20"/>
+      </w:rPr>
+    </w:lvl>
+    <w:lvl w:ilvl="2" w:tentative="1">
+      <w:start w:val="1"/>
+      <w:numFmt w:val="bullet"/>
+      <w:lvlText w:val=""/>
+      <w:lvlJc w:val="left"/>
+      <w:pPr>
+        <w:tabs>
+          <w:tab w:val="num" w:pos="2160"/>
+        </w:tabs>
+        <w:ind w:left="2160" w:hanging="360"/>
+      </w:pPr>
+      <w:rPr>
+        <w:rFonts w:ascii="Wingdings" w:hAnsi="Wingdings" w:hint="default"/>
+        <w:sz w:val="20"/>
+      </w:rPr>
+    </w:lvl>
+    <w:lvl w:ilvl="3" w:tentative="1">
+      <w:start w:val="1"/>
+      <w:numFmt w:val="bullet"/>
+      <w:lvlText w:val=""/>
+      <w:lvlJc w:val="left"/>
+      <w:pPr>
+        <w:tabs>
+          <w:tab w:val="num" w:pos="2880"/>
+        </w:tabs>
+        <w:ind w:left="2880" w:hanging="360"/>
+      </w:pPr>
+      <w:rPr>
+        <w:rFonts w:ascii="Wingdings" w:hAnsi="Wingdings" w:hint="default"/>
+        <w:sz w:val="20"/>
+      </w:rPr>
+    </w:lvl>
+    <w:lvl w:ilvl="4" w:tentative="1">
+      <w:start w:val="1"/>
+      <w:numFmt w:val="bullet"/>
+      <w:lvlText w:val=""/>
+      <w:lvlJc w:val="left"/>
+      <w:pPr>
+        <w:tabs>
+          <w:tab w:val="num" w:pos="3600"/>
+        </w:tabs>
+        <w:ind w:left="3600" w:hanging="360"/>
+      </w:pPr>
+      <w:rPr>
+        <w:rFonts w:ascii="Wingdings" w:hAnsi="Wingdings" w:hint="default"/>
+        <w:sz w:val="20"/>
+      </w:rPr>
+    </w:lvl>
+    <w:lvl w:ilvl="5" w:tentative="1">
+      <w:start w:val="1"/>
+      <w:numFmt w:val="bullet"/>
+      <w:lvlText w:val=""/>
+      <w:lvlJc w:val="left"/>
+      <w:pPr>
+        <w:tabs>
+          <w:tab w:val="num" w:pos="4320"/>
+        </w:tabs>
+        <w:ind w:left="4320" w:hanging="360"/>
+      </w:pPr>
+      <w:rPr>
+        <w:rFonts w:ascii="Wingdings" w:hAnsi="Wingdings" w:hint="default"/>
+        <w:sz w:val="20"/>
+      </w:rPr>
+    </w:lvl>
+    <w:lvl w:ilvl="6" w:tentative="1">
+      <w:start w:val="1"/>
+      <w:numFmt w:val="bullet"/>
+      <w:lvlText w:val=""/>
+      <w:lvlJc w:val="left"/>
+      <w:pPr>
+        <w:tabs>
+          <w:tab w:val="num" w:pos="5040"/>
+        </w:tabs>
+        <w:ind w:left="5040" w:hanging="360"/>
+      </w:pPr>
+      <w:rPr>
+        <w:rFonts w:ascii="Wingdings" w:hAnsi="Wingdings" w:hint="default"/>
+        <w:sz w:val="20"/>
+      </w:rPr>
+    </w:lvl>
+    <w:lvl w:ilvl="7" w:tentative="1">
+      <w:start w:val="1"/>
+      <w:numFmt w:val="bullet"/>
+      <w:lvlText w:val=""/>
+      <w:lvlJc w:val="left"/>
+      <w:pPr>
+        <w:tabs>
+          <w:tab w:val="num" w:pos="5760"/>
+        </w:tabs>
+        <w:ind w:left="5760" w:hanging="360"/>
+      </w:pPr>
+      <w:rPr>
+        <w:rFonts w:ascii="Wingdings" w:hAnsi="Wingdings" w:hint="default"/>
+        <w:sz w:val="20"/>
+      </w:rPr>
+    </w:lvl>
+    <w:lvl w:ilvl="8" w:tentative="1">
+      <w:start w:val="1"/>
+      <w:numFmt w:val="bullet"/>
+      <w:lvlText w:val=""/>
+      <w:lvlJc w:val="left"/>
+      <w:pPr>
+        <w:tabs>
+          <w:tab w:val="num" w:pos="6480"/>
+        </w:tabs>
+        <w:ind w:left="6480" w:hanging="360"/>
+      </w:pPr>
+      <w:rPr>
+        <w:rFonts w:ascii="Wingdings" w:hAnsi="Wingdings" w:hint="default"/>
+        <w:sz w:val="20"/>
+      </w:rPr>
+    </w:lvl>
+  </w:abstractNum>
+  <w:abstractNum w:abstractNumId="3" w15:restartNumberingAfterBreak="0">
+    <w:nsid w:val="0A423A79"/>
+    <w:multiLevelType w:val="multilevel"/>
+    <w:tmpl w:val="D870E358"/>
+    <w:lvl w:ilvl="0">
+      <w:start w:val="1"/>
+      <w:numFmt w:val="bullet"/>
+      <w:lvlText w:val=""/>
+      <w:lvlJc w:val="left"/>
+      <w:pPr>
+        <w:tabs>
+          <w:tab w:val="num" w:pos="720"/>
+        </w:tabs>
+        <w:ind w:left="720" w:hanging="360"/>
+      </w:pPr>
+      <w:rPr>
+        <w:rFonts w:ascii="Symbol" w:hAnsi="Symbol" w:hint="default"/>
+        <w:sz w:val="20"/>
+      </w:rPr>
+    </w:lvl>
+    <w:lvl w:ilvl="1" w:tentative="1">
+      <w:start w:val="1"/>
+      <w:numFmt w:val="bullet"/>
+      <w:lvlText w:val="o"/>
+      <w:lvlJc w:val="left"/>
+      <w:pPr>
+        <w:tabs>
+          <w:tab w:val="num" w:pos="1440"/>
+        </w:tabs>
+        <w:ind w:left="1440" w:hanging="360"/>
+      </w:pPr>
+      <w:rPr>
+        <w:rFonts w:ascii="Courier New" w:hAnsi="Courier New" w:hint="default"/>
+        <w:sz w:val="20"/>
+      </w:rPr>
+    </w:lvl>
+    <w:lvl w:ilvl="2" w:tentative="1">
+      <w:start w:val="1"/>
+      <w:numFmt w:val="bullet"/>
+      <w:lvlText w:val=""/>
+      <w:lvlJc w:val="left"/>
+      <w:pPr>
+        <w:tabs>
+          <w:tab w:val="num" w:pos="2160"/>
+        </w:tabs>
+        <w:ind w:left="2160" w:hanging="360"/>
+      </w:pPr>
+      <w:rPr>
+        <w:rFonts w:ascii="Wingdings" w:hAnsi="Wingdings" w:hint="default"/>
+        <w:sz w:val="20"/>
+      </w:rPr>
+    </w:lvl>
+    <w:lvl w:ilvl="3" w:tentative="1">
+      <w:start w:val="1"/>
+      <w:numFmt w:val="bullet"/>
+      <w:lvlText w:val=""/>
+      <w:lvlJc w:val="left"/>
+      <w:pPr>
+        <w:tabs>
+          <w:tab w:val="num" w:pos="2880"/>
+        </w:tabs>
+        <w:ind w:left="2880" w:hanging="360"/>
+      </w:pPr>
+      <w:rPr>
+        <w:rFonts w:ascii="Wingdings" w:hAnsi="Wingdings" w:hint="default"/>
+        <w:sz w:val="20"/>
+      </w:rPr>
+    </w:lvl>
+    <w:lvl w:ilvl="4" w:tentative="1">
+      <w:start w:val="1"/>
+      <w:numFmt w:val="bullet"/>
+      <w:lvlText w:val=""/>
+      <w:lvlJc w:val="left"/>
+      <w:pPr>
+        <w:tabs>
+          <w:tab w:val="num" w:pos="3600"/>
+        </w:tabs>
+        <w:ind w:left="3600" w:hanging="360"/>
+      </w:pPr>
+      <w:rPr>
+        <w:rFonts w:ascii="Wingdings" w:hAnsi="Wingdings" w:hint="default"/>
+        <w:sz w:val="20"/>
+      </w:rPr>
+    </w:lvl>
+    <w:lvl w:ilvl="5" w:tentative="1">
+      <w:start w:val="1"/>
+      <w:numFmt w:val="bullet"/>
+      <w:lvlText w:val=""/>
+      <w:lvlJc w:val="left"/>
+      <w:pPr>
+        <w:tabs>
+          <w:tab w:val="num" w:pos="4320"/>
+        </w:tabs>
+        <w:ind w:left="4320" w:hanging="360"/>
+      </w:pPr>
+      <w:rPr>
+        <w:rFonts w:ascii="Wingdings" w:hAnsi="Wingdings" w:hint="default"/>
+        <w:sz w:val="20"/>
+      </w:rPr>
+    </w:lvl>
+    <w:lvl w:ilvl="6" w:tentative="1">
+      <w:start w:val="1"/>
+      <w:numFmt w:val="bullet"/>
+      <w:lvlText w:val=""/>
+      <w:lvlJc w:val="left"/>
+      <w:pPr>
+        <w:tabs>
+          <w:tab w:val="num" w:pos="5040"/>
+        </w:tabs>
+        <w:ind w:left="5040" w:hanging="360"/>
+      </w:pPr>
+      <w:rPr>
+        <w:rFonts w:ascii="Wingdings" w:hAnsi="Wingdings" w:hint="default"/>
+        <w:sz w:val="20"/>
+      </w:rPr>
+    </w:lvl>
+    <w:lvl w:ilvl="7" w:tentative="1">
+      <w:start w:val="1"/>
+      <w:numFmt w:val="bullet"/>
+      <w:lvlText w:val=""/>
+      <w:lvlJc w:val="left"/>
+      <w:pPr>
+        <w:tabs>
+          <w:tab w:val="num" w:pos="5760"/>
+        </w:tabs>
+        <w:ind w:left="5760" w:hanging="360"/>
+      </w:pPr>
+      <w:rPr>
+        <w:rFonts w:ascii="Wingdings" w:hAnsi="Wingdings" w:hint="default"/>
+        <w:sz w:val="20"/>
+      </w:rPr>
+    </w:lvl>
+    <w:lvl w:ilvl="8" w:tentative="1">
+      <w:start w:val="1"/>
+      <w:numFmt w:val="bullet"/>
+      <w:lvlText w:val=""/>
+      <w:lvlJc w:val="left"/>
+      <w:pPr>
+        <w:tabs>
+          <w:tab w:val="num" w:pos="6480"/>
+        </w:tabs>
+        <w:ind w:left="6480" w:hanging="360"/>
+      </w:pPr>
+      <w:rPr>
+        <w:rFonts w:ascii="Wingdings" w:hAnsi="Wingdings" w:hint="default"/>
+        <w:sz w:val="20"/>
+      </w:rPr>
+    </w:lvl>
+  </w:abstractNum>
+  <w:abstractNum w:abstractNumId="4" w15:restartNumberingAfterBreak="0">
+    <w:nsid w:val="0B6731B6"/>
+    <w:multiLevelType w:val="multilevel"/>
+    <w:tmpl w:val="D550E3AC"/>
+    <w:lvl w:ilvl="0">
+      <w:start w:val="1"/>
+      <w:numFmt w:val="bullet"/>
+      <w:lvlText w:val=""/>
+      <w:lvlJc w:val="left"/>
+      <w:pPr>
+        <w:tabs>
+          <w:tab w:val="num" w:pos="720"/>
+        </w:tabs>
+        <w:ind w:left="720" w:hanging="360"/>
+      </w:pPr>
+      <w:rPr>
+        <w:rFonts w:ascii="Symbol" w:hAnsi="Symbol" w:hint="default"/>
+        <w:sz w:val="20"/>
+      </w:rPr>
+    </w:lvl>
+    <w:lvl w:ilvl="1">
+      <w:numFmt w:val="bullet"/>
+      <w:lvlText w:val="-"/>
+      <w:lvlJc w:val="left"/>
+      <w:pPr>
+        <w:ind w:left="1440" w:hanging="360"/>
+      </w:pPr>
+      <w:rPr>
+        <w:rFonts w:ascii="Times New Roman" w:eastAsia="Times New Roman" w:hAnsi="Times New Roman" w:cs="Times New Roman" w:hint="default"/>
+      </w:rPr>
+    </w:lvl>
+    <w:lvl w:ilvl="2" w:tentative="1">
+      <w:start w:val="1"/>
+      <w:numFmt w:val="bullet"/>
+      <w:lvlText w:val=""/>
+      <w:lvlJc w:val="left"/>
+      <w:pPr>
+        <w:tabs>
+          <w:tab w:val="num" w:pos="2160"/>
+        </w:tabs>
+        <w:ind w:left="2160" w:hanging="360"/>
+      </w:pPr>
+      <w:rPr>
+        <w:rFonts w:ascii="Wingdings" w:hAnsi="Wingdings" w:hint="default"/>
+        <w:sz w:val="20"/>
+      </w:rPr>
+    </w:lvl>
+    <w:lvl w:ilvl="3" w:tentative="1">
+      <w:start w:val="1"/>
+      <w:numFmt w:val="bullet"/>
+      <w:lvlText w:val=""/>
+      <w:lvlJc w:val="left"/>
+      <w:pPr>
+        <w:tabs>
+          <w:tab w:val="num" w:pos="2880"/>
+        </w:tabs>
+        <w:ind w:left="2880" w:hanging="360"/>
+      </w:pPr>
+      <w:rPr>
+        <w:rFonts w:ascii="Wingdings" w:hAnsi="Wingdings" w:hint="default"/>
+        <w:sz w:val="20"/>
+      </w:rPr>
+    </w:lvl>
+    <w:lvl w:ilvl="4" w:tentative="1">
+      <w:start w:val="1"/>
+      <w:numFmt w:val="bullet"/>
+      <w:lvlText w:val=""/>
+      <w:lvlJc w:val="left"/>
+      <w:pPr>
+        <w:tabs>
+          <w:tab w:val="num" w:pos="3600"/>
+        </w:tabs>
+        <w:ind w:left="3600" w:hanging="360"/>
+      </w:pPr>
+      <w:rPr>
+        <w:rFonts w:ascii="Wingdings" w:hAnsi="Wingdings" w:hint="default"/>
+        <w:sz w:val="20"/>
+      </w:rPr>
+    </w:lvl>
+    <w:lvl w:ilvl="5" w:tentative="1">
+      <w:start w:val="1"/>
+      <w:numFmt w:val="bullet"/>
+      <w:lvlText w:val=""/>
+      <w:lvlJc w:val="left"/>
+      <w:pPr>
+        <w:tabs>
+          <w:tab w:val="num" w:pos="4320"/>
+        </w:tabs>
+        <w:ind w:left="4320" w:hanging="360"/>
+      </w:pPr>
+      <w:rPr>
+        <w:rFonts w:ascii="Wingdings" w:hAnsi="Wingdings" w:hint="default"/>
+        <w:sz w:val="20"/>
+      </w:rPr>
+    </w:lvl>
+    <w:lvl w:ilvl="6" w:tentative="1">
+      <w:start w:val="1"/>
+      <w:numFmt w:val="bullet"/>
+      <w:lvlText w:val=""/>
+      <w:lvlJc w:val="left"/>
+      <w:pPr>
+        <w:tabs>
+          <w:tab w:val="num" w:pos="5040"/>
+        </w:tabs>
+        <w:ind w:left="5040" w:hanging="360"/>
+      </w:pPr>
+      <w:rPr>
+        <w:rFonts w:ascii="Wingdings" w:hAnsi="Wingdings" w:hint="default"/>
+        <w:sz w:val="20"/>
+      </w:rPr>
+    </w:lvl>
+    <w:lvl w:ilvl="7" w:tentative="1">
+      <w:start w:val="1"/>
+      <w:numFmt w:val="bullet"/>
+      <w:lvlText w:val=""/>
+      <w:lvlJc w:val="left"/>
+      <w:pPr>
+        <w:tabs>
+          <w:tab w:val="num" w:pos="5760"/>
+        </w:tabs>
+        <w:ind w:left="5760" w:hanging="360"/>
+      </w:pPr>
+      <w:rPr>
+        <w:rFonts w:ascii="Wingdings" w:hAnsi="Wingdings" w:hint="default"/>
+        <w:sz w:val="20"/>
+      </w:rPr>
+    </w:lvl>
+    <w:lvl w:ilvl="8" w:tentative="1">
+      <w:start w:val="1"/>
+      <w:numFmt w:val="bullet"/>
+      <w:lvlText w:val=""/>
+      <w:lvlJc w:val="left"/>
+      <w:pPr>
+        <w:tabs>
+          <w:tab w:val="num" w:pos="6480"/>
+        </w:tabs>
+        <w:ind w:left="6480" w:hanging="360"/>
+      </w:pPr>
+      <w:rPr>
+        <w:rFonts w:ascii="Wingdings" w:hAnsi="Wingdings" w:hint="default"/>
+        <w:sz w:val="20"/>
+      </w:rPr>
+    </w:lvl>
+  </w:abstractNum>
+  <w:abstractNum w:abstractNumId="5" w15:restartNumberingAfterBreak="0">
     <w:nsid w:val="0D051EF1"/>
     <w:multiLevelType w:val="multilevel"/>
     <w:tmpl w:val="5A7A4DC6"/>
@@ -10417,7 +12448,156 @@
       </w:rPr>
     </w:lvl>
   </w:abstractNum>
-  <w:abstractNum w:abstractNumId="1" w15:restartNumberingAfterBreak="0">
+  <w:abstractNum w:abstractNumId="6" w15:restartNumberingAfterBreak="0">
+    <w:nsid w:val="0E68687F"/>
+    <w:multiLevelType w:val="multilevel"/>
+    <w:tmpl w:val="26C47A74"/>
+    <w:lvl w:ilvl="0">
+      <w:start w:val="1"/>
+      <w:numFmt w:val="bullet"/>
+      <w:lvlText w:val=""/>
+      <w:lvlJc w:val="left"/>
+      <w:pPr>
+        <w:tabs>
+          <w:tab w:val="num" w:pos="720"/>
+        </w:tabs>
+        <w:ind w:left="720" w:hanging="360"/>
+      </w:pPr>
+      <w:rPr>
+        <w:rFonts w:ascii="Symbol" w:hAnsi="Symbol" w:hint="default"/>
+        <w:sz w:val="20"/>
+      </w:rPr>
+    </w:lvl>
+    <w:lvl w:ilvl="1" w:tentative="1">
+      <w:start w:val="1"/>
+      <w:numFmt w:val="bullet"/>
+      <w:lvlText w:val="o"/>
+      <w:lvlJc w:val="left"/>
+      <w:pPr>
+        <w:tabs>
+          <w:tab w:val="num" w:pos="1440"/>
+        </w:tabs>
+        <w:ind w:left="1440" w:hanging="360"/>
+      </w:pPr>
+      <w:rPr>
+        <w:rFonts w:ascii="Courier New" w:hAnsi="Courier New" w:hint="default"/>
+        <w:sz w:val="20"/>
+      </w:rPr>
+    </w:lvl>
+    <w:lvl w:ilvl="2" w:tentative="1">
+      <w:start w:val="1"/>
+      <w:numFmt w:val="bullet"/>
+      <w:lvlText w:val=""/>
+      <w:lvlJc w:val="left"/>
+      <w:pPr>
+        <w:tabs>
+          <w:tab w:val="num" w:pos="2160"/>
+        </w:tabs>
+        <w:ind w:left="2160" w:hanging="360"/>
+      </w:pPr>
+      <w:rPr>
+        <w:rFonts w:ascii="Wingdings" w:hAnsi="Wingdings" w:hint="default"/>
+        <w:sz w:val="20"/>
+      </w:rPr>
+    </w:lvl>
+    <w:lvl w:ilvl="3" w:tentative="1">
+      <w:start w:val="1"/>
+      <w:numFmt w:val="bullet"/>
+      <w:lvlText w:val=""/>
+      <w:lvlJc w:val="left"/>
+      <w:pPr>
+        <w:tabs>
+          <w:tab w:val="num" w:pos="2880"/>
+        </w:tabs>
+        <w:ind w:left="2880" w:hanging="360"/>
+      </w:pPr>
+      <w:rPr>
+        <w:rFonts w:ascii="Wingdings" w:hAnsi="Wingdings" w:hint="default"/>
+        <w:sz w:val="20"/>
+      </w:rPr>
+    </w:lvl>
+    <w:lvl w:ilvl="4" w:tentative="1">
+      <w:start w:val="1"/>
+      <w:numFmt w:val="bullet"/>
+      <w:lvlText w:val=""/>
+      <w:lvlJc w:val="left"/>
+      <w:pPr>
+        <w:tabs>
+          <w:tab w:val="num" w:pos="3600"/>
+        </w:tabs>
+        <w:ind w:left="3600" w:hanging="360"/>
+      </w:pPr>
+      <w:rPr>
+        <w:rFonts w:ascii="Wingdings" w:hAnsi="Wingdings" w:hint="default"/>
+        <w:sz w:val="20"/>
+      </w:rPr>
+    </w:lvl>
+    <w:lvl w:ilvl="5" w:tentative="1">
+      <w:start w:val="1"/>
+      <w:numFmt w:val="bullet"/>
+      <w:lvlText w:val=""/>
+      <w:lvlJc w:val="left"/>
+      <w:pPr>
+        <w:tabs>
+          <w:tab w:val="num" w:pos="4320"/>
+        </w:tabs>
+        <w:ind w:left="4320" w:hanging="360"/>
+      </w:pPr>
+      <w:rPr>
+        <w:rFonts w:ascii="Wingdings" w:hAnsi="Wingdings" w:hint="default"/>
+        <w:sz w:val="20"/>
+      </w:rPr>
+    </w:lvl>
+    <w:lvl w:ilvl="6" w:tentative="1">
+      <w:start w:val="1"/>
+      <w:numFmt w:val="bullet"/>
+      <w:lvlText w:val=""/>
+      <w:lvlJc w:val="left"/>
+      <w:pPr>
+        <w:tabs>
+          <w:tab w:val="num" w:pos="5040"/>
+        </w:tabs>
+        <w:ind w:left="5040" w:hanging="360"/>
+      </w:pPr>
+      <w:rPr>
+        <w:rFonts w:ascii="Wingdings" w:hAnsi="Wingdings" w:hint="default"/>
+        <w:sz w:val="20"/>
+      </w:rPr>
+    </w:lvl>
+    <w:lvl w:ilvl="7" w:tentative="1">
+      <w:start w:val="1"/>
+      <w:numFmt w:val="bullet"/>
+      <w:lvlText w:val=""/>
+      <w:lvlJc w:val="left"/>
+      <w:pPr>
+        <w:tabs>
+          <w:tab w:val="num" w:pos="5760"/>
+        </w:tabs>
+        <w:ind w:left="5760" w:hanging="360"/>
+      </w:pPr>
+      <w:rPr>
+        <w:rFonts w:ascii="Wingdings" w:hAnsi="Wingdings" w:hint="default"/>
+        <w:sz w:val="20"/>
+      </w:rPr>
+    </w:lvl>
+    <w:lvl w:ilvl="8" w:tentative="1">
+      <w:start w:val="1"/>
+      <w:numFmt w:val="bullet"/>
+      <w:lvlText w:val=""/>
+      <w:lvlJc w:val="left"/>
+      <w:pPr>
+        <w:tabs>
+          <w:tab w:val="num" w:pos="6480"/>
+        </w:tabs>
+        <w:ind w:left="6480" w:hanging="360"/>
+      </w:pPr>
+      <w:rPr>
+        <w:rFonts w:ascii="Wingdings" w:hAnsi="Wingdings" w:hint="default"/>
+        <w:sz w:val="20"/>
+      </w:rPr>
+    </w:lvl>
+  </w:abstractNum>
+  <w:abstractNum w:abstractNumId="7" w15:restartNumberingAfterBreak="0">
     <w:nsid w:val="0FD76FA8"/>
     <w:multiLevelType w:val="multilevel"/>
     <w:tmpl w:val="BCEE9E40"/>
@@ -10530,7 +12710,7 @@
       </w:rPr>
     </w:lvl>
   </w:abstractNum>
-  <w:abstractNum w:abstractNumId="2" w15:restartNumberingAfterBreak="0">
+  <w:abstractNum w:abstractNumId="8" w15:restartNumberingAfterBreak="0">
     <w:nsid w:val="184A0B82"/>
     <w:multiLevelType w:val="multilevel"/>
     <w:tmpl w:val="69A4593A"/>
@@ -10643,7 +12823,305 @@
       </w:rPr>
     </w:lvl>
   </w:abstractNum>
-  <w:abstractNum w:abstractNumId="3" w15:restartNumberingAfterBreak="0">
+  <w:abstractNum w:abstractNumId="9" w15:restartNumberingAfterBreak="0">
+    <w:nsid w:val="1C5B7F8B"/>
+    <w:multiLevelType w:val="multilevel"/>
+    <w:tmpl w:val="A3EABF36"/>
+    <w:lvl w:ilvl="0">
+      <w:start w:val="1"/>
+      <w:numFmt w:val="bullet"/>
+      <w:lvlText w:val=""/>
+      <w:lvlJc w:val="left"/>
+      <w:pPr>
+        <w:tabs>
+          <w:tab w:val="num" w:pos="720"/>
+        </w:tabs>
+        <w:ind w:left="720" w:hanging="360"/>
+      </w:pPr>
+      <w:rPr>
+        <w:rFonts w:ascii="Symbol" w:hAnsi="Symbol" w:hint="default"/>
+        <w:sz w:val="20"/>
+      </w:rPr>
+    </w:lvl>
+    <w:lvl w:ilvl="1" w:tentative="1">
+      <w:start w:val="1"/>
+      <w:numFmt w:val="bullet"/>
+      <w:lvlText w:val="o"/>
+      <w:lvlJc w:val="left"/>
+      <w:pPr>
+        <w:tabs>
+          <w:tab w:val="num" w:pos="1440"/>
+        </w:tabs>
+        <w:ind w:left="1440" w:hanging="360"/>
+      </w:pPr>
+      <w:rPr>
+        <w:rFonts w:ascii="Courier New" w:hAnsi="Courier New" w:hint="default"/>
+        <w:sz w:val="20"/>
+      </w:rPr>
+    </w:lvl>
+    <w:lvl w:ilvl="2" w:tentative="1">
+      <w:start w:val="1"/>
+      <w:numFmt w:val="bullet"/>
+      <w:lvlText w:val=""/>
+      <w:lvlJc w:val="left"/>
+      <w:pPr>
+        <w:tabs>
+          <w:tab w:val="num" w:pos="2160"/>
+        </w:tabs>
+        <w:ind w:left="2160" w:hanging="360"/>
+      </w:pPr>
+      <w:rPr>
+        <w:rFonts w:ascii="Wingdings" w:hAnsi="Wingdings" w:hint="default"/>
+        <w:sz w:val="20"/>
+      </w:rPr>
+    </w:lvl>
+    <w:lvl w:ilvl="3" w:tentative="1">
+      <w:start w:val="1"/>
+      <w:numFmt w:val="bullet"/>
+      <w:lvlText w:val=""/>
+      <w:lvlJc w:val="left"/>
+      <w:pPr>
+        <w:tabs>
+          <w:tab w:val="num" w:pos="2880"/>
+        </w:tabs>
+        <w:ind w:left="2880" w:hanging="360"/>
+      </w:pPr>
+      <w:rPr>
+        <w:rFonts w:ascii="Wingdings" w:hAnsi="Wingdings" w:hint="default"/>
+        <w:sz w:val="20"/>
+      </w:rPr>
+    </w:lvl>
+    <w:lvl w:ilvl="4" w:tentative="1">
+      <w:start w:val="1"/>
+      <w:numFmt w:val="bullet"/>
+      <w:lvlText w:val=""/>
+      <w:lvlJc w:val="left"/>
+      <w:pPr>
+        <w:tabs>
+          <w:tab w:val="num" w:pos="3600"/>
+        </w:tabs>
+        <w:ind w:left="3600" w:hanging="360"/>
+      </w:pPr>
+      <w:rPr>
+        <w:rFonts w:ascii="Wingdings" w:hAnsi="Wingdings" w:hint="default"/>
+        <w:sz w:val="20"/>
+      </w:rPr>
+    </w:lvl>
+    <w:lvl w:ilvl="5" w:tentative="1">
+      <w:start w:val="1"/>
+      <w:numFmt w:val="bullet"/>
+      <w:lvlText w:val=""/>
+      <w:lvlJc w:val="left"/>
+      <w:pPr>
+        <w:tabs>
+          <w:tab w:val="num" w:pos="4320"/>
+        </w:tabs>
+        <w:ind w:left="4320" w:hanging="360"/>
+      </w:pPr>
+      <w:rPr>
+        <w:rFonts w:ascii="Wingdings" w:hAnsi="Wingdings" w:hint="default"/>
+        <w:sz w:val="20"/>
+      </w:rPr>
+    </w:lvl>
+    <w:lvl w:ilvl="6" w:tentative="1">
+      <w:start w:val="1"/>
+      <w:numFmt w:val="bullet"/>
+      <w:lvlText w:val=""/>
+      <w:lvlJc w:val="left"/>
+      <w:pPr>
+        <w:tabs>
+          <w:tab w:val="num" w:pos="5040"/>
+        </w:tabs>
+        <w:ind w:left="5040" w:hanging="360"/>
+      </w:pPr>
+      <w:rPr>
+        <w:rFonts w:ascii="Wingdings" w:hAnsi="Wingdings" w:hint="default"/>
+        <w:sz w:val="20"/>
+      </w:rPr>
+    </w:lvl>
+    <w:lvl w:ilvl="7" w:tentative="1">
+      <w:start w:val="1"/>
+      <w:numFmt w:val="bullet"/>
+      <w:lvlText w:val=""/>
+      <w:lvlJc w:val="left"/>
+      <w:pPr>
+        <w:tabs>
+          <w:tab w:val="num" w:pos="5760"/>
+        </w:tabs>
+        <w:ind w:left="5760" w:hanging="360"/>
+      </w:pPr>
+      <w:rPr>
+        <w:rFonts w:ascii="Wingdings" w:hAnsi="Wingdings" w:hint="default"/>
+        <w:sz w:val="20"/>
+      </w:rPr>
+    </w:lvl>
+    <w:lvl w:ilvl="8" w:tentative="1">
+      <w:start w:val="1"/>
+      <w:numFmt w:val="bullet"/>
+      <w:lvlText w:val=""/>
+      <w:lvlJc w:val="left"/>
+      <w:pPr>
+        <w:tabs>
+          <w:tab w:val="num" w:pos="6480"/>
+        </w:tabs>
+        <w:ind w:left="6480" w:hanging="360"/>
+      </w:pPr>
+      <w:rPr>
+        <w:rFonts w:ascii="Wingdings" w:hAnsi="Wingdings" w:hint="default"/>
+        <w:sz w:val="20"/>
+      </w:rPr>
+    </w:lvl>
+  </w:abstractNum>
+  <w:abstractNum w:abstractNumId="10" w15:restartNumberingAfterBreak="0">
+    <w:nsid w:val="1DFF6551"/>
+    <w:multiLevelType w:val="multilevel"/>
+    <w:tmpl w:val="22A22620"/>
+    <w:lvl w:ilvl="0">
+      <w:start w:val="1"/>
+      <w:numFmt w:val="bullet"/>
+      <w:lvlText w:val=""/>
+      <w:lvlJc w:val="left"/>
+      <w:pPr>
+        <w:tabs>
+          <w:tab w:val="num" w:pos="720"/>
+        </w:tabs>
+        <w:ind w:left="720" w:hanging="360"/>
+      </w:pPr>
+      <w:rPr>
+        <w:rFonts w:ascii="Symbol" w:hAnsi="Symbol" w:hint="default"/>
+        <w:sz w:val="20"/>
+      </w:rPr>
+    </w:lvl>
+    <w:lvl w:ilvl="1" w:tentative="1">
+      <w:start w:val="1"/>
+      <w:numFmt w:val="bullet"/>
+      <w:lvlText w:val="o"/>
+      <w:lvlJc w:val="left"/>
+      <w:pPr>
+        <w:tabs>
+          <w:tab w:val="num" w:pos="1440"/>
+        </w:tabs>
+        <w:ind w:left="1440" w:hanging="360"/>
+      </w:pPr>
+      <w:rPr>
+        <w:rFonts w:ascii="Courier New" w:hAnsi="Courier New" w:hint="default"/>
+        <w:sz w:val="20"/>
+      </w:rPr>
+    </w:lvl>
+    <w:lvl w:ilvl="2" w:tentative="1">
+      <w:start w:val="1"/>
+      <w:numFmt w:val="bullet"/>
+      <w:lvlText w:val=""/>
+      <w:lvlJc w:val="left"/>
+      <w:pPr>
+        <w:tabs>
+          <w:tab w:val="num" w:pos="2160"/>
+        </w:tabs>
+        <w:ind w:left="2160" w:hanging="360"/>
+      </w:pPr>
+      <w:rPr>
+        <w:rFonts w:ascii="Wingdings" w:hAnsi="Wingdings" w:hint="default"/>
+        <w:sz w:val="20"/>
+      </w:rPr>
+    </w:lvl>
+    <w:lvl w:ilvl="3" w:tentative="1">
+      <w:start w:val="1"/>
+      <w:numFmt w:val="bullet"/>
+      <w:lvlText w:val=""/>
+      <w:lvlJc w:val="left"/>
+      <w:pPr>
+        <w:tabs>
+          <w:tab w:val="num" w:pos="2880"/>
+        </w:tabs>
+        <w:ind w:left="2880" w:hanging="360"/>
+      </w:pPr>
+      <w:rPr>
+        <w:rFonts w:ascii="Wingdings" w:hAnsi="Wingdings" w:hint="default"/>
+        <w:sz w:val="20"/>
+      </w:rPr>
+    </w:lvl>
+    <w:lvl w:ilvl="4" w:tentative="1">
+      <w:start w:val="1"/>
+      <w:numFmt w:val="bullet"/>
+      <w:lvlText w:val=""/>
+      <w:lvlJc w:val="left"/>
+      <w:pPr>
+        <w:tabs>
+          <w:tab w:val="num" w:pos="3600"/>
+        </w:tabs>
+        <w:ind w:left="3600" w:hanging="360"/>
+      </w:pPr>
+      <w:rPr>
+        <w:rFonts w:ascii="Wingdings" w:hAnsi="Wingdings" w:hint="default"/>
+        <w:sz w:val="20"/>
+      </w:rPr>
+    </w:lvl>
+    <w:lvl w:ilvl="5" w:tentative="1">
+      <w:start w:val="1"/>
+      <w:numFmt w:val="bullet"/>
+      <w:lvlText w:val=""/>
+      <w:lvlJc w:val="left"/>
+      <w:pPr>
+        <w:tabs>
+          <w:tab w:val="num" w:pos="4320"/>
+        </w:tabs>
+        <w:ind w:left="4320" w:hanging="360"/>
+      </w:pPr>
+      <w:rPr>
+        <w:rFonts w:ascii="Wingdings" w:hAnsi="Wingdings" w:hint="default"/>
+        <w:sz w:val="20"/>
+      </w:rPr>
+    </w:lvl>
+    <w:lvl w:ilvl="6" w:tentative="1">
+      <w:start w:val="1"/>
+      <w:numFmt w:val="bullet"/>
+      <w:lvlText w:val=""/>
+      <w:lvlJc w:val="left"/>
+      <w:pPr>
+        <w:tabs>
+          <w:tab w:val="num" w:pos="5040"/>
+        </w:tabs>
+        <w:ind w:left="5040" w:hanging="360"/>
+      </w:pPr>
+      <w:rPr>
+        <w:rFonts w:ascii="Wingdings" w:hAnsi="Wingdings" w:hint="default"/>
+        <w:sz w:val="20"/>
+      </w:rPr>
+    </w:lvl>
+    <w:lvl w:ilvl="7" w:tentative="1">
+      <w:start w:val="1"/>
+      <w:numFmt w:val="bullet"/>
+      <w:lvlText w:val=""/>
+      <w:lvlJc w:val="left"/>
+      <w:pPr>
+        <w:tabs>
+          <w:tab w:val="num" w:pos="5760"/>
+        </w:tabs>
+        <w:ind w:left="5760" w:hanging="360"/>
+      </w:pPr>
+      <w:rPr>
+        <w:rFonts w:ascii="Wingdings" w:hAnsi="Wingdings" w:hint="default"/>
+        <w:sz w:val="20"/>
+      </w:rPr>
+    </w:lvl>
+    <w:lvl w:ilvl="8" w:tentative="1">
+      <w:start w:val="1"/>
+      <w:numFmt w:val="bullet"/>
+      <w:lvlText w:val=""/>
+      <w:lvlJc w:val="left"/>
+      <w:pPr>
+        <w:tabs>
+          <w:tab w:val="num" w:pos="6480"/>
+        </w:tabs>
+        <w:ind w:left="6480" w:hanging="360"/>
+      </w:pPr>
+      <w:rPr>
+        <w:rFonts w:ascii="Wingdings" w:hAnsi="Wingdings" w:hint="default"/>
+        <w:sz w:val="20"/>
+      </w:rPr>
+    </w:lvl>
+  </w:abstractNum>
+  <w:abstractNum w:abstractNumId="11" w15:restartNumberingAfterBreak="0">
     <w:nsid w:val="21032A6D"/>
     <w:multiLevelType w:val="multilevel"/>
     <w:tmpl w:val="8240349E"/>
@@ -10733,7 +13211,7 @@
       </w:pPr>
     </w:lvl>
   </w:abstractNum>
-  <w:abstractNum w:abstractNumId="4" w15:restartNumberingAfterBreak="0">
+  <w:abstractNum w:abstractNumId="12" w15:restartNumberingAfterBreak="0">
     <w:nsid w:val="26FC48FF"/>
     <w:multiLevelType w:val="multilevel"/>
     <w:tmpl w:val="32E83D24"/>
@@ -10846,7 +13324,305 @@
       </w:rPr>
     </w:lvl>
   </w:abstractNum>
-  <w:abstractNum w:abstractNumId="5" w15:restartNumberingAfterBreak="0">
+  <w:abstractNum w:abstractNumId="13" w15:restartNumberingAfterBreak="0">
+    <w:nsid w:val="315C5FB1"/>
+    <w:multiLevelType w:val="multilevel"/>
+    <w:tmpl w:val="AEEE4D26"/>
+    <w:lvl w:ilvl="0">
+      <w:start w:val="1"/>
+      <w:numFmt w:val="bullet"/>
+      <w:lvlText w:val=""/>
+      <w:lvlJc w:val="left"/>
+      <w:pPr>
+        <w:tabs>
+          <w:tab w:val="num" w:pos="720"/>
+        </w:tabs>
+        <w:ind w:left="720" w:hanging="360"/>
+      </w:pPr>
+      <w:rPr>
+        <w:rFonts w:ascii="Symbol" w:hAnsi="Symbol" w:hint="default"/>
+        <w:sz w:val="20"/>
+      </w:rPr>
+    </w:lvl>
+    <w:lvl w:ilvl="1" w:tentative="1">
+      <w:start w:val="1"/>
+      <w:numFmt w:val="bullet"/>
+      <w:lvlText w:val="o"/>
+      <w:lvlJc w:val="left"/>
+      <w:pPr>
+        <w:tabs>
+          <w:tab w:val="num" w:pos="1440"/>
+        </w:tabs>
+        <w:ind w:left="1440" w:hanging="360"/>
+      </w:pPr>
+      <w:rPr>
+        <w:rFonts w:ascii="Courier New" w:hAnsi="Courier New" w:hint="default"/>
+        <w:sz w:val="20"/>
+      </w:rPr>
+    </w:lvl>
+    <w:lvl w:ilvl="2" w:tentative="1">
+      <w:start w:val="1"/>
+      <w:numFmt w:val="bullet"/>
+      <w:lvlText w:val=""/>
+      <w:lvlJc w:val="left"/>
+      <w:pPr>
+        <w:tabs>
+          <w:tab w:val="num" w:pos="2160"/>
+        </w:tabs>
+        <w:ind w:left="2160" w:hanging="360"/>
+      </w:pPr>
+      <w:rPr>
+        <w:rFonts w:ascii="Wingdings" w:hAnsi="Wingdings" w:hint="default"/>
+        <w:sz w:val="20"/>
+      </w:rPr>
+    </w:lvl>
+    <w:lvl w:ilvl="3" w:tentative="1">
+      <w:start w:val="1"/>
+      <w:numFmt w:val="bullet"/>
+      <w:lvlText w:val=""/>
+      <w:lvlJc w:val="left"/>
+      <w:pPr>
+        <w:tabs>
+          <w:tab w:val="num" w:pos="2880"/>
+        </w:tabs>
+        <w:ind w:left="2880" w:hanging="360"/>
+      </w:pPr>
+      <w:rPr>
+        <w:rFonts w:ascii="Wingdings" w:hAnsi="Wingdings" w:hint="default"/>
+        <w:sz w:val="20"/>
+      </w:rPr>
+    </w:lvl>
+    <w:lvl w:ilvl="4" w:tentative="1">
+      <w:start w:val="1"/>
+      <w:numFmt w:val="bullet"/>
+      <w:lvlText w:val=""/>
+      <w:lvlJc w:val="left"/>
+      <w:pPr>
+        <w:tabs>
+          <w:tab w:val="num" w:pos="3600"/>
+        </w:tabs>
+        <w:ind w:left="3600" w:hanging="360"/>
+      </w:pPr>
+      <w:rPr>
+        <w:rFonts w:ascii="Wingdings" w:hAnsi="Wingdings" w:hint="default"/>
+        <w:sz w:val="20"/>
+      </w:rPr>
+    </w:lvl>
+    <w:lvl w:ilvl="5" w:tentative="1">
+      <w:start w:val="1"/>
+      <w:numFmt w:val="bullet"/>
+      <w:lvlText w:val=""/>
+      <w:lvlJc w:val="left"/>
+      <w:pPr>
+        <w:tabs>
+          <w:tab w:val="num" w:pos="4320"/>
+        </w:tabs>
+        <w:ind w:left="4320" w:hanging="360"/>
+      </w:pPr>
+      <w:rPr>
+        <w:rFonts w:ascii="Wingdings" w:hAnsi="Wingdings" w:hint="default"/>
+        <w:sz w:val="20"/>
+      </w:rPr>
+    </w:lvl>
+    <w:lvl w:ilvl="6" w:tentative="1">
+      <w:start w:val="1"/>
+      <w:numFmt w:val="bullet"/>
+      <w:lvlText w:val=""/>
+      <w:lvlJc w:val="left"/>
+      <w:pPr>
+        <w:tabs>
+          <w:tab w:val="num" w:pos="5040"/>
+        </w:tabs>
+        <w:ind w:left="5040" w:hanging="360"/>
+      </w:pPr>
+      <w:rPr>
+        <w:rFonts w:ascii="Wingdings" w:hAnsi="Wingdings" w:hint="default"/>
+        <w:sz w:val="20"/>
+      </w:rPr>
+    </w:lvl>
+    <w:lvl w:ilvl="7" w:tentative="1">
+      <w:start w:val="1"/>
+      <w:numFmt w:val="bullet"/>
+      <w:lvlText w:val=""/>
+      <w:lvlJc w:val="left"/>
+      <w:pPr>
+        <w:tabs>
+          <w:tab w:val="num" w:pos="5760"/>
+        </w:tabs>
+        <w:ind w:left="5760" w:hanging="360"/>
+      </w:pPr>
+      <w:rPr>
+        <w:rFonts w:ascii="Wingdings" w:hAnsi="Wingdings" w:hint="default"/>
+        <w:sz w:val="20"/>
+      </w:rPr>
+    </w:lvl>
+    <w:lvl w:ilvl="8" w:tentative="1">
+      <w:start w:val="1"/>
+      <w:numFmt w:val="bullet"/>
+      <w:lvlText w:val=""/>
+      <w:lvlJc w:val="left"/>
+      <w:pPr>
+        <w:tabs>
+          <w:tab w:val="num" w:pos="6480"/>
+        </w:tabs>
+        <w:ind w:left="6480" w:hanging="360"/>
+      </w:pPr>
+      <w:rPr>
+        <w:rFonts w:ascii="Wingdings" w:hAnsi="Wingdings" w:hint="default"/>
+        <w:sz w:val="20"/>
+      </w:rPr>
+    </w:lvl>
+  </w:abstractNum>
+  <w:abstractNum w:abstractNumId="14" w15:restartNumberingAfterBreak="0">
+    <w:nsid w:val="33B73D17"/>
+    <w:multiLevelType w:val="multilevel"/>
+    <w:tmpl w:val="32BA6FFA"/>
+    <w:lvl w:ilvl="0">
+      <w:start w:val="1"/>
+      <w:numFmt w:val="bullet"/>
+      <w:lvlText w:val="o"/>
+      <w:lvlJc w:val="left"/>
+      <w:pPr>
+        <w:tabs>
+          <w:tab w:val="num" w:pos="1080"/>
+        </w:tabs>
+        <w:ind w:left="1080" w:hanging="360"/>
+      </w:pPr>
+      <w:rPr>
+        <w:rFonts w:ascii="Courier New" w:hAnsi="Courier New" w:cs="Courier New" w:hint="default"/>
+        <w:sz w:val="20"/>
+      </w:rPr>
+    </w:lvl>
+    <w:lvl w:ilvl="1" w:tentative="1">
+      <w:start w:val="1"/>
+      <w:numFmt w:val="bullet"/>
+      <w:lvlText w:val="o"/>
+      <w:lvlJc w:val="left"/>
+      <w:pPr>
+        <w:tabs>
+          <w:tab w:val="num" w:pos="1800"/>
+        </w:tabs>
+        <w:ind w:left="1800" w:hanging="360"/>
+      </w:pPr>
+      <w:rPr>
+        <w:rFonts w:ascii="Courier New" w:hAnsi="Courier New" w:hint="default"/>
+        <w:sz w:val="20"/>
+      </w:rPr>
+    </w:lvl>
+    <w:lvl w:ilvl="2" w:tentative="1">
+      <w:start w:val="1"/>
+      <w:numFmt w:val="bullet"/>
+      <w:lvlText w:val=""/>
+      <w:lvlJc w:val="left"/>
+      <w:pPr>
+        <w:tabs>
+          <w:tab w:val="num" w:pos="2520"/>
+        </w:tabs>
+        <w:ind w:left="2520" w:hanging="360"/>
+      </w:pPr>
+      <w:rPr>
+        <w:rFonts w:ascii="Wingdings" w:hAnsi="Wingdings" w:hint="default"/>
+        <w:sz w:val="20"/>
+      </w:rPr>
+    </w:lvl>
+    <w:lvl w:ilvl="3" w:tentative="1">
+      <w:start w:val="1"/>
+      <w:numFmt w:val="bullet"/>
+      <w:lvlText w:val=""/>
+      <w:lvlJc w:val="left"/>
+      <w:pPr>
+        <w:tabs>
+          <w:tab w:val="num" w:pos="3240"/>
+        </w:tabs>
+        <w:ind w:left="3240" w:hanging="360"/>
+      </w:pPr>
+      <w:rPr>
+        <w:rFonts w:ascii="Wingdings" w:hAnsi="Wingdings" w:hint="default"/>
+        <w:sz w:val="20"/>
+      </w:rPr>
+    </w:lvl>
+    <w:lvl w:ilvl="4" w:tentative="1">
+      <w:start w:val="1"/>
+      <w:numFmt w:val="bullet"/>
+      <w:lvlText w:val=""/>
+      <w:lvlJc w:val="left"/>
+      <w:pPr>
+        <w:tabs>
+          <w:tab w:val="num" w:pos="3960"/>
+        </w:tabs>
+        <w:ind w:left="3960" w:hanging="360"/>
+      </w:pPr>
+      <w:rPr>
+        <w:rFonts w:ascii="Wingdings" w:hAnsi="Wingdings" w:hint="default"/>
+        <w:sz w:val="20"/>
+      </w:rPr>
+    </w:lvl>
+    <w:lvl w:ilvl="5" w:tentative="1">
+      <w:start w:val="1"/>
+      <w:numFmt w:val="bullet"/>
+      <w:lvlText w:val=""/>
+      <w:lvlJc w:val="left"/>
+      <w:pPr>
+        <w:tabs>
+          <w:tab w:val="num" w:pos="4680"/>
+        </w:tabs>
+        <w:ind w:left="4680" w:hanging="360"/>
+      </w:pPr>
+      <w:rPr>
+        <w:rFonts w:ascii="Wingdings" w:hAnsi="Wingdings" w:hint="default"/>
+        <w:sz w:val="20"/>
+      </w:rPr>
+    </w:lvl>
+    <w:lvl w:ilvl="6" w:tentative="1">
+      <w:start w:val="1"/>
+      <w:numFmt w:val="bullet"/>
+      <w:lvlText w:val=""/>
+      <w:lvlJc w:val="left"/>
+      <w:pPr>
+        <w:tabs>
+          <w:tab w:val="num" w:pos="5400"/>
+        </w:tabs>
+        <w:ind w:left="5400" w:hanging="360"/>
+      </w:pPr>
+      <w:rPr>
+        <w:rFonts w:ascii="Wingdings" w:hAnsi="Wingdings" w:hint="default"/>
+        <w:sz w:val="20"/>
+      </w:rPr>
+    </w:lvl>
+    <w:lvl w:ilvl="7" w:tentative="1">
+      <w:start w:val="1"/>
+      <w:numFmt w:val="bullet"/>
+      <w:lvlText w:val=""/>
+      <w:lvlJc w:val="left"/>
+      <w:pPr>
+        <w:tabs>
+          <w:tab w:val="num" w:pos="6120"/>
+        </w:tabs>
+        <w:ind w:left="6120" w:hanging="360"/>
+      </w:pPr>
+      <w:rPr>
+        <w:rFonts w:ascii="Wingdings" w:hAnsi="Wingdings" w:hint="default"/>
+        <w:sz w:val="20"/>
+      </w:rPr>
+    </w:lvl>
+    <w:lvl w:ilvl="8" w:tentative="1">
+      <w:start w:val="1"/>
+      <w:numFmt w:val="bullet"/>
+      <w:lvlText w:val=""/>
+      <w:lvlJc w:val="left"/>
+      <w:pPr>
+        <w:tabs>
+          <w:tab w:val="num" w:pos="6840"/>
+        </w:tabs>
+        <w:ind w:left="6840" w:hanging="360"/>
+      </w:pPr>
+      <w:rPr>
+        <w:rFonts w:ascii="Wingdings" w:hAnsi="Wingdings" w:hint="default"/>
+        <w:sz w:val="20"/>
+      </w:rPr>
+    </w:lvl>
+  </w:abstractNum>
+  <w:abstractNum w:abstractNumId="15" w15:restartNumberingAfterBreak="0">
     <w:nsid w:val="35C33E50"/>
     <w:multiLevelType w:val="multilevel"/>
     <w:tmpl w:val="7AD82018"/>
@@ -10959,7 +13735,7 @@
       </w:rPr>
     </w:lvl>
   </w:abstractNum>
-  <w:abstractNum w:abstractNumId="6" w15:restartNumberingAfterBreak="0">
+  <w:abstractNum w:abstractNumId="16" w15:restartNumberingAfterBreak="0">
     <w:nsid w:val="3B045457"/>
     <w:multiLevelType w:val="multilevel"/>
     <w:tmpl w:val="8CAE9910"/>
@@ -11072,7 +13848,305 @@
       </w:rPr>
     </w:lvl>
   </w:abstractNum>
-  <w:abstractNum w:abstractNumId="7" w15:restartNumberingAfterBreak="0">
+  <w:abstractNum w:abstractNumId="17" w15:restartNumberingAfterBreak="0">
+    <w:nsid w:val="3E5C7E95"/>
+    <w:multiLevelType w:val="multilevel"/>
+    <w:tmpl w:val="FA3C588C"/>
+    <w:lvl w:ilvl="0">
+      <w:start w:val="1"/>
+      <w:numFmt w:val="bullet"/>
+      <w:lvlText w:val=""/>
+      <w:lvlJc w:val="left"/>
+      <w:pPr>
+        <w:tabs>
+          <w:tab w:val="num" w:pos="720"/>
+        </w:tabs>
+        <w:ind w:left="720" w:hanging="360"/>
+      </w:pPr>
+      <w:rPr>
+        <w:rFonts w:ascii="Symbol" w:hAnsi="Symbol" w:hint="default"/>
+        <w:sz w:val="20"/>
+      </w:rPr>
+    </w:lvl>
+    <w:lvl w:ilvl="1" w:tentative="1">
+      <w:start w:val="1"/>
+      <w:numFmt w:val="bullet"/>
+      <w:lvlText w:val="o"/>
+      <w:lvlJc w:val="left"/>
+      <w:pPr>
+        <w:tabs>
+          <w:tab w:val="num" w:pos="1440"/>
+        </w:tabs>
+        <w:ind w:left="1440" w:hanging="360"/>
+      </w:pPr>
+      <w:rPr>
+        <w:rFonts w:ascii="Courier New" w:hAnsi="Courier New" w:hint="default"/>
+        <w:sz w:val="20"/>
+      </w:rPr>
+    </w:lvl>
+    <w:lvl w:ilvl="2" w:tentative="1">
+      <w:start w:val="1"/>
+      <w:numFmt w:val="bullet"/>
+      <w:lvlText w:val=""/>
+      <w:lvlJc w:val="left"/>
+      <w:pPr>
+        <w:tabs>
+          <w:tab w:val="num" w:pos="2160"/>
+        </w:tabs>
+        <w:ind w:left="2160" w:hanging="360"/>
+      </w:pPr>
+      <w:rPr>
+        <w:rFonts w:ascii="Wingdings" w:hAnsi="Wingdings" w:hint="default"/>
+        <w:sz w:val="20"/>
+      </w:rPr>
+    </w:lvl>
+    <w:lvl w:ilvl="3" w:tentative="1">
+      <w:start w:val="1"/>
+      <w:numFmt w:val="bullet"/>
+      <w:lvlText w:val=""/>
+      <w:lvlJc w:val="left"/>
+      <w:pPr>
+        <w:tabs>
+          <w:tab w:val="num" w:pos="2880"/>
+        </w:tabs>
+        <w:ind w:left="2880" w:hanging="360"/>
+      </w:pPr>
+      <w:rPr>
+        <w:rFonts w:ascii="Wingdings" w:hAnsi="Wingdings" w:hint="default"/>
+        <w:sz w:val="20"/>
+      </w:rPr>
+    </w:lvl>
+    <w:lvl w:ilvl="4" w:tentative="1">
+      <w:start w:val="1"/>
+      <w:numFmt w:val="bullet"/>
+      <w:lvlText w:val=""/>
+      <w:lvlJc w:val="left"/>
+      <w:pPr>
+        <w:tabs>
+          <w:tab w:val="num" w:pos="3600"/>
+        </w:tabs>
+        <w:ind w:left="3600" w:hanging="360"/>
+      </w:pPr>
+      <w:rPr>
+        <w:rFonts w:ascii="Wingdings" w:hAnsi="Wingdings" w:hint="default"/>
+        <w:sz w:val="20"/>
+      </w:rPr>
+    </w:lvl>
+    <w:lvl w:ilvl="5" w:tentative="1">
+      <w:start w:val="1"/>
+      <w:numFmt w:val="bullet"/>
+      <w:lvlText w:val=""/>
+      <w:lvlJc w:val="left"/>
+      <w:pPr>
+        <w:tabs>
+          <w:tab w:val="num" w:pos="4320"/>
+        </w:tabs>
+        <w:ind w:left="4320" w:hanging="360"/>
+      </w:pPr>
+      <w:rPr>
+        <w:rFonts w:ascii="Wingdings" w:hAnsi="Wingdings" w:hint="default"/>
+        <w:sz w:val="20"/>
+      </w:rPr>
+    </w:lvl>
+    <w:lvl w:ilvl="6" w:tentative="1">
+      <w:start w:val="1"/>
+      <w:numFmt w:val="bullet"/>
+      <w:lvlText w:val=""/>
+      <w:lvlJc w:val="left"/>
+      <w:pPr>
+        <w:tabs>
+          <w:tab w:val="num" w:pos="5040"/>
+        </w:tabs>
+        <w:ind w:left="5040" w:hanging="360"/>
+      </w:pPr>
+      <w:rPr>
+        <w:rFonts w:ascii="Wingdings" w:hAnsi="Wingdings" w:hint="default"/>
+        <w:sz w:val="20"/>
+      </w:rPr>
+    </w:lvl>
+    <w:lvl w:ilvl="7" w:tentative="1">
+      <w:start w:val="1"/>
+      <w:numFmt w:val="bullet"/>
+      <w:lvlText w:val=""/>
+      <w:lvlJc w:val="left"/>
+      <w:pPr>
+        <w:tabs>
+          <w:tab w:val="num" w:pos="5760"/>
+        </w:tabs>
+        <w:ind w:left="5760" w:hanging="360"/>
+      </w:pPr>
+      <w:rPr>
+        <w:rFonts w:ascii="Wingdings" w:hAnsi="Wingdings" w:hint="default"/>
+        <w:sz w:val="20"/>
+      </w:rPr>
+    </w:lvl>
+    <w:lvl w:ilvl="8" w:tentative="1">
+      <w:start w:val="1"/>
+      <w:numFmt w:val="bullet"/>
+      <w:lvlText w:val=""/>
+      <w:lvlJc w:val="left"/>
+      <w:pPr>
+        <w:tabs>
+          <w:tab w:val="num" w:pos="6480"/>
+        </w:tabs>
+        <w:ind w:left="6480" w:hanging="360"/>
+      </w:pPr>
+      <w:rPr>
+        <w:rFonts w:ascii="Wingdings" w:hAnsi="Wingdings" w:hint="default"/>
+        <w:sz w:val="20"/>
+      </w:rPr>
+    </w:lvl>
+  </w:abstractNum>
+  <w:abstractNum w:abstractNumId="18" w15:restartNumberingAfterBreak="0">
+    <w:nsid w:val="3F904012"/>
+    <w:multiLevelType w:val="multilevel"/>
+    <w:tmpl w:val="7CA8C92E"/>
+    <w:lvl w:ilvl="0">
+      <w:start w:val="1"/>
+      <w:numFmt w:val="bullet"/>
+      <w:lvlText w:val=""/>
+      <w:lvlJc w:val="left"/>
+      <w:pPr>
+        <w:tabs>
+          <w:tab w:val="num" w:pos="720"/>
+        </w:tabs>
+        <w:ind w:left="720" w:hanging="360"/>
+      </w:pPr>
+      <w:rPr>
+        <w:rFonts w:ascii="Symbol" w:hAnsi="Symbol" w:hint="default"/>
+        <w:sz w:val="20"/>
+      </w:rPr>
+    </w:lvl>
+    <w:lvl w:ilvl="1" w:tentative="1">
+      <w:start w:val="1"/>
+      <w:numFmt w:val="bullet"/>
+      <w:lvlText w:val="o"/>
+      <w:lvlJc w:val="left"/>
+      <w:pPr>
+        <w:tabs>
+          <w:tab w:val="num" w:pos="1440"/>
+        </w:tabs>
+        <w:ind w:left="1440" w:hanging="360"/>
+      </w:pPr>
+      <w:rPr>
+        <w:rFonts w:ascii="Courier New" w:hAnsi="Courier New" w:hint="default"/>
+        <w:sz w:val="20"/>
+      </w:rPr>
+    </w:lvl>
+    <w:lvl w:ilvl="2" w:tentative="1">
+      <w:start w:val="1"/>
+      <w:numFmt w:val="bullet"/>
+      <w:lvlText w:val=""/>
+      <w:lvlJc w:val="left"/>
+      <w:pPr>
+        <w:tabs>
+          <w:tab w:val="num" w:pos="2160"/>
+        </w:tabs>
+        <w:ind w:left="2160" w:hanging="360"/>
+      </w:pPr>
+      <w:rPr>
+        <w:rFonts w:ascii="Wingdings" w:hAnsi="Wingdings" w:hint="default"/>
+        <w:sz w:val="20"/>
+      </w:rPr>
+    </w:lvl>
+    <w:lvl w:ilvl="3" w:tentative="1">
+      <w:start w:val="1"/>
+      <w:numFmt w:val="bullet"/>
+      <w:lvlText w:val=""/>
+      <w:lvlJc w:val="left"/>
+      <w:pPr>
+        <w:tabs>
+          <w:tab w:val="num" w:pos="2880"/>
+        </w:tabs>
+        <w:ind w:left="2880" w:hanging="360"/>
+      </w:pPr>
+      <w:rPr>
+        <w:rFonts w:ascii="Wingdings" w:hAnsi="Wingdings" w:hint="default"/>
+        <w:sz w:val="20"/>
+      </w:rPr>
+    </w:lvl>
+    <w:lvl w:ilvl="4" w:tentative="1">
+      <w:start w:val="1"/>
+      <w:numFmt w:val="bullet"/>
+      <w:lvlText w:val=""/>
+      <w:lvlJc w:val="left"/>
+      <w:pPr>
+        <w:tabs>
+          <w:tab w:val="num" w:pos="3600"/>
+        </w:tabs>
+        <w:ind w:left="3600" w:hanging="360"/>
+      </w:pPr>
+      <w:rPr>
+        <w:rFonts w:ascii="Wingdings" w:hAnsi="Wingdings" w:hint="default"/>
+        <w:sz w:val="20"/>
+      </w:rPr>
+    </w:lvl>
+    <w:lvl w:ilvl="5" w:tentative="1">
+      <w:start w:val="1"/>
+      <w:numFmt w:val="bullet"/>
+      <w:lvlText w:val=""/>
+      <w:lvlJc w:val="left"/>
+      <w:pPr>
+        <w:tabs>
+          <w:tab w:val="num" w:pos="4320"/>
+        </w:tabs>
+        <w:ind w:left="4320" w:hanging="360"/>
+      </w:pPr>
+      <w:rPr>
+        <w:rFonts w:ascii="Wingdings" w:hAnsi="Wingdings" w:hint="default"/>
+        <w:sz w:val="20"/>
+      </w:rPr>
+    </w:lvl>
+    <w:lvl w:ilvl="6" w:tentative="1">
+      <w:start w:val="1"/>
+      <w:numFmt w:val="bullet"/>
+      <w:lvlText w:val=""/>
+      <w:lvlJc w:val="left"/>
+      <w:pPr>
+        <w:tabs>
+          <w:tab w:val="num" w:pos="5040"/>
+        </w:tabs>
+        <w:ind w:left="5040" w:hanging="360"/>
+      </w:pPr>
+      <w:rPr>
+        <w:rFonts w:ascii="Wingdings" w:hAnsi="Wingdings" w:hint="default"/>
+        <w:sz w:val="20"/>
+      </w:rPr>
+    </w:lvl>
+    <w:lvl w:ilvl="7" w:tentative="1">
+      <w:start w:val="1"/>
+      <w:numFmt w:val="bullet"/>
+      <w:lvlText w:val=""/>
+      <w:lvlJc w:val="left"/>
+      <w:pPr>
+        <w:tabs>
+          <w:tab w:val="num" w:pos="5760"/>
+        </w:tabs>
+        <w:ind w:left="5760" w:hanging="360"/>
+      </w:pPr>
+      <w:rPr>
+        <w:rFonts w:ascii="Wingdings" w:hAnsi="Wingdings" w:hint="default"/>
+        <w:sz w:val="20"/>
+      </w:rPr>
+    </w:lvl>
+    <w:lvl w:ilvl="8" w:tentative="1">
+      <w:start w:val="1"/>
+      <w:numFmt w:val="bullet"/>
+      <w:lvlText w:val=""/>
+      <w:lvlJc w:val="left"/>
+      <w:pPr>
+        <w:tabs>
+          <w:tab w:val="num" w:pos="6480"/>
+        </w:tabs>
+        <w:ind w:left="6480" w:hanging="360"/>
+      </w:pPr>
+      <w:rPr>
+        <w:rFonts w:ascii="Wingdings" w:hAnsi="Wingdings" w:hint="default"/>
+        <w:sz w:val="20"/>
+      </w:rPr>
+    </w:lvl>
+  </w:abstractNum>
+  <w:abstractNum w:abstractNumId="19" w15:restartNumberingAfterBreak="0">
     <w:nsid w:val="414F4533"/>
     <w:multiLevelType w:val="multilevel"/>
     <w:tmpl w:val="D51ABD2E"/>
@@ -11185,7 +14259,603 @@
       </w:rPr>
     </w:lvl>
   </w:abstractNum>
-  <w:abstractNum w:abstractNumId="8" w15:restartNumberingAfterBreak="0">
+  <w:abstractNum w:abstractNumId="20" w15:restartNumberingAfterBreak="0">
+    <w:nsid w:val="4B356576"/>
+    <w:multiLevelType w:val="multilevel"/>
+    <w:tmpl w:val="7EE6CB18"/>
+    <w:lvl w:ilvl="0">
+      <w:start w:val="1"/>
+      <w:numFmt w:val="bullet"/>
+      <w:lvlText w:val=""/>
+      <w:lvlJc w:val="left"/>
+      <w:pPr>
+        <w:tabs>
+          <w:tab w:val="num" w:pos="720"/>
+        </w:tabs>
+        <w:ind w:left="720" w:hanging="360"/>
+      </w:pPr>
+      <w:rPr>
+        <w:rFonts w:ascii="Symbol" w:hAnsi="Symbol" w:hint="default"/>
+        <w:sz w:val="20"/>
+      </w:rPr>
+    </w:lvl>
+    <w:lvl w:ilvl="1" w:tentative="1">
+      <w:start w:val="1"/>
+      <w:numFmt w:val="bullet"/>
+      <w:lvlText w:val="o"/>
+      <w:lvlJc w:val="left"/>
+      <w:pPr>
+        <w:tabs>
+          <w:tab w:val="num" w:pos="1440"/>
+        </w:tabs>
+        <w:ind w:left="1440" w:hanging="360"/>
+      </w:pPr>
+      <w:rPr>
+        <w:rFonts w:ascii="Courier New" w:hAnsi="Courier New" w:hint="default"/>
+        <w:sz w:val="20"/>
+      </w:rPr>
+    </w:lvl>
+    <w:lvl w:ilvl="2" w:tentative="1">
+      <w:start w:val="1"/>
+      <w:numFmt w:val="bullet"/>
+      <w:lvlText w:val=""/>
+      <w:lvlJc w:val="left"/>
+      <w:pPr>
+        <w:tabs>
+          <w:tab w:val="num" w:pos="2160"/>
+        </w:tabs>
+        <w:ind w:left="2160" w:hanging="360"/>
+      </w:pPr>
+      <w:rPr>
+        <w:rFonts w:ascii="Wingdings" w:hAnsi="Wingdings" w:hint="default"/>
+        <w:sz w:val="20"/>
+      </w:rPr>
+    </w:lvl>
+    <w:lvl w:ilvl="3" w:tentative="1">
+      <w:start w:val="1"/>
+      <w:numFmt w:val="bullet"/>
+      <w:lvlText w:val=""/>
+      <w:lvlJc w:val="left"/>
+      <w:pPr>
+        <w:tabs>
+          <w:tab w:val="num" w:pos="2880"/>
+        </w:tabs>
+        <w:ind w:left="2880" w:hanging="360"/>
+      </w:pPr>
+      <w:rPr>
+        <w:rFonts w:ascii="Wingdings" w:hAnsi="Wingdings" w:hint="default"/>
+        <w:sz w:val="20"/>
+      </w:rPr>
+    </w:lvl>
+    <w:lvl w:ilvl="4" w:tentative="1">
+      <w:start w:val="1"/>
+      <w:numFmt w:val="bullet"/>
+      <w:lvlText w:val=""/>
+      <w:lvlJc w:val="left"/>
+      <w:pPr>
+        <w:tabs>
+          <w:tab w:val="num" w:pos="3600"/>
+        </w:tabs>
+        <w:ind w:left="3600" w:hanging="360"/>
+      </w:pPr>
+      <w:rPr>
+        <w:rFonts w:ascii="Wingdings" w:hAnsi="Wingdings" w:hint="default"/>
+        <w:sz w:val="20"/>
+      </w:rPr>
+    </w:lvl>
+    <w:lvl w:ilvl="5" w:tentative="1">
+      <w:start w:val="1"/>
+      <w:numFmt w:val="bullet"/>
+      <w:lvlText w:val=""/>
+      <w:lvlJc w:val="left"/>
+      <w:pPr>
+        <w:tabs>
+          <w:tab w:val="num" w:pos="4320"/>
+        </w:tabs>
+        <w:ind w:left="4320" w:hanging="360"/>
+      </w:pPr>
+      <w:rPr>
+        <w:rFonts w:ascii="Wingdings" w:hAnsi="Wingdings" w:hint="default"/>
+        <w:sz w:val="20"/>
+      </w:rPr>
+    </w:lvl>
+    <w:lvl w:ilvl="6" w:tentative="1">
+      <w:start w:val="1"/>
+      <w:numFmt w:val="bullet"/>
+      <w:lvlText w:val=""/>
+      <w:lvlJc w:val="left"/>
+      <w:pPr>
+        <w:tabs>
+          <w:tab w:val="num" w:pos="5040"/>
+        </w:tabs>
+        <w:ind w:left="5040" w:hanging="360"/>
+      </w:pPr>
+      <w:rPr>
+        <w:rFonts w:ascii="Wingdings" w:hAnsi="Wingdings" w:hint="default"/>
+        <w:sz w:val="20"/>
+      </w:rPr>
+    </w:lvl>
+    <w:lvl w:ilvl="7" w:tentative="1">
+      <w:start w:val="1"/>
+      <w:numFmt w:val="bullet"/>
+      <w:lvlText w:val=""/>
+      <w:lvlJc w:val="left"/>
+      <w:pPr>
+        <w:tabs>
+          <w:tab w:val="num" w:pos="5760"/>
+        </w:tabs>
+        <w:ind w:left="5760" w:hanging="360"/>
+      </w:pPr>
+      <w:rPr>
+        <w:rFonts w:ascii="Wingdings" w:hAnsi="Wingdings" w:hint="default"/>
+        <w:sz w:val="20"/>
+      </w:rPr>
+    </w:lvl>
+    <w:lvl w:ilvl="8" w:tentative="1">
+      <w:start w:val="1"/>
+      <w:numFmt w:val="bullet"/>
+      <w:lvlText w:val=""/>
+      <w:lvlJc w:val="left"/>
+      <w:pPr>
+        <w:tabs>
+          <w:tab w:val="num" w:pos="6480"/>
+        </w:tabs>
+        <w:ind w:left="6480" w:hanging="360"/>
+      </w:pPr>
+      <w:rPr>
+        <w:rFonts w:ascii="Wingdings" w:hAnsi="Wingdings" w:hint="default"/>
+        <w:sz w:val="20"/>
+      </w:rPr>
+    </w:lvl>
+  </w:abstractNum>
+  <w:abstractNum w:abstractNumId="21" w15:restartNumberingAfterBreak="0">
+    <w:nsid w:val="595A1F06"/>
+    <w:multiLevelType w:val="multilevel"/>
+    <w:tmpl w:val="D91C8AF8"/>
+    <w:lvl w:ilvl="0">
+      <w:start w:val="1"/>
+      <w:numFmt w:val="bullet"/>
+      <w:lvlText w:val=""/>
+      <w:lvlJc w:val="left"/>
+      <w:pPr>
+        <w:tabs>
+          <w:tab w:val="num" w:pos="720"/>
+        </w:tabs>
+        <w:ind w:left="720" w:hanging="360"/>
+      </w:pPr>
+      <w:rPr>
+        <w:rFonts w:ascii="Symbol" w:hAnsi="Symbol" w:hint="default"/>
+        <w:sz w:val="20"/>
+      </w:rPr>
+    </w:lvl>
+    <w:lvl w:ilvl="1" w:tentative="1">
+      <w:start w:val="1"/>
+      <w:numFmt w:val="bullet"/>
+      <w:lvlText w:val="o"/>
+      <w:lvlJc w:val="left"/>
+      <w:pPr>
+        <w:tabs>
+          <w:tab w:val="num" w:pos="1440"/>
+        </w:tabs>
+        <w:ind w:left="1440" w:hanging="360"/>
+      </w:pPr>
+      <w:rPr>
+        <w:rFonts w:ascii="Courier New" w:hAnsi="Courier New" w:hint="default"/>
+        <w:sz w:val="20"/>
+      </w:rPr>
+    </w:lvl>
+    <w:lvl w:ilvl="2" w:tentative="1">
+      <w:start w:val="1"/>
+      <w:numFmt w:val="bullet"/>
+      <w:lvlText w:val=""/>
+      <w:lvlJc w:val="left"/>
+      <w:pPr>
+        <w:tabs>
+          <w:tab w:val="num" w:pos="2160"/>
+        </w:tabs>
+        <w:ind w:left="2160" w:hanging="360"/>
+      </w:pPr>
+      <w:rPr>
+        <w:rFonts w:ascii="Wingdings" w:hAnsi="Wingdings" w:hint="default"/>
+        <w:sz w:val="20"/>
+      </w:rPr>
+    </w:lvl>
+    <w:lvl w:ilvl="3" w:tentative="1">
+      <w:start w:val="1"/>
+      <w:numFmt w:val="bullet"/>
+      <w:lvlText w:val=""/>
+      <w:lvlJc w:val="left"/>
+      <w:pPr>
+        <w:tabs>
+          <w:tab w:val="num" w:pos="2880"/>
+        </w:tabs>
+        <w:ind w:left="2880" w:hanging="360"/>
+      </w:pPr>
+      <w:rPr>
+        <w:rFonts w:ascii="Wingdings" w:hAnsi="Wingdings" w:hint="default"/>
+        <w:sz w:val="20"/>
+      </w:rPr>
+    </w:lvl>
+    <w:lvl w:ilvl="4" w:tentative="1">
+      <w:start w:val="1"/>
+      <w:numFmt w:val="bullet"/>
+      <w:lvlText w:val=""/>
+      <w:lvlJc w:val="left"/>
+      <w:pPr>
+        <w:tabs>
+          <w:tab w:val="num" w:pos="3600"/>
+        </w:tabs>
+        <w:ind w:left="3600" w:hanging="360"/>
+      </w:pPr>
+      <w:rPr>
+        <w:rFonts w:ascii="Wingdings" w:hAnsi="Wingdings" w:hint="default"/>
+        <w:sz w:val="20"/>
+      </w:rPr>
+    </w:lvl>
+    <w:lvl w:ilvl="5" w:tentative="1">
+      <w:start w:val="1"/>
+      <w:numFmt w:val="bullet"/>
+      <w:lvlText w:val=""/>
+      <w:lvlJc w:val="left"/>
+      <w:pPr>
+        <w:tabs>
+          <w:tab w:val="num" w:pos="4320"/>
+        </w:tabs>
+        <w:ind w:left="4320" w:hanging="360"/>
+      </w:pPr>
+      <w:rPr>
+        <w:rFonts w:ascii="Wingdings" w:hAnsi="Wingdings" w:hint="default"/>
+        <w:sz w:val="20"/>
+      </w:rPr>
+    </w:lvl>
+    <w:lvl w:ilvl="6" w:tentative="1">
+      <w:start w:val="1"/>
+      <w:numFmt w:val="bullet"/>
+      <w:lvlText w:val=""/>
+      <w:lvlJc w:val="left"/>
+      <w:pPr>
+        <w:tabs>
+          <w:tab w:val="num" w:pos="5040"/>
+        </w:tabs>
+        <w:ind w:left="5040" w:hanging="360"/>
+      </w:pPr>
+      <w:rPr>
+        <w:rFonts w:ascii="Wingdings" w:hAnsi="Wingdings" w:hint="default"/>
+        <w:sz w:val="20"/>
+      </w:rPr>
+    </w:lvl>
+    <w:lvl w:ilvl="7" w:tentative="1">
+      <w:start w:val="1"/>
+      <w:numFmt w:val="bullet"/>
+      <w:lvlText w:val=""/>
+      <w:lvlJc w:val="left"/>
+      <w:pPr>
+        <w:tabs>
+          <w:tab w:val="num" w:pos="5760"/>
+        </w:tabs>
+        <w:ind w:left="5760" w:hanging="360"/>
+      </w:pPr>
+      <w:rPr>
+        <w:rFonts w:ascii="Wingdings" w:hAnsi="Wingdings" w:hint="default"/>
+        <w:sz w:val="20"/>
+      </w:rPr>
+    </w:lvl>
+    <w:lvl w:ilvl="8" w:tentative="1">
+      <w:start w:val="1"/>
+      <w:numFmt w:val="bullet"/>
+      <w:lvlText w:val=""/>
+      <w:lvlJc w:val="left"/>
+      <w:pPr>
+        <w:tabs>
+          <w:tab w:val="num" w:pos="6480"/>
+        </w:tabs>
+        <w:ind w:left="6480" w:hanging="360"/>
+      </w:pPr>
+      <w:rPr>
+        <w:rFonts w:ascii="Wingdings" w:hAnsi="Wingdings" w:hint="default"/>
+        <w:sz w:val="20"/>
+      </w:rPr>
+    </w:lvl>
+  </w:abstractNum>
+  <w:abstractNum w:abstractNumId="22" w15:restartNumberingAfterBreak="0">
+    <w:nsid w:val="5AC20021"/>
+    <w:multiLevelType w:val="multilevel"/>
+    <w:tmpl w:val="48180D82"/>
+    <w:lvl w:ilvl="0">
+      <w:start w:val="1"/>
+      <w:numFmt w:val="bullet"/>
+      <w:lvlText w:val=""/>
+      <w:lvlJc w:val="left"/>
+      <w:pPr>
+        <w:tabs>
+          <w:tab w:val="num" w:pos="720"/>
+        </w:tabs>
+        <w:ind w:left="720" w:hanging="360"/>
+      </w:pPr>
+      <w:rPr>
+        <w:rFonts w:ascii="Symbol" w:hAnsi="Symbol" w:hint="default"/>
+        <w:sz w:val="20"/>
+      </w:rPr>
+    </w:lvl>
+    <w:lvl w:ilvl="1" w:tentative="1">
+      <w:start w:val="1"/>
+      <w:numFmt w:val="bullet"/>
+      <w:lvlText w:val="o"/>
+      <w:lvlJc w:val="left"/>
+      <w:pPr>
+        <w:tabs>
+          <w:tab w:val="num" w:pos="1440"/>
+        </w:tabs>
+        <w:ind w:left="1440" w:hanging="360"/>
+      </w:pPr>
+      <w:rPr>
+        <w:rFonts w:ascii="Courier New" w:hAnsi="Courier New" w:hint="default"/>
+        <w:sz w:val="20"/>
+      </w:rPr>
+    </w:lvl>
+    <w:lvl w:ilvl="2" w:tentative="1">
+      <w:start w:val="1"/>
+      <w:numFmt w:val="bullet"/>
+      <w:lvlText w:val=""/>
+      <w:lvlJc w:val="left"/>
+      <w:pPr>
+        <w:tabs>
+          <w:tab w:val="num" w:pos="2160"/>
+        </w:tabs>
+        <w:ind w:left="2160" w:hanging="360"/>
+      </w:pPr>
+      <w:rPr>
+        <w:rFonts w:ascii="Wingdings" w:hAnsi="Wingdings" w:hint="default"/>
+        <w:sz w:val="20"/>
+      </w:rPr>
+    </w:lvl>
+    <w:lvl w:ilvl="3" w:tentative="1">
+      <w:start w:val="1"/>
+      <w:numFmt w:val="bullet"/>
+      <w:lvlText w:val=""/>
+      <w:lvlJc w:val="left"/>
+      <w:pPr>
+        <w:tabs>
+          <w:tab w:val="num" w:pos="2880"/>
+        </w:tabs>
+        <w:ind w:left="2880" w:hanging="360"/>
+      </w:pPr>
+      <w:rPr>
+        <w:rFonts w:ascii="Wingdings" w:hAnsi="Wingdings" w:hint="default"/>
+        <w:sz w:val="20"/>
+      </w:rPr>
+    </w:lvl>
+    <w:lvl w:ilvl="4" w:tentative="1">
+      <w:start w:val="1"/>
+      <w:numFmt w:val="bullet"/>
+      <w:lvlText w:val=""/>
+      <w:lvlJc w:val="left"/>
+      <w:pPr>
+        <w:tabs>
+          <w:tab w:val="num" w:pos="3600"/>
+        </w:tabs>
+        <w:ind w:left="3600" w:hanging="360"/>
+      </w:pPr>
+      <w:rPr>
+        <w:rFonts w:ascii="Wingdings" w:hAnsi="Wingdings" w:hint="default"/>
+        <w:sz w:val="20"/>
+      </w:rPr>
+    </w:lvl>
+    <w:lvl w:ilvl="5" w:tentative="1">
+      <w:start w:val="1"/>
+      <w:numFmt w:val="bullet"/>
+      <w:lvlText w:val=""/>
+      <w:lvlJc w:val="left"/>
+      <w:pPr>
+        <w:tabs>
+          <w:tab w:val="num" w:pos="4320"/>
+        </w:tabs>
+        <w:ind w:left="4320" w:hanging="360"/>
+      </w:pPr>
+      <w:rPr>
+        <w:rFonts w:ascii="Wingdings" w:hAnsi="Wingdings" w:hint="default"/>
+        <w:sz w:val="20"/>
+      </w:rPr>
+    </w:lvl>
+    <w:lvl w:ilvl="6" w:tentative="1">
+      <w:start w:val="1"/>
+      <w:numFmt w:val="bullet"/>
+      <w:lvlText w:val=""/>
+      <w:lvlJc w:val="left"/>
+      <w:pPr>
+        <w:tabs>
+          <w:tab w:val="num" w:pos="5040"/>
+        </w:tabs>
+        <w:ind w:left="5040" w:hanging="360"/>
+      </w:pPr>
+      <w:rPr>
+        <w:rFonts w:ascii="Wingdings" w:hAnsi="Wingdings" w:hint="default"/>
+        <w:sz w:val="20"/>
+      </w:rPr>
+    </w:lvl>
+    <w:lvl w:ilvl="7" w:tentative="1">
+      <w:start w:val="1"/>
+      <w:numFmt w:val="bullet"/>
+      <w:lvlText w:val=""/>
+      <w:lvlJc w:val="left"/>
+      <w:pPr>
+        <w:tabs>
+          <w:tab w:val="num" w:pos="5760"/>
+        </w:tabs>
+        <w:ind w:left="5760" w:hanging="360"/>
+      </w:pPr>
+      <w:rPr>
+        <w:rFonts w:ascii="Wingdings" w:hAnsi="Wingdings" w:hint="default"/>
+        <w:sz w:val="20"/>
+      </w:rPr>
+    </w:lvl>
+    <w:lvl w:ilvl="8" w:tentative="1">
+      <w:start w:val="1"/>
+      <w:numFmt w:val="bullet"/>
+      <w:lvlText w:val=""/>
+      <w:lvlJc w:val="left"/>
+      <w:pPr>
+        <w:tabs>
+          <w:tab w:val="num" w:pos="6480"/>
+        </w:tabs>
+        <w:ind w:left="6480" w:hanging="360"/>
+      </w:pPr>
+      <w:rPr>
+        <w:rFonts w:ascii="Wingdings" w:hAnsi="Wingdings" w:hint="default"/>
+        <w:sz w:val="20"/>
+      </w:rPr>
+    </w:lvl>
+  </w:abstractNum>
+  <w:abstractNum w:abstractNumId="23" w15:restartNumberingAfterBreak="0">
+    <w:nsid w:val="5F062198"/>
+    <w:multiLevelType w:val="multilevel"/>
+    <w:tmpl w:val="FF8AE4BA"/>
+    <w:lvl w:ilvl="0">
+      <w:start w:val="1"/>
+      <w:numFmt w:val="bullet"/>
+      <w:lvlText w:val=""/>
+      <w:lvlJc w:val="left"/>
+      <w:pPr>
+        <w:tabs>
+          <w:tab w:val="num" w:pos="720"/>
+        </w:tabs>
+        <w:ind w:left="720" w:hanging="360"/>
+      </w:pPr>
+      <w:rPr>
+        <w:rFonts w:ascii="Symbol" w:hAnsi="Symbol" w:hint="default"/>
+        <w:sz w:val="20"/>
+      </w:rPr>
+    </w:lvl>
+    <w:lvl w:ilvl="1" w:tentative="1">
+      <w:start w:val="1"/>
+      <w:numFmt w:val="bullet"/>
+      <w:lvlText w:val="o"/>
+      <w:lvlJc w:val="left"/>
+      <w:pPr>
+        <w:tabs>
+          <w:tab w:val="num" w:pos="1440"/>
+        </w:tabs>
+        <w:ind w:left="1440" w:hanging="360"/>
+      </w:pPr>
+      <w:rPr>
+        <w:rFonts w:ascii="Courier New" w:hAnsi="Courier New" w:hint="default"/>
+        <w:sz w:val="20"/>
+      </w:rPr>
+    </w:lvl>
+    <w:lvl w:ilvl="2" w:tentative="1">
+      <w:start w:val="1"/>
+      <w:numFmt w:val="bullet"/>
+      <w:lvlText w:val=""/>
+      <w:lvlJc w:val="left"/>
+      <w:pPr>
+        <w:tabs>
+          <w:tab w:val="num" w:pos="2160"/>
+        </w:tabs>
+        <w:ind w:left="2160" w:hanging="360"/>
+      </w:pPr>
+      <w:rPr>
+        <w:rFonts w:ascii="Wingdings" w:hAnsi="Wingdings" w:hint="default"/>
+        <w:sz w:val="20"/>
+      </w:rPr>
+    </w:lvl>
+    <w:lvl w:ilvl="3" w:tentative="1">
+      <w:start w:val="1"/>
+      <w:numFmt w:val="bullet"/>
+      <w:lvlText w:val=""/>
+      <w:lvlJc w:val="left"/>
+      <w:pPr>
+        <w:tabs>
+          <w:tab w:val="num" w:pos="2880"/>
+        </w:tabs>
+        <w:ind w:left="2880" w:hanging="360"/>
+      </w:pPr>
+      <w:rPr>
+        <w:rFonts w:ascii="Wingdings" w:hAnsi="Wingdings" w:hint="default"/>
+        <w:sz w:val="20"/>
+      </w:rPr>
+    </w:lvl>
+    <w:lvl w:ilvl="4" w:tentative="1">
+      <w:start w:val="1"/>
+      <w:numFmt w:val="bullet"/>
+      <w:lvlText w:val=""/>
+      <w:lvlJc w:val="left"/>
+      <w:pPr>
+        <w:tabs>
+          <w:tab w:val="num" w:pos="3600"/>
+        </w:tabs>
+        <w:ind w:left="3600" w:hanging="360"/>
+      </w:pPr>
+      <w:rPr>
+        <w:rFonts w:ascii="Wingdings" w:hAnsi="Wingdings" w:hint="default"/>
+        <w:sz w:val="20"/>
+      </w:rPr>
+    </w:lvl>
+    <w:lvl w:ilvl="5" w:tentative="1">
+      <w:start w:val="1"/>
+      <w:numFmt w:val="bullet"/>
+      <w:lvlText w:val=""/>
+      <w:lvlJc w:val="left"/>
+      <w:pPr>
+        <w:tabs>
+          <w:tab w:val="num" w:pos="4320"/>
+        </w:tabs>
+        <w:ind w:left="4320" w:hanging="360"/>
+      </w:pPr>
+      <w:rPr>
+        <w:rFonts w:ascii="Wingdings" w:hAnsi="Wingdings" w:hint="default"/>
+        <w:sz w:val="20"/>
+      </w:rPr>
+    </w:lvl>
+    <w:lvl w:ilvl="6" w:tentative="1">
+      <w:start w:val="1"/>
+      <w:numFmt w:val="bullet"/>
+      <w:lvlText w:val=""/>
+      <w:lvlJc w:val="left"/>
+      <w:pPr>
+        <w:tabs>
+          <w:tab w:val="num" w:pos="5040"/>
+        </w:tabs>
+        <w:ind w:left="5040" w:hanging="360"/>
+      </w:pPr>
+      <w:rPr>
+        <w:rFonts w:ascii="Wingdings" w:hAnsi="Wingdings" w:hint="default"/>
+        <w:sz w:val="20"/>
+      </w:rPr>
+    </w:lvl>
+    <w:lvl w:ilvl="7" w:tentative="1">
+      <w:start w:val="1"/>
+      <w:numFmt w:val="bullet"/>
+      <w:lvlText w:val=""/>
+      <w:lvlJc w:val="left"/>
+      <w:pPr>
+        <w:tabs>
+          <w:tab w:val="num" w:pos="5760"/>
+        </w:tabs>
+        <w:ind w:left="5760" w:hanging="360"/>
+      </w:pPr>
+      <w:rPr>
+        <w:rFonts w:ascii="Wingdings" w:hAnsi="Wingdings" w:hint="default"/>
+        <w:sz w:val="20"/>
+      </w:rPr>
+    </w:lvl>
+    <w:lvl w:ilvl="8" w:tentative="1">
+      <w:start w:val="1"/>
+      <w:numFmt w:val="bullet"/>
+      <w:lvlText w:val=""/>
+      <w:lvlJc w:val="left"/>
+      <w:pPr>
+        <w:tabs>
+          <w:tab w:val="num" w:pos="6480"/>
+        </w:tabs>
+        <w:ind w:left="6480" w:hanging="360"/>
+      </w:pPr>
+      <w:rPr>
+        <w:rFonts w:ascii="Wingdings" w:hAnsi="Wingdings" w:hint="default"/>
+        <w:sz w:val="20"/>
+      </w:rPr>
+    </w:lvl>
+  </w:abstractNum>
+  <w:abstractNum w:abstractNumId="24" w15:restartNumberingAfterBreak="0">
     <w:nsid w:val="64456718"/>
     <w:multiLevelType w:val="multilevel"/>
     <w:tmpl w:val="87FC74B4"/>
@@ -11298,7 +14968,305 @@
       </w:rPr>
     </w:lvl>
   </w:abstractNum>
-  <w:abstractNum w:abstractNumId="9" w15:restartNumberingAfterBreak="0">
+  <w:abstractNum w:abstractNumId="25" w15:restartNumberingAfterBreak="0">
+    <w:nsid w:val="64BC4BBA"/>
+    <w:multiLevelType w:val="multilevel"/>
+    <w:tmpl w:val="DAA20BC8"/>
+    <w:lvl w:ilvl="0">
+      <w:start w:val="1"/>
+      <w:numFmt w:val="bullet"/>
+      <w:lvlText w:val=""/>
+      <w:lvlJc w:val="left"/>
+      <w:pPr>
+        <w:tabs>
+          <w:tab w:val="num" w:pos="720"/>
+        </w:tabs>
+        <w:ind w:left="720" w:hanging="360"/>
+      </w:pPr>
+      <w:rPr>
+        <w:rFonts w:ascii="Symbol" w:hAnsi="Symbol" w:hint="default"/>
+        <w:sz w:val="20"/>
+      </w:rPr>
+    </w:lvl>
+    <w:lvl w:ilvl="1" w:tentative="1">
+      <w:start w:val="1"/>
+      <w:numFmt w:val="bullet"/>
+      <w:lvlText w:val="o"/>
+      <w:lvlJc w:val="left"/>
+      <w:pPr>
+        <w:tabs>
+          <w:tab w:val="num" w:pos="1440"/>
+        </w:tabs>
+        <w:ind w:left="1440" w:hanging="360"/>
+      </w:pPr>
+      <w:rPr>
+        <w:rFonts w:ascii="Courier New" w:hAnsi="Courier New" w:hint="default"/>
+        <w:sz w:val="20"/>
+      </w:rPr>
+    </w:lvl>
+    <w:lvl w:ilvl="2" w:tentative="1">
+      <w:start w:val="1"/>
+      <w:numFmt w:val="bullet"/>
+      <w:lvlText w:val=""/>
+      <w:lvlJc w:val="left"/>
+      <w:pPr>
+        <w:tabs>
+          <w:tab w:val="num" w:pos="2160"/>
+        </w:tabs>
+        <w:ind w:left="2160" w:hanging="360"/>
+      </w:pPr>
+      <w:rPr>
+        <w:rFonts w:ascii="Wingdings" w:hAnsi="Wingdings" w:hint="default"/>
+        <w:sz w:val="20"/>
+      </w:rPr>
+    </w:lvl>
+    <w:lvl w:ilvl="3" w:tentative="1">
+      <w:start w:val="1"/>
+      <w:numFmt w:val="bullet"/>
+      <w:lvlText w:val=""/>
+      <w:lvlJc w:val="left"/>
+      <w:pPr>
+        <w:tabs>
+          <w:tab w:val="num" w:pos="2880"/>
+        </w:tabs>
+        <w:ind w:left="2880" w:hanging="360"/>
+      </w:pPr>
+      <w:rPr>
+        <w:rFonts w:ascii="Wingdings" w:hAnsi="Wingdings" w:hint="default"/>
+        <w:sz w:val="20"/>
+      </w:rPr>
+    </w:lvl>
+    <w:lvl w:ilvl="4" w:tentative="1">
+      <w:start w:val="1"/>
+      <w:numFmt w:val="bullet"/>
+      <w:lvlText w:val=""/>
+      <w:lvlJc w:val="left"/>
+      <w:pPr>
+        <w:tabs>
+          <w:tab w:val="num" w:pos="3600"/>
+        </w:tabs>
+        <w:ind w:left="3600" w:hanging="360"/>
+      </w:pPr>
+      <w:rPr>
+        <w:rFonts w:ascii="Wingdings" w:hAnsi="Wingdings" w:hint="default"/>
+        <w:sz w:val="20"/>
+      </w:rPr>
+    </w:lvl>
+    <w:lvl w:ilvl="5" w:tentative="1">
+      <w:start w:val="1"/>
+      <w:numFmt w:val="bullet"/>
+      <w:lvlText w:val=""/>
+      <w:lvlJc w:val="left"/>
+      <w:pPr>
+        <w:tabs>
+          <w:tab w:val="num" w:pos="4320"/>
+        </w:tabs>
+        <w:ind w:left="4320" w:hanging="360"/>
+      </w:pPr>
+      <w:rPr>
+        <w:rFonts w:ascii="Wingdings" w:hAnsi="Wingdings" w:hint="default"/>
+        <w:sz w:val="20"/>
+      </w:rPr>
+    </w:lvl>
+    <w:lvl w:ilvl="6" w:tentative="1">
+      <w:start w:val="1"/>
+      <w:numFmt w:val="bullet"/>
+      <w:lvlText w:val=""/>
+      <w:lvlJc w:val="left"/>
+      <w:pPr>
+        <w:tabs>
+          <w:tab w:val="num" w:pos="5040"/>
+        </w:tabs>
+        <w:ind w:left="5040" w:hanging="360"/>
+      </w:pPr>
+      <w:rPr>
+        <w:rFonts w:ascii="Wingdings" w:hAnsi="Wingdings" w:hint="default"/>
+        <w:sz w:val="20"/>
+      </w:rPr>
+    </w:lvl>
+    <w:lvl w:ilvl="7" w:tentative="1">
+      <w:start w:val="1"/>
+      <w:numFmt w:val="bullet"/>
+      <w:lvlText w:val=""/>
+      <w:lvlJc w:val="left"/>
+      <w:pPr>
+        <w:tabs>
+          <w:tab w:val="num" w:pos="5760"/>
+        </w:tabs>
+        <w:ind w:left="5760" w:hanging="360"/>
+      </w:pPr>
+      <w:rPr>
+        <w:rFonts w:ascii="Wingdings" w:hAnsi="Wingdings" w:hint="default"/>
+        <w:sz w:val="20"/>
+      </w:rPr>
+    </w:lvl>
+    <w:lvl w:ilvl="8" w:tentative="1">
+      <w:start w:val="1"/>
+      <w:numFmt w:val="bullet"/>
+      <w:lvlText w:val=""/>
+      <w:lvlJc w:val="left"/>
+      <w:pPr>
+        <w:tabs>
+          <w:tab w:val="num" w:pos="6480"/>
+        </w:tabs>
+        <w:ind w:left="6480" w:hanging="360"/>
+      </w:pPr>
+      <w:rPr>
+        <w:rFonts w:ascii="Wingdings" w:hAnsi="Wingdings" w:hint="default"/>
+        <w:sz w:val="20"/>
+      </w:rPr>
+    </w:lvl>
+  </w:abstractNum>
+  <w:abstractNum w:abstractNumId="26" w15:restartNumberingAfterBreak="0">
+    <w:nsid w:val="69523E60"/>
+    <w:multiLevelType w:val="multilevel"/>
+    <w:tmpl w:val="53D477DC"/>
+    <w:lvl w:ilvl="0">
+      <w:start w:val="1"/>
+      <w:numFmt w:val="bullet"/>
+      <w:lvlText w:val=""/>
+      <w:lvlJc w:val="left"/>
+      <w:pPr>
+        <w:tabs>
+          <w:tab w:val="num" w:pos="720"/>
+        </w:tabs>
+        <w:ind w:left="720" w:hanging="360"/>
+      </w:pPr>
+      <w:rPr>
+        <w:rFonts w:ascii="Symbol" w:hAnsi="Symbol" w:hint="default"/>
+        <w:sz w:val="20"/>
+      </w:rPr>
+    </w:lvl>
+    <w:lvl w:ilvl="1" w:tentative="1">
+      <w:start w:val="1"/>
+      <w:numFmt w:val="bullet"/>
+      <w:lvlText w:val="o"/>
+      <w:lvlJc w:val="left"/>
+      <w:pPr>
+        <w:tabs>
+          <w:tab w:val="num" w:pos="1440"/>
+        </w:tabs>
+        <w:ind w:left="1440" w:hanging="360"/>
+      </w:pPr>
+      <w:rPr>
+        <w:rFonts w:ascii="Courier New" w:hAnsi="Courier New" w:hint="default"/>
+        <w:sz w:val="20"/>
+      </w:rPr>
+    </w:lvl>
+    <w:lvl w:ilvl="2" w:tentative="1">
+      <w:start w:val="1"/>
+      <w:numFmt w:val="bullet"/>
+      <w:lvlText w:val=""/>
+      <w:lvlJc w:val="left"/>
+      <w:pPr>
+        <w:tabs>
+          <w:tab w:val="num" w:pos="2160"/>
+        </w:tabs>
+        <w:ind w:left="2160" w:hanging="360"/>
+      </w:pPr>
+      <w:rPr>
+        <w:rFonts w:ascii="Wingdings" w:hAnsi="Wingdings" w:hint="default"/>
+        <w:sz w:val="20"/>
+      </w:rPr>
+    </w:lvl>
+    <w:lvl w:ilvl="3" w:tentative="1">
+      <w:start w:val="1"/>
+      <w:numFmt w:val="bullet"/>
+      <w:lvlText w:val=""/>
+      <w:lvlJc w:val="left"/>
+      <w:pPr>
+        <w:tabs>
+          <w:tab w:val="num" w:pos="2880"/>
+        </w:tabs>
+        <w:ind w:left="2880" w:hanging="360"/>
+      </w:pPr>
+      <w:rPr>
+        <w:rFonts w:ascii="Wingdings" w:hAnsi="Wingdings" w:hint="default"/>
+        <w:sz w:val="20"/>
+      </w:rPr>
+    </w:lvl>
+    <w:lvl w:ilvl="4" w:tentative="1">
+      <w:start w:val="1"/>
+      <w:numFmt w:val="bullet"/>
+      <w:lvlText w:val=""/>
+      <w:lvlJc w:val="left"/>
+      <w:pPr>
+        <w:tabs>
+          <w:tab w:val="num" w:pos="3600"/>
+        </w:tabs>
+        <w:ind w:left="3600" w:hanging="360"/>
+      </w:pPr>
+      <w:rPr>
+        <w:rFonts w:ascii="Wingdings" w:hAnsi="Wingdings" w:hint="default"/>
+        <w:sz w:val="20"/>
+      </w:rPr>
+    </w:lvl>
+    <w:lvl w:ilvl="5" w:tentative="1">
+      <w:start w:val="1"/>
+      <w:numFmt w:val="bullet"/>
+      <w:lvlText w:val=""/>
+      <w:lvlJc w:val="left"/>
+      <w:pPr>
+        <w:tabs>
+          <w:tab w:val="num" w:pos="4320"/>
+        </w:tabs>
+        <w:ind w:left="4320" w:hanging="360"/>
+      </w:pPr>
+      <w:rPr>
+        <w:rFonts w:ascii="Wingdings" w:hAnsi="Wingdings" w:hint="default"/>
+        <w:sz w:val="20"/>
+      </w:rPr>
+    </w:lvl>
+    <w:lvl w:ilvl="6" w:tentative="1">
+      <w:start w:val="1"/>
+      <w:numFmt w:val="bullet"/>
+      <w:lvlText w:val=""/>
+      <w:lvlJc w:val="left"/>
+      <w:pPr>
+        <w:tabs>
+          <w:tab w:val="num" w:pos="5040"/>
+        </w:tabs>
+        <w:ind w:left="5040" w:hanging="360"/>
+      </w:pPr>
+      <w:rPr>
+        <w:rFonts w:ascii="Wingdings" w:hAnsi="Wingdings" w:hint="default"/>
+        <w:sz w:val="20"/>
+      </w:rPr>
+    </w:lvl>
+    <w:lvl w:ilvl="7" w:tentative="1">
+      <w:start w:val="1"/>
+      <w:numFmt w:val="bullet"/>
+      <w:lvlText w:val=""/>
+      <w:lvlJc w:val="left"/>
+      <w:pPr>
+        <w:tabs>
+          <w:tab w:val="num" w:pos="5760"/>
+        </w:tabs>
+        <w:ind w:left="5760" w:hanging="360"/>
+      </w:pPr>
+      <w:rPr>
+        <w:rFonts w:ascii="Wingdings" w:hAnsi="Wingdings" w:hint="default"/>
+        <w:sz w:val="20"/>
+      </w:rPr>
+    </w:lvl>
+    <w:lvl w:ilvl="8" w:tentative="1">
+      <w:start w:val="1"/>
+      <w:numFmt w:val="bullet"/>
+      <w:lvlText w:val=""/>
+      <w:lvlJc w:val="left"/>
+      <w:pPr>
+        <w:tabs>
+          <w:tab w:val="num" w:pos="6480"/>
+        </w:tabs>
+        <w:ind w:left="6480" w:hanging="360"/>
+      </w:pPr>
+      <w:rPr>
+        <w:rFonts w:ascii="Wingdings" w:hAnsi="Wingdings" w:hint="default"/>
+        <w:sz w:val="20"/>
+      </w:rPr>
+    </w:lvl>
+  </w:abstractNum>
+  <w:abstractNum w:abstractNumId="27" w15:restartNumberingAfterBreak="0">
     <w:nsid w:val="6B601C1D"/>
     <w:multiLevelType w:val="multilevel"/>
     <w:tmpl w:val="775C9C44"/>
@@ -11412,7 +15380,7 @@
       </w:rPr>
     </w:lvl>
   </w:abstractNum>
-  <w:abstractNum w:abstractNumId="10" w15:restartNumberingAfterBreak="0">
+  <w:abstractNum w:abstractNumId="28" w15:restartNumberingAfterBreak="0">
     <w:nsid w:val="6F392ED7"/>
     <w:multiLevelType w:val="multilevel"/>
     <w:tmpl w:val="60F88832"/>
@@ -11525,7 +15493,7 @@
       </w:rPr>
     </w:lvl>
   </w:abstractNum>
-  <w:abstractNum w:abstractNumId="11" w15:restartNumberingAfterBreak="0">
+  <w:abstractNum w:abstractNumId="29" w15:restartNumberingAfterBreak="0">
     <w:nsid w:val="6F4D2DCC"/>
     <w:multiLevelType w:val="multilevel"/>
     <w:tmpl w:val="457AAE30"/>
@@ -11638,7 +15606,7 @@
       </w:rPr>
     </w:lvl>
   </w:abstractNum>
-  <w:abstractNum w:abstractNumId="12" w15:restartNumberingAfterBreak="0">
+  <w:abstractNum w:abstractNumId="30" w15:restartNumberingAfterBreak="0">
     <w:nsid w:val="6F816A59"/>
     <w:multiLevelType w:val="hybridMultilevel"/>
     <w:tmpl w:val="4D4016EC"/>
@@ -11754,7 +15722,7 @@
       </w:rPr>
     </w:lvl>
   </w:abstractNum>
-  <w:abstractNum w:abstractNumId="13" w15:restartNumberingAfterBreak="0">
+  <w:abstractNum w:abstractNumId="31" w15:restartNumberingAfterBreak="0">
     <w:nsid w:val="7B425DD1"/>
     <w:multiLevelType w:val="multilevel"/>
     <w:tmpl w:val="BD26EDB8"/>
@@ -11867,7 +15835,7 @@
       </w:rPr>
     </w:lvl>
   </w:abstractNum>
-  <w:abstractNum w:abstractNumId="14" w15:restartNumberingAfterBreak="0">
+  <w:abstractNum w:abstractNumId="32" w15:restartNumberingAfterBreak="0">
     <w:nsid w:val="7B67706E"/>
     <w:multiLevelType w:val="multilevel"/>
     <w:tmpl w:val="F8E27F16"/>
@@ -11980,7 +15948,7 @@
       </w:rPr>
     </w:lvl>
   </w:abstractNum>
-  <w:abstractNum w:abstractNumId="15" w15:restartNumberingAfterBreak="0">
+  <w:abstractNum w:abstractNumId="33" w15:restartNumberingAfterBreak="0">
     <w:nsid w:val="7C0105B8"/>
     <w:multiLevelType w:val="multilevel"/>
     <w:tmpl w:val="09789B74"/>
@@ -12093,53 +16061,259 @@
       </w:rPr>
     </w:lvl>
   </w:abstractNum>
+  <w:abstractNum w:abstractNumId="34" w15:restartNumberingAfterBreak="0">
+    <w:nsid w:val="7DA325BD"/>
+    <w:multiLevelType w:val="multilevel"/>
+    <w:tmpl w:val="053884A0"/>
+    <w:lvl w:ilvl="0">
+      <w:start w:val="1"/>
+      <w:numFmt w:val="bullet"/>
+      <w:lvlText w:val=""/>
+      <w:lvlJc w:val="left"/>
+      <w:pPr>
+        <w:tabs>
+          <w:tab w:val="num" w:pos="720"/>
+        </w:tabs>
+        <w:ind w:left="720" w:hanging="360"/>
+      </w:pPr>
+      <w:rPr>
+        <w:rFonts w:ascii="Symbol" w:hAnsi="Symbol" w:hint="default"/>
+        <w:sz w:val="20"/>
+      </w:rPr>
+    </w:lvl>
+    <w:lvl w:ilvl="1" w:tentative="1">
+      <w:start w:val="1"/>
+      <w:numFmt w:val="bullet"/>
+      <w:lvlText w:val="o"/>
+      <w:lvlJc w:val="left"/>
+      <w:pPr>
+        <w:tabs>
+          <w:tab w:val="num" w:pos="1440"/>
+        </w:tabs>
+        <w:ind w:left="1440" w:hanging="360"/>
+      </w:pPr>
+      <w:rPr>
+        <w:rFonts w:ascii="Courier New" w:hAnsi="Courier New" w:hint="default"/>
+        <w:sz w:val="20"/>
+      </w:rPr>
+    </w:lvl>
+    <w:lvl w:ilvl="2" w:tentative="1">
+      <w:start w:val="1"/>
+      <w:numFmt w:val="bullet"/>
+      <w:lvlText w:val=""/>
+      <w:lvlJc w:val="left"/>
+      <w:pPr>
+        <w:tabs>
+          <w:tab w:val="num" w:pos="2160"/>
+        </w:tabs>
+        <w:ind w:left="2160" w:hanging="360"/>
+      </w:pPr>
+      <w:rPr>
+        <w:rFonts w:ascii="Wingdings" w:hAnsi="Wingdings" w:hint="default"/>
+        <w:sz w:val="20"/>
+      </w:rPr>
+    </w:lvl>
+    <w:lvl w:ilvl="3" w:tentative="1">
+      <w:start w:val="1"/>
+      <w:numFmt w:val="bullet"/>
+      <w:lvlText w:val=""/>
+      <w:lvlJc w:val="left"/>
+      <w:pPr>
+        <w:tabs>
+          <w:tab w:val="num" w:pos="2880"/>
+        </w:tabs>
+        <w:ind w:left="2880" w:hanging="360"/>
+      </w:pPr>
+      <w:rPr>
+        <w:rFonts w:ascii="Wingdings" w:hAnsi="Wingdings" w:hint="default"/>
+        <w:sz w:val="20"/>
+      </w:rPr>
+    </w:lvl>
+    <w:lvl w:ilvl="4" w:tentative="1">
+      <w:start w:val="1"/>
+      <w:numFmt w:val="bullet"/>
+      <w:lvlText w:val=""/>
+      <w:lvlJc w:val="left"/>
+      <w:pPr>
+        <w:tabs>
+          <w:tab w:val="num" w:pos="3600"/>
+        </w:tabs>
+        <w:ind w:left="3600" w:hanging="360"/>
+      </w:pPr>
+      <w:rPr>
+        <w:rFonts w:ascii="Wingdings" w:hAnsi="Wingdings" w:hint="default"/>
+        <w:sz w:val="20"/>
+      </w:rPr>
+    </w:lvl>
+    <w:lvl w:ilvl="5" w:tentative="1">
+      <w:start w:val="1"/>
+      <w:numFmt w:val="bullet"/>
+      <w:lvlText w:val=""/>
+      <w:lvlJc w:val="left"/>
+      <w:pPr>
+        <w:tabs>
+          <w:tab w:val="num" w:pos="4320"/>
+        </w:tabs>
+        <w:ind w:left="4320" w:hanging="360"/>
+      </w:pPr>
+      <w:rPr>
+        <w:rFonts w:ascii="Wingdings" w:hAnsi="Wingdings" w:hint="default"/>
+        <w:sz w:val="20"/>
+      </w:rPr>
+    </w:lvl>
+    <w:lvl w:ilvl="6" w:tentative="1">
+      <w:start w:val="1"/>
+      <w:numFmt w:val="bullet"/>
+      <w:lvlText w:val=""/>
+      <w:lvlJc w:val="left"/>
+      <w:pPr>
+        <w:tabs>
+          <w:tab w:val="num" w:pos="5040"/>
+        </w:tabs>
+        <w:ind w:left="5040" w:hanging="360"/>
+      </w:pPr>
+      <w:rPr>
+        <w:rFonts w:ascii="Wingdings" w:hAnsi="Wingdings" w:hint="default"/>
+        <w:sz w:val="20"/>
+      </w:rPr>
+    </w:lvl>
+    <w:lvl w:ilvl="7" w:tentative="1">
+      <w:start w:val="1"/>
+      <w:numFmt w:val="bullet"/>
+      <w:lvlText w:val=""/>
+      <w:lvlJc w:val="left"/>
+      <w:pPr>
+        <w:tabs>
+          <w:tab w:val="num" w:pos="5760"/>
+        </w:tabs>
+        <w:ind w:left="5760" w:hanging="360"/>
+      </w:pPr>
+      <w:rPr>
+        <w:rFonts w:ascii="Wingdings" w:hAnsi="Wingdings" w:hint="default"/>
+        <w:sz w:val="20"/>
+      </w:rPr>
+    </w:lvl>
+    <w:lvl w:ilvl="8" w:tentative="1">
+      <w:start w:val="1"/>
+      <w:numFmt w:val="bullet"/>
+      <w:lvlText w:val=""/>
+      <w:lvlJc w:val="left"/>
+      <w:pPr>
+        <w:tabs>
+          <w:tab w:val="num" w:pos="6480"/>
+        </w:tabs>
+        <w:ind w:left="6480" w:hanging="360"/>
+      </w:pPr>
+      <w:rPr>
+        <w:rFonts w:ascii="Wingdings" w:hAnsi="Wingdings" w:hint="default"/>
+        <w:sz w:val="20"/>
+      </w:rPr>
+    </w:lvl>
+  </w:abstractNum>
   <w:num w:numId="1" w16cid:durableId="354236776">
+    <w:abstractNumId w:val="19"/>
+  </w:num>
+  <w:num w:numId="2" w16cid:durableId="856621255">
+    <w:abstractNumId w:val="28"/>
+  </w:num>
+  <w:num w:numId="3" w16cid:durableId="386730754">
+    <w:abstractNumId w:val="29"/>
+  </w:num>
+  <w:num w:numId="4" w16cid:durableId="758672446">
+    <w:abstractNumId w:val="12"/>
+  </w:num>
+  <w:num w:numId="5" w16cid:durableId="1000356551">
+    <w:abstractNumId w:val="11"/>
+  </w:num>
+  <w:num w:numId="6" w16cid:durableId="557398836">
+    <w:abstractNumId w:val="8"/>
+  </w:num>
+  <w:num w:numId="7" w16cid:durableId="509639038">
+    <w:abstractNumId w:val="24"/>
+  </w:num>
+  <w:num w:numId="8" w16cid:durableId="1611626448">
+    <w:abstractNumId w:val="5"/>
+  </w:num>
+  <w:num w:numId="9" w16cid:durableId="920679195">
+    <w:abstractNumId w:val="33"/>
+  </w:num>
+  <w:num w:numId="10" w16cid:durableId="598559204">
+    <w:abstractNumId w:val="32"/>
+  </w:num>
+  <w:num w:numId="11" w16cid:durableId="1819951755">
+    <w:abstractNumId w:val="27"/>
+  </w:num>
+  <w:num w:numId="12" w16cid:durableId="1205678690">
+    <w:abstractNumId w:val="16"/>
+  </w:num>
+  <w:num w:numId="13" w16cid:durableId="1075972036">
     <w:abstractNumId w:val="7"/>
   </w:num>
-  <w:num w:numId="2" w16cid:durableId="856621255">
+  <w:num w:numId="14" w16cid:durableId="17389370">
+    <w:abstractNumId w:val="15"/>
+  </w:num>
+  <w:num w:numId="15" w16cid:durableId="1342321793">
+    <w:abstractNumId w:val="31"/>
+  </w:num>
+  <w:num w:numId="16" w16cid:durableId="916015009">
+    <w:abstractNumId w:val="30"/>
+  </w:num>
+  <w:num w:numId="17" w16cid:durableId="190268183">
+    <w:abstractNumId w:val="20"/>
+  </w:num>
+  <w:num w:numId="18" w16cid:durableId="521674784">
+    <w:abstractNumId w:val="1"/>
+  </w:num>
+  <w:num w:numId="19" w16cid:durableId="534662130">
+    <w:abstractNumId w:val="13"/>
+  </w:num>
+  <w:num w:numId="20" w16cid:durableId="970599498">
+    <w:abstractNumId w:val="18"/>
+  </w:num>
+  <w:num w:numId="21" w16cid:durableId="1529027186">
+    <w:abstractNumId w:val="22"/>
+  </w:num>
+  <w:num w:numId="22" w16cid:durableId="1034814844">
+    <w:abstractNumId w:val="17"/>
+  </w:num>
+  <w:num w:numId="23" w16cid:durableId="2007903181">
+    <w:abstractNumId w:val="9"/>
+  </w:num>
+  <w:num w:numId="24" w16cid:durableId="786313992">
+    <w:abstractNumId w:val="0"/>
+  </w:num>
+  <w:num w:numId="25" w16cid:durableId="1281765846">
+    <w:abstractNumId w:val="2"/>
+  </w:num>
+  <w:num w:numId="26" w16cid:durableId="2108111021">
+    <w:abstractNumId w:val="4"/>
+  </w:num>
+  <w:num w:numId="27" w16cid:durableId="2079547310">
+    <w:abstractNumId w:val="14"/>
+  </w:num>
+  <w:num w:numId="28" w16cid:durableId="1286152593">
+    <w:abstractNumId w:val="26"/>
+  </w:num>
+  <w:num w:numId="29" w16cid:durableId="514198535">
+    <w:abstractNumId w:val="25"/>
+  </w:num>
+  <w:num w:numId="30" w16cid:durableId="260724648">
     <w:abstractNumId w:val="10"/>
   </w:num>
-  <w:num w:numId="3" w16cid:durableId="386730754">
-    <w:abstractNumId w:val="11"/>
+  <w:num w:numId="31" w16cid:durableId="721828964">
+    <w:abstractNumId w:val="34"/>
   </w:num>
-  <w:num w:numId="4" w16cid:durableId="758672446">
-    <w:abstractNumId w:val="4"/>
-  </w:num>
-  <w:num w:numId="5" w16cid:durableId="1000356551">
+  <w:num w:numId="32" w16cid:durableId="384531015">
     <w:abstractNumId w:val="3"/>
   </w:num>
-  <w:num w:numId="6" w16cid:durableId="557398836">
-    <w:abstractNumId w:val="2"/>
+  <w:num w:numId="33" w16cid:durableId="2083404053">
+    <w:abstractNumId w:val="21"/>
   </w:num>
-  <w:num w:numId="7" w16cid:durableId="509639038">
-    <w:abstractNumId w:val="8"/>
-  </w:num>
-  <w:num w:numId="8" w16cid:durableId="1611626448">
-    <w:abstractNumId w:val="0"/>
-  </w:num>
-  <w:num w:numId="9" w16cid:durableId="920679195">
-    <w:abstractNumId w:val="15"/>
-  </w:num>
-  <w:num w:numId="10" w16cid:durableId="598559204">
-    <w:abstractNumId w:val="14"/>
-  </w:num>
-  <w:num w:numId="11" w16cid:durableId="1819951755">
-    <w:abstractNumId w:val="9"/>
-  </w:num>
-  <w:num w:numId="12" w16cid:durableId="1205678690">
+  <w:num w:numId="34" w16cid:durableId="364645051">
     <w:abstractNumId w:val="6"/>
   </w:num>
-  <w:num w:numId="13" w16cid:durableId="1075972036">
-    <w:abstractNumId w:val="1"/>
-  </w:num>
-  <w:num w:numId="14" w16cid:durableId="17389370">
-    <w:abstractNumId w:val="5"/>
-  </w:num>
-  <w:num w:numId="15" w16cid:durableId="1342321793">
-    <w:abstractNumId w:val="13"/>
-  </w:num>
-  <w:num w:numId="16" w16cid:durableId="916015009">
-    <w:abstractNumId w:val="12"/>
+  <w:num w:numId="35" w16cid:durableId="925112484">
+    <w:abstractNumId w:val="23"/>
   </w:num>
 </w:numbering>
 </file>
@@ -12543,6 +16717,7 @@
   <w:style w:type="paragraph" w:default="1" w:styleId="Normal">
     <w:name w:val="Normal"/>
     <w:qFormat/>
+    <w:rsid w:val="00EE67D9"/>
   </w:style>
   <w:style w:type="paragraph" w:styleId="Heading1">
     <w:name w:val="heading 1"/>

</xml_diff>